<commit_message>
Testing checklists: app opens while the online server is asleep, stays logged in after reopening
Co-Authored-By: Claude Opus 5.5 <noreply@anthropic.com>
Claude-Session: https://claude.ai/code/session_01FGCEzsecdEGjCSsNcfM7Ef
</commit_message>
<xml_diff>
--- a/docs/testing/Mangao-Team-Testing-Guide.docx
+++ b/docs/testing/Mangao-Team-Testing-Guide.docx
@@ -62,7 +62,7 @@
         </w:rPr>
         <w:t xml:space="preserve">1. On your Android phone, open this link in Chrome: </w:t>
       </w:r>
-      <w:hyperlink w:history="1" r:id="rIdfmg8duqag6xrfxxto73at">
+      <w:hyperlink w:history="1" r:id="rIdvk1nemsalhk4ac8ne0ec_">
         <w:r>
           <w:rPr>
             <w:rFonts w:ascii="Arial" w:cs="Arial" w:eastAsia="Arial" w:hAnsi="Arial"/>
@@ -1437,7 +1437,7 @@
           <w:sz w:val="20"/>
           <w:szCs w:val="20"/>
         </w:rPr>
-        <w:t xml:space="preserve">5 parts, 75 checks. With 4 testers, each takes one role (Parts A to D). Suggested order: everyone logs in first, do Part E together (it needs all four phones), then continue your own part. With fewer testers, one person can do two roles on two phones, or log out and log in as the other role.</w:t>
+        <w:t xml:space="preserve">5 parts, 76 checks. With 4 testers, each takes one role (Parts A to D). Suggested order: everyone logs in first, do Part E together (it needs all four phones), then continue your own part. With fewer testers, one person can do two roles on two phones, or log out and log in as the other role.</w:t>
       </w:r>
     </w:p>
     <w:tbl>
@@ -1759,7 +1759,7 @@
                 <w:sz w:val="19"/>
                 <w:szCs w:val="19"/>
               </w:rPr>
-              <w:t xml:space="preserve">21</w:t>
+              <w:t xml:space="preserve">22</w:t>
             </w:r>
           </w:p>
         </w:tc>
@@ -3300,7 +3300,7 @@
                 <w:sz w:val="19"/>
                 <w:szCs w:val="19"/>
               </w:rPr>
-              <w:t xml:space="preserve">Tap Order Now.</w:t>
+              <w:t xml:space="preserve">Close the app fully (swipe it away from recent apps) and open it again.</w:t>
             </w:r>
           </w:p>
         </w:tc>
@@ -3332,7 +3332,7 @@
                 <w:sz w:val="19"/>
                 <w:szCs w:val="19"/>
               </w:rPr>
-              <w:t xml:space="preserve">Order Form: "Refill my gallons" chosen, Gallons 1, Total ₱35.00, your phone already filled in, Payment "Cash on delivery (COD)".</w:t>
+              <w:t xml:space="preserve">Home opens again within a few seconds (still logged in). It must not stay on the logo screen.</w:t>
             </w:r>
           </w:p>
         </w:tc>
@@ -3477,7 +3477,7 @@
                 <w:sz w:val="19"/>
                 <w:szCs w:val="19"/>
               </w:rPr>
-              <w:t xml:space="preserve">Tap + two times. Then tap "Buy a package", then "Refill my gallons" again.</w:t>
+              <w:t xml:space="preserve">Tap Order Now.</w:t>
             </w:r>
           </w:p>
         </w:tc>
@@ -3508,7 +3508,7 @@
                 <w:sz w:val="19"/>
                 <w:szCs w:val="19"/>
               </w:rPr>
-              <w:t xml:space="preserve">Refill: 3 gallons, ₱105.00. Package: ₱450.00. Back to Refill: ₱105.00.</w:t>
+              <w:t xml:space="preserve">Order Form: "Refill my gallons" chosen, Gallons 1, Total ₱35.00, your phone already filled in, Payment "Cash on delivery (COD)".</w:t>
             </w:r>
           </w:p>
         </w:tc>
@@ -3653,7 +3653,7 @@
                 <w:sz w:val="19"/>
                 <w:szCs w:val="19"/>
               </w:rPr>
-              <w:t xml:space="preserve">Tap Delivery address &gt; Pin on map &gt; "Use my location". Allow location when the phone asks.</w:t>
+              <w:t xml:space="preserve">Tap + two times. Then tap "Buy a package", then "Refill my gallons" again.</w:t>
             </w:r>
           </w:p>
         </w:tc>
@@ -3685,7 +3685,7 @@
                 <w:sz w:val="19"/>
                 <w:szCs w:val="19"/>
               </w:rPr>
-              <w:t xml:space="preserve">The map moves to where you are and shows "Pinned: near &lt;street&gt;, &lt;barangay&gt;". Tap "Use this address".</w:t>
+              <w:t xml:space="preserve">Refill: 3 gallons, ₱105.00. Package: ₱450.00. Back to Refill: ₱105.00.</w:t>
             </w:r>
           </w:p>
         </w:tc>
@@ -3830,7 +3830,7 @@
                 <w:sz w:val="19"/>
                 <w:szCs w:val="19"/>
               </w:rPr>
-              <w:t xml:space="preserve">Tap Place order.</w:t>
+              <w:t xml:space="preserve">Tap Delivery address &gt; Pin on map &gt; "Use my location". Allow location when the phone asks.</w:t>
             </w:r>
           </w:p>
         </w:tc>
@@ -3861,7 +3861,7 @@
                 <w:sz w:val="19"/>
                 <w:szCs w:val="19"/>
               </w:rPr>
-              <w:t xml:space="preserve">Popup "Confirm order?" with the gallons, address, payment and total.</w:t>
+              <w:t xml:space="preserve">The map moves to where you are and shows "Pinned: near &lt;street&gt;, &lt;barangay&gt;". Tap "Use this address".</w:t>
             </w:r>
           </w:p>
         </w:tc>
@@ -4006,7 +4006,7 @@
                 <w:sz w:val="19"/>
                 <w:szCs w:val="19"/>
               </w:rPr>
-              <w:t xml:space="preserve">Tap Confirm.</w:t>
+              <w:t xml:space="preserve">Tap Place order.</w:t>
             </w:r>
           </w:p>
         </w:tc>
@@ -4038,7 +4038,7 @@
                 <w:sz w:val="19"/>
                 <w:szCs w:val="19"/>
               </w:rPr>
-              <w:t xml:space="preserve">"Thank you for your order!" message. OK goes back to Home with a card "Waiting to be accepted". Tell the Owner tester your order is in.</w:t>
+              <w:t xml:space="preserve">Popup "Confirm order?" with the gallons, address, payment and total.</w:t>
             </w:r>
           </w:p>
         </w:tc>
@@ -4183,7 +4183,7 @@
                 <w:sz w:val="19"/>
                 <w:szCs w:val="19"/>
               </w:rPr>
-              <w:t xml:space="preserve">Wait on Home while the Owner accepts your order. Do not touch the screen.</w:t>
+              <w:t xml:space="preserve">Tap Confirm.</w:t>
             </w:r>
           </w:p>
         </w:tc>
@@ -4214,7 +4214,7 @@
                 <w:sz w:val="19"/>
                 <w:szCs w:val="19"/>
               </w:rPr>
-              <w:t xml:space="preserve">Within a few seconds the card changes to "Processing" with "Estimated delivery: by &lt;time&gt;", and a banner "Order accepted" shows.</w:t>
+              <w:t xml:space="preserve">"Thank you for your order!" message. OK goes back to Home with a card "Waiting to be accepted". Tell the Owner tester your order is in.</w:t>
             </w:r>
           </w:p>
         </w:tc>
@@ -4359,7 +4359,7 @@
                 <w:sz w:val="19"/>
                 <w:szCs w:val="19"/>
               </w:rPr>
-              <w:t xml:space="preserve">Tap the card.</w:t>
+              <w:t xml:space="preserve">Wait on Home while the Owner accepts your order. Do not touch the screen.</w:t>
             </w:r>
           </w:p>
         </w:tc>
@@ -4391,7 +4391,7 @@
                 <w:sz w:val="19"/>
                 <w:szCs w:val="19"/>
               </w:rPr>
-              <w:t xml:space="preserve">Order Details with 5 steps (Order accepted checked, Processing current) and a "Call station" button.</w:t>
+              <w:t xml:space="preserve">Within a few seconds the card changes to "Processing" with "Estimated delivery: by &lt;time&gt;", and a banner "Order accepted" shows.</w:t>
             </w:r>
           </w:p>
         </w:tc>
@@ -4536,7 +4536,7 @@
                 <w:sz w:val="19"/>
                 <w:szCs w:val="19"/>
               </w:rPr>
-              <w:t xml:space="preserve">Tap Call station.</w:t>
+              <w:t xml:space="preserve">Tap the card.</w:t>
             </w:r>
           </w:p>
         </w:tc>
@@ -4567,7 +4567,7 @@
                 <w:sz w:val="19"/>
                 <w:szCs w:val="19"/>
               </w:rPr>
-              <w:t xml:space="preserve">The phone dialer opens with the station number.</w:t>
+              <w:t xml:space="preserve">Order Details with 5 steps (Order accepted checked, Processing current) and a "Call station" button.</w:t>
             </w:r>
           </w:p>
         </w:tc>
@@ -4712,7 +4712,7 @@
                 <w:sz w:val="19"/>
                 <w:szCs w:val="19"/>
               </w:rPr>
-              <w:t xml:space="preserve">Place a second order (1 gallon). Open it from Home and tap Cancel order &gt; Confirm.</w:t>
+              <w:t xml:space="preserve">Tap Call station.</w:t>
             </w:r>
           </w:p>
         </w:tc>
@@ -4744,7 +4744,7 @@
                 <w:sz w:val="19"/>
                 <w:szCs w:val="19"/>
               </w:rPr>
-              <w:t xml:space="preserve">"Order cancelled; owner notified"; the order shows a Cancelled tag.</w:t>
+              <w:t xml:space="preserve">The phone dialer opens with the station number.</w:t>
             </w:r>
           </w:p>
         </w:tc>
@@ -4889,7 +4889,7 @@
                 <w:sz w:val="19"/>
                 <w:szCs w:val="19"/>
               </w:rPr>
-              <w:t xml:space="preserve">Open the My Orders tab.</w:t>
+              <w:t xml:space="preserve">Place a second order (1 gallon). Open it from Home and tap Cancel order &gt; Confirm.</w:t>
             </w:r>
           </w:p>
         </w:tc>
@@ -4920,7 +4920,7 @@
                 <w:sz w:val="19"/>
                 <w:szCs w:val="19"/>
               </w:rPr>
-              <w:t xml:space="preserve">Active orders on top; History has the cancelled order with a Reorder button.</w:t>
+              <w:t xml:space="preserve">"Order cancelled; owner notified"; the order shows a Cancelled tag.</w:t>
             </w:r>
           </w:p>
         </w:tc>
@@ -5065,7 +5065,7 @@
                 <w:sz w:val="19"/>
                 <w:szCs w:val="19"/>
               </w:rPr>
-              <w:t xml:space="preserve">Tap Reorder on the cancelled order.</w:t>
+              <w:t xml:space="preserve">Open the My Orders tab.</w:t>
             </w:r>
           </w:p>
         </w:tc>
@@ -5097,7 +5097,7 @@
                 <w:sz w:val="19"/>
                 <w:szCs w:val="19"/>
               </w:rPr>
-              <w:t xml:space="preserve">Order Form filled in with the same gallons and address. Tap Cancel &gt; Confirm to leave it.</w:t>
+              <w:t xml:space="preserve">Active orders on top; History has the cancelled order with a Reorder button.</w:t>
             </w:r>
           </w:p>
         </w:tc>
@@ -5242,7 +5242,7 @@
                 <w:sz w:val="19"/>
                 <w:szCs w:val="19"/>
               </w:rPr>
-              <w:t xml:space="preserve">My Account &gt; Saved Addresses &gt; Add address. Name "Work", Type address: house 5, street "Mabuhay St.", Barangay "Commonwealth" &gt; Save.</w:t>
+              <w:t xml:space="preserve">Tap Reorder on the cancelled order.</w:t>
             </w:r>
           </w:p>
         </w:tc>
@@ -5273,7 +5273,7 @@
                 <w:sz w:val="19"/>
                 <w:szCs w:val="19"/>
               </w:rPr>
-              <w:t xml:space="preserve">"Address saved"; Work is in the list. Next time you order, Work shows as a quick choice.</w:t>
+              <w:t xml:space="preserve">Order Form filled in with the same gallons and address. Tap Cancel &gt; Confirm to leave it.</w:t>
             </w:r>
           </w:p>
         </w:tc>
@@ -5418,7 +5418,7 @@
                 <w:sz w:val="19"/>
                 <w:szCs w:val="19"/>
               </w:rPr>
-              <w:t xml:space="preserve">When the Rider marks your first order Delivered (Part E or ask the Rider tester).</w:t>
+              <w:t xml:space="preserve">My Account &gt; Saved Addresses &gt; Add address. Name "Work", Type address: house 5, street "Mabuhay St.", Barangay "Commonwealth" &gt; Save.</w:t>
             </w:r>
           </w:p>
         </w:tc>
@@ -5450,7 +5450,7 @@
                 <w:sz w:val="19"/>
                 <w:szCs w:val="19"/>
               </w:rPr>
-              <w:t xml:space="preserve">The order changes to Delivered by itself with a banner "Delivered · Thank you! Enjoy your fresh water."</w:t>
+              <w:t xml:space="preserve">"Address saved"; Work is in the list. Next time you order, Work shows as a quick choice.</w:t>
             </w:r>
           </w:p>
         </w:tc>
@@ -5595,7 +5595,7 @@
                 <w:sz w:val="19"/>
                 <w:szCs w:val="19"/>
               </w:rPr>
-              <w:t xml:space="preserve">My Account &gt; Log out &gt; Confirm.</w:t>
+              <w:t xml:space="preserve">When the Rider marks your first order Delivered (Part E or ask the Rider tester).</w:t>
             </w:r>
           </w:p>
         </w:tc>
@@ -5626,7 +5626,7 @@
                 <w:sz w:val="19"/>
                 <w:szCs w:val="19"/>
               </w:rPr>
-              <w:t xml:space="preserve">Back to the Welcome screen.</w:t>
+              <w:t xml:space="preserve">The order changes to Delivered by itself with a banner "Delivered · Thank you! Enjoy your fresh water."</w:t>
             </w:r>
           </w:p>
         </w:tc>
@@ -5771,7 +5771,7 @@
                 <w:sz w:val="19"/>
                 <w:szCs w:val="19"/>
               </w:rPr>
-              <w:t xml:space="preserve">Tap "Continue as guest" &gt; Order Now. Leave Name empty and tap Place order.</w:t>
+              <w:t xml:space="preserve">My Account &gt; Log out &gt; Confirm.</w:t>
             </w:r>
           </w:p>
         </w:tc>
@@ -5803,7 +5803,7 @@
                 <w:sz w:val="19"/>
                 <w:szCs w:val="19"/>
               </w:rPr>
-              <w:t xml:space="preserve">Red box "Name missing".</w:t>
+              <w:t xml:space="preserve">Back to the Welcome screen.</w:t>
             </w:r>
           </w:p>
         </w:tc>
@@ -5948,7 +5948,7 @@
                 <w:sz w:val="19"/>
                 <w:szCs w:val="19"/>
               </w:rPr>
-              <w:t xml:space="preserve">Fill Name, phone 09185551212, type an address, place the order.</w:t>
+              <w:t xml:space="preserve">Tap "Continue as guest" &gt; Order Now. Leave Name empty and tap Place order.</w:t>
             </w:r>
           </w:p>
         </w:tc>
@@ -5979,7 +5979,7 @@
                 <w:sz w:val="19"/>
                 <w:szCs w:val="19"/>
               </w:rPr>
-              <w:t xml:space="preserve">Thank-you message; the order shows on Home with "This phone only; lost if the app is deleted".</w:t>
+              <w:t xml:space="preserve">Red box "Name missing".</w:t>
             </w:r>
           </w:p>
         </w:tc>
@@ -6124,7 +6124,7 @@
                 <w:sz w:val="19"/>
                 <w:szCs w:val="19"/>
               </w:rPr>
-              <w:t xml:space="preserve">My Account &gt; Create account. Use YOUR OWN name, your own phone number, an email and a password (6+ letters), tick the Terms box &gt; Create account.</w:t>
+              <w:t xml:space="preserve">Fill Name, phone 09185551212, type an address, place the order.</w:t>
             </w:r>
           </w:p>
         </w:tc>
@@ -6156,7 +6156,7 @@
                 <w:sz w:val="19"/>
                 <w:szCs w:val="19"/>
               </w:rPr>
-              <w:t xml:space="preserve">"Account created" and "The orders on this phone are now in your account." My Orders shows the guest order.</w:t>
+              <w:t xml:space="preserve">Thank-you message; the order shows on Home with "This phone only; lost if the app is deleted".</w:t>
             </w:r>
           </w:p>
         </w:tc>
@@ -6301,7 +6301,7 @@
                 <w:sz w:val="19"/>
                 <w:szCs w:val="19"/>
               </w:rPr>
-              <w:t xml:space="preserve">Log out. Tap Sign up and try the same phone number again.</w:t>
+              <w:t xml:space="preserve">My Account &gt; Create account. Use YOUR OWN name, your own phone number, an email and a password (6+ letters), tick the Terms box &gt; Create account.</w:t>
             </w:r>
           </w:p>
         </w:tc>
@@ -6332,7 +6332,7 @@
                 <w:sz w:val="19"/>
                 <w:szCs w:val="19"/>
               </w:rPr>
-              <w:t xml:space="preserve">Red box "Phone number already used"; the phone box has a red border.</w:t>
+              <w:t xml:space="preserve">"Account created" and "The orders on this phone are now in your account." My Orders shows the guest order.</w:t>
             </w:r>
           </w:p>
         </w:tc>
@@ -6390,6 +6390,185 @@
               <w:bottom w:val="single" w:color="B9D7F2" w:sz="4"/>
               <w:right w:val="single" w:color="B9D7F2" w:sz="4"/>
             </w:tcBorders>
+            <w:tcMar>
+              <w:top w:type="dxa" w:w="70"/>
+              <w:left w:type="dxa" w:w="100"/>
+              <w:bottom w:type="dxa" w:w="70"/>
+              <w:right w:type="dxa" w:w="100"/>
+            </w:tcMar>
+          </w:tcPr>
+          <w:p>
+            <w:pPr>
+              <w:spacing w:after="0" w:before="0"/>
+            </w:pPr>
+            <w:r>
+              <w:rPr>
+                <w:rFonts w:ascii="Arial" w:cs="Arial" w:eastAsia="Arial" w:hAnsi="Arial"/>
+                <w:color w:val="15202B"/>
+                <w:sz w:val="19"/>
+                <w:szCs w:val="19"/>
+              </w:rPr>
+              <w:t xml:space="preserve"/>
+            </w:r>
+          </w:p>
+        </w:tc>
+      </w:tr>
+      <w:tr>
+        <w:trPr>
+          <w:cantSplit/>
+        </w:trPr>
+        <w:tc>
+          <w:tcPr>
+            <w:tcW w:type="dxa" w:w="700"/>
+            <w:tcBorders>
+              <w:top w:val="single" w:color="B9D7F2" w:sz="4"/>
+              <w:left w:val="single" w:color="B9D7F2" w:sz="4"/>
+              <w:bottom w:val="single" w:color="B9D7F2" w:sz="4"/>
+              <w:right w:val="single" w:color="B9D7F2" w:sz="4"/>
+            </w:tcBorders>
+            <w:shd w:fill="EAF4FD" w:color="auto" w:val="clear"/>
+            <w:tcMar>
+              <w:top w:type="dxa" w:w="70"/>
+              <w:left w:type="dxa" w:w="100"/>
+              <w:bottom w:type="dxa" w:w="70"/>
+              <w:right w:type="dxa" w:w="100"/>
+            </w:tcMar>
+          </w:tcPr>
+          <w:p>
+            <w:pPr>
+              <w:spacing w:after="0" w:before="0"/>
+            </w:pPr>
+            <w:r>
+              <w:rPr>
+                <w:rFonts w:ascii="Arial" w:cs="Arial" w:eastAsia="Arial" w:hAnsi="Arial"/>
+                <w:color w:val="15202B"/>
+                <w:sz w:val="19"/>
+                <w:szCs w:val="19"/>
+              </w:rPr>
+              <w:t xml:space="preserve">A22</w:t>
+            </w:r>
+          </w:p>
+        </w:tc>
+        <w:tc>
+          <w:tcPr>
+            <w:tcW w:type="dxa" w:w="3900"/>
+            <w:tcBorders>
+              <w:top w:val="single" w:color="B9D7F2" w:sz="4"/>
+              <w:left w:val="single" w:color="B9D7F2" w:sz="4"/>
+              <w:bottom w:val="single" w:color="B9D7F2" w:sz="4"/>
+              <w:right w:val="single" w:color="B9D7F2" w:sz="4"/>
+            </w:tcBorders>
+            <w:shd w:fill="EAF4FD" w:color="auto" w:val="clear"/>
+            <w:tcMar>
+              <w:top w:type="dxa" w:w="70"/>
+              <w:left w:type="dxa" w:w="100"/>
+              <w:bottom w:type="dxa" w:w="70"/>
+              <w:right w:type="dxa" w:w="100"/>
+            </w:tcMar>
+          </w:tcPr>
+          <w:p>
+            <w:pPr>
+              <w:spacing w:after="0" w:before="0"/>
+            </w:pPr>
+            <w:r>
+              <w:rPr>
+                <w:rFonts w:ascii="Arial" w:cs="Arial" w:eastAsia="Arial" w:hAnsi="Arial"/>
+                <w:color w:val="15202B"/>
+                <w:sz w:val="19"/>
+                <w:szCs w:val="19"/>
+              </w:rPr>
+              <w:t xml:space="preserve">Log out. Tap Sign up and try the same phone number again.</w:t>
+            </w:r>
+          </w:p>
+        </w:tc>
+        <w:tc>
+          <w:tcPr>
+            <w:tcW w:type="dxa" w:w="3900"/>
+            <w:tcBorders>
+              <w:top w:val="single" w:color="B9D7F2" w:sz="4"/>
+              <w:left w:val="single" w:color="B9D7F2" w:sz="4"/>
+              <w:bottom w:val="single" w:color="B9D7F2" w:sz="4"/>
+              <w:right w:val="single" w:color="B9D7F2" w:sz="4"/>
+            </w:tcBorders>
+            <w:shd w:fill="EAF4FD" w:color="auto" w:val="clear"/>
+            <w:tcMar>
+              <w:top w:type="dxa" w:w="70"/>
+              <w:left w:type="dxa" w:w="100"/>
+              <w:bottom w:type="dxa" w:w="70"/>
+              <w:right w:type="dxa" w:w="100"/>
+            </w:tcMar>
+          </w:tcPr>
+          <w:p>
+            <w:pPr>
+              <w:spacing w:after="0" w:before="0"/>
+            </w:pPr>
+            <w:r>
+              <w:rPr>
+                <w:rFonts w:ascii="Arial" w:cs="Arial" w:eastAsia="Arial" w:hAnsi="Arial"/>
+                <w:color w:val="15202B"/>
+                <w:sz w:val="19"/>
+                <w:szCs w:val="19"/>
+              </w:rPr>
+              <w:t xml:space="preserve">Red box "Phone number already used"; the phone box has a red border.</w:t>
+            </w:r>
+          </w:p>
+        </w:tc>
+        <w:tc>
+          <w:tcPr>
+            <w:tcW w:type="dxa" w:w="900"/>
+            <w:tcBorders>
+              <w:top w:val="single" w:color="B9D7F2" w:sz="4"/>
+              <w:left w:val="single" w:color="B9D7F2" w:sz="4"/>
+              <w:bottom w:val="single" w:color="B9D7F2" w:sz="4"/>
+              <w:right w:val="single" w:color="B9D7F2" w:sz="4"/>
+            </w:tcBorders>
+            <w:shd w:fill="EAF4FD" w:color="auto" w:val="clear"/>
+            <w:tcMar>
+              <w:top w:type="dxa" w:w="70"/>
+              <w:left w:type="dxa" w:w="100"/>
+              <w:bottom w:type="dxa" w:w="70"/>
+              <w:right w:type="dxa" w:w="100"/>
+            </w:tcMar>
+          </w:tcPr>
+          <w:p>
+            <w:pPr>
+              <w:spacing w:after="0" w:before="0"/>
+            </w:pPr>
+            <w:r>
+              <w:rPr>
+                <w:rFonts w:ascii="Arial" w:cs="Arial" w:eastAsia="Arial" w:hAnsi="Arial"/>
+                <w:color w:val="15202B"/>
+                <w:sz w:val="18"/>
+                <w:szCs w:val="18"/>
+              </w:rPr>
+              <w:t xml:space="preserve">☐ Pass</w:t>
+            </w:r>
+          </w:p>
+          <w:p>
+            <w:pPr>
+              <w:spacing w:after="0" w:before="0"/>
+            </w:pPr>
+            <w:r>
+              <w:rPr>
+                <w:rFonts w:ascii="Arial" w:cs="Arial" w:eastAsia="Arial" w:hAnsi="Arial"/>
+                <w:color w:val="15202B"/>
+                <w:sz w:val="18"/>
+                <w:szCs w:val="18"/>
+              </w:rPr>
+              <w:t xml:space="preserve">☐ Fail</w:t>
+            </w:r>
+          </w:p>
+        </w:tc>
+        <w:tc>
+          <w:tcPr>
+            <w:tcW w:type="dxa" w:w="1066"/>
+            <w:tcBorders>
+              <w:top w:val="single" w:color="B9D7F2" w:sz="4"/>
+              <w:left w:val="single" w:color="B9D7F2" w:sz="4"/>
+              <w:bottom w:val="single" w:color="B9D7F2" w:sz="4"/>
+              <w:right w:val="single" w:color="B9D7F2" w:sz="4"/>
+            </w:tcBorders>
+            <w:shd w:fill="EAF4FD" w:color="auto" w:val="clear"/>
             <w:tcMar>
               <w:top w:type="dxa" w:w="70"/>
               <w:left w:type="dxa" w:w="100"/>
@@ -19225,8 +19404,8 @@
       </w:tr>
     </w:tbl>
     <w:sectPr>
-      <w:headerReference w:type="default" r:id="rId7"/>
-      <w:footerReference w:type="default" r:id="rId8"/>
+      <w:headerReference w:type="default" r:id="rId6"/>
+      <w:footerReference w:type="default" r:id="rId7"/>
       <w:pgSz w:w="11906" w:h="16838" w:orient="portrait"/>
       <w:pgMar w:top="720" w:right="720" w:bottom="720" w:left="720" w:header="708" w:footer="708" w:gutter="0"/>
       <w:pgNumType/>
@@ -19234,10 +19413,6 @@
     </w:sectPr>
   </w:body>
 </w:document>
-</file>
-
-<file path=word/comments.xml><?xml version="1.0" encoding="utf-8"?>
-<w:comments xmlns:cx="http://schemas.microsoft.com/office/drawing/2014/chartex" xmlns:cx1="http://schemas.microsoft.com/office/drawing/2015/9/8/chartex" xmlns:cx2="http://schemas.microsoft.com/office/drawing/2015/10/21/chartex" xmlns:cx3="http://schemas.microsoft.com/office/drawing/2016/5/9/chartex" xmlns:cx4="http://schemas.microsoft.com/office/drawing/2016/5/10/chartex" xmlns:cx5="http://schemas.microsoft.com/office/drawing/2016/5/11/chartex" xmlns:cx6="http://schemas.microsoft.com/office/drawing/2016/5/12/chartex" xmlns:cx7="http://schemas.microsoft.com/office/drawing/2016/5/13/chartex" xmlns:cx8="http://schemas.microsoft.com/office/drawing/2016/5/14/chartex" xmlns:mc="http://schemas.openxmlformats.org/markup-compatibility/2006" xmlns:aink="http://schemas.microsoft.com/office/drawing/2016/ink" xmlns:am3d="http://schemas.microsoft.com/office/drawing/2017/model3d" xmlns:o="urn:schemas-microsoft-com:office:office" xmlns:r="http://schemas.openxmlformats.org/officeDocument/2006/relationships" xmlns:m="http://schemas.openxmlformats.org/officeDocument/2006/math" xmlns:v="urn:schemas-microsoft-com:vml" xmlns:wp14="http://schemas.microsoft.com/office/word/2010/wordprocessingDrawing" xmlns:wp="http://schemas.openxmlformats.org/drawingml/2006/wordprocessingDrawing" xmlns:w10="urn:schemas-microsoft-com:office:word" xmlns:w="http://schemas.openxmlformats.org/wordprocessingml/2006/main" xmlns:w14="http://schemas.microsoft.com/office/word/2010/wordml" xmlns:w15="http://schemas.microsoft.com/office/word/2012/wordml" xmlns:w16cex="http://schemas.microsoft.com/office/word/2018/wordml/cex" xmlns:w16cid="http://schemas.microsoft.com/office/word/2016/wordml/cid" xmlns:w16="http://schemas.microsoft.com/office/word/2018/wordml" xmlns:w16sdtdh="http://schemas.microsoft.com/office/word/2020/wordml/sdtdatahash" xmlns:w16se="http://schemas.microsoft.com/office/word/2015/wordml/symex" xmlns:wpg="http://schemas.microsoft.com/office/word/2010/wordprocessingGroup" xmlns:wpi="http://schemas.microsoft.com/office/word/2010/wordprocessingInk" xmlns:wne="http://schemas.microsoft.com/office/word/2006/wordml" xmlns:wps="http://schemas.microsoft.com/office/word/2010/wordprocessingShape"/>
 </file>
 
 <file path=word/endnotes.xml><?xml version="1.0" encoding="utf-8"?>
@@ -19366,7 +19541,7 @@
 <w:numbering xmlns:wpc="http://schemas.microsoft.com/office/word/2010/wordprocessingCanvas" xmlns:mc="http://schemas.openxmlformats.org/markup-compatibility/2006" xmlns:o="urn:schemas-microsoft-com:office:office" xmlns:r="http://schemas.openxmlformats.org/officeDocument/2006/relationships" xmlns:m="http://schemas.openxmlformats.org/officeDocument/2006/math" xmlns:v="urn:schemas-microsoft-com:vml" xmlns:wp14="http://schemas.microsoft.com/office/word/2010/wordprocessingDrawing" xmlns:wp="http://schemas.openxmlformats.org/drawingml/2006/wordprocessingDrawing" xmlns:w10="urn:schemas-microsoft-com:office:word" xmlns:w="http://schemas.openxmlformats.org/wordprocessingml/2006/main" xmlns:w14="http://schemas.microsoft.com/office/word/2010/wordml" xmlns:w15="http://schemas.microsoft.com/office/word/2012/wordml" xmlns:wpg="http://schemas.microsoft.com/office/word/2010/wordprocessingGroup" xmlns:wpi="http://schemas.microsoft.com/office/word/2010/wordprocessingInk" xmlns:wne="http://schemas.microsoft.com/office/word/2006/wordml" xmlns:wps="http://schemas.microsoft.com/office/word/2010/wordprocessingShape" mc:Ignorable="w14 w15 wp14">
   <w:abstractNum w:abstractNumId="1" w15:restartNumberingAfterBreak="0">
     <w:multiLevelType w:val="hybridMultilevel"/>
-    <w:lvl w:ilvl="0" w15:tentative="1">
+    <w:lvl w:ilvl="0" w:tentative="1">
       <w:start w:val="1"/>
       <w:numFmt w:val="bullet"/>
       <w:lvlText w:val="●"/>
@@ -19375,7 +19550,7 @@
         <w:ind w:left="720" w:hanging="360"/>
       </w:pPr>
     </w:lvl>
-    <w:lvl w:ilvl="1" w15:tentative="1">
+    <w:lvl w:ilvl="1" w:tentative="1">
       <w:start w:val="1"/>
       <w:numFmt w:val="bullet"/>
       <w:lvlText w:val="○"/>
@@ -19384,7 +19559,7 @@
         <w:ind w:left="1440" w:hanging="360"/>
       </w:pPr>
     </w:lvl>
-    <w:lvl w:ilvl="2" w15:tentative="1">
+    <w:lvl w:ilvl="2" w:tentative="1">
       <w:start w:val="1"/>
       <w:numFmt w:val="bullet"/>
       <w:lvlText w:val="■"/>
@@ -19393,7 +19568,7 @@
         <w:ind w:left="2160" w:hanging="360"/>
       </w:pPr>
     </w:lvl>
-    <w:lvl w:ilvl="3" w15:tentative="1">
+    <w:lvl w:ilvl="3" w:tentative="1">
       <w:start w:val="1"/>
       <w:numFmt w:val="bullet"/>
       <w:lvlText w:val="●"/>
@@ -19402,7 +19577,7 @@
         <w:ind w:left="2880" w:hanging="360"/>
       </w:pPr>
     </w:lvl>
-    <w:lvl w:ilvl="4" w15:tentative="1">
+    <w:lvl w:ilvl="4" w:tentative="1">
       <w:start w:val="1"/>
       <w:numFmt w:val="bullet"/>
       <w:lvlText w:val="○"/>
@@ -19411,7 +19586,7 @@
         <w:ind w:left="3600" w:hanging="360"/>
       </w:pPr>
     </w:lvl>
-    <w:lvl w:ilvl="5" w15:tentative="1">
+    <w:lvl w:ilvl="5" w:tentative="1">
       <w:start w:val="1"/>
       <w:numFmt w:val="bullet"/>
       <w:lvlText w:val="■"/>
@@ -19420,7 +19595,7 @@
         <w:ind w:left="4320" w:hanging="360"/>
       </w:pPr>
     </w:lvl>
-    <w:lvl w:ilvl="6" w15:tentative="1">
+    <w:lvl w:ilvl="6" w:tentative="1">
       <w:start w:val="1"/>
       <w:numFmt w:val="bullet"/>
       <w:lvlText w:val="●"/>
@@ -19429,7 +19604,7 @@
         <w:ind w:left="5040" w:hanging="360"/>
       </w:pPr>
     </w:lvl>
-    <w:lvl w:ilvl="7" w15:tentative="1">
+    <w:lvl w:ilvl="7" w:tentative="1">
       <w:start w:val="1"/>
       <w:numFmt w:val="bullet"/>
       <w:lvlText w:val="●"/>
@@ -19438,7 +19613,7 @@
         <w:ind w:left="5760" w:hanging="360"/>
       </w:pPr>
     </w:lvl>
-    <w:lvl w:ilvl="8" w15:tentative="1">
+    <w:lvl w:ilvl="8" w:tentative="1">
       <w:start w:val="1"/>
       <w:numFmt w:val="bullet"/>
       <w:lvlText w:val="●"/>
@@ -19469,6 +19644,10 @@
     </w:rPrDefault>
     <w:pPrDefault/>
   </w:docDefaults>
+  <w:style w:type="paragraph" w:styleId="Normal" w:default="1">
+    <w:name w:val="Normal"/>
+    <w:qFormat/>
+  </w:style>
   <w:style w:type="paragraph" w:styleId="Title">
     <w:name w:val="Title"/>
     <w:basedOn w:val="Normal"/>
@@ -19641,4 +19820,294 @@
     </w:rPr>
   </w:style>
 </w:styles>
+</file>
+
+<file path=word/theme/theme1.xml><?xml version="1.0" encoding="utf-8"?>
+<a:theme xmlns:a="http://schemas.openxmlformats.org/drawingml/2006/main" name="Office Theme">
+  <a:themeElements>
+    <a:clrScheme name="Office">
+      <a:dk1>
+        <a:sysClr val="windowText" lastClr="000000"/>
+      </a:dk1>
+      <a:lt1>
+        <a:sysClr val="window" lastClr="FFFFFF"/>
+      </a:lt1>
+      <a:dk2>
+        <a:srgbClr val="44546A"/>
+      </a:dk2>
+      <a:lt2>
+        <a:srgbClr val="E7E6E6"/>
+      </a:lt2>
+      <a:accent1>
+        <a:srgbClr val="4472C4"/>
+      </a:accent1>
+      <a:accent2>
+        <a:srgbClr val="ED7D31"/>
+      </a:accent2>
+      <a:accent3>
+        <a:srgbClr val="A5A5A5"/>
+      </a:accent3>
+      <a:accent4>
+        <a:srgbClr val="FFC000"/>
+      </a:accent4>
+      <a:accent5>
+        <a:srgbClr val="5B9BD5"/>
+      </a:accent5>
+      <a:accent6>
+        <a:srgbClr val="70AD47"/>
+      </a:accent6>
+      <a:hlink>
+        <a:srgbClr val="0563C1"/>
+      </a:hlink>
+      <a:folHlink>
+        <a:srgbClr val="954F72"/>
+      </a:folHlink>
+    </a:clrScheme>
+    <a:fontScheme name="Office">
+      <a:majorFont>
+        <a:latin typeface="Calibri Light" panose="020F0302020204030204"/>
+        <a:ea typeface=""/>
+        <a:cs typeface=""/>
+        <a:font script="Jpan" typeface="游ゴシック Light"/>
+        <a:font script="Hang" typeface="맑은 고딕"/>
+        <a:font script="Hans" typeface="等线 Light"/>
+        <a:font script="Hant" typeface="新細明體"/>
+        <a:font script="Arab" typeface="Times New Roman"/>
+        <a:font script="Hebr" typeface="Times New Roman"/>
+        <a:font script="Thai" typeface="Angsana New"/>
+        <a:font script="Ethi" typeface="Nyala"/>
+        <a:font script="Beng" typeface="Vrinda"/>
+        <a:font script="Gujr" typeface="Shruti"/>
+        <a:font script="Khmr" typeface="MoolBoran"/>
+        <a:font script="Knda" typeface="Tunga"/>
+        <a:font script="Guru" typeface="Raavi"/>
+        <a:font script="Cans" typeface="Euphemia"/>
+        <a:font script="Cher" typeface="Plantagenet Cherokee"/>
+        <a:font script="Yiii" typeface="Microsoft Yi Baiti"/>
+        <a:font script="Tibt" typeface="Microsoft Himalaya"/>
+        <a:font script="Thaa" typeface="MV Boli"/>
+        <a:font script="Deva" typeface="Mangal"/>
+        <a:font script="Telu" typeface="Gautami"/>
+        <a:font script="Taml" typeface="Latha"/>
+        <a:font script="Syrc" typeface="Estrangelo Edessa"/>
+        <a:font script="Orya" typeface="Kalinga"/>
+        <a:font script="Mlym" typeface="Kartika"/>
+        <a:font script="Laoo" typeface="DokChampa"/>
+        <a:font script="Sinh" typeface="Iskoola Pota"/>
+        <a:font script="Mong" typeface="Mongolian Baiti"/>
+        <a:font script="Viet" typeface="Times New Roman"/>
+        <a:font script="Uigh" typeface="Microsoft Uighur"/>
+        <a:font script="Geor" typeface="Sylfaen"/>
+        <a:font script="Armn" typeface="Arial"/>
+        <a:font script="Bugi" typeface="Leelawadee UI"/>
+        <a:font script="Bopo" typeface="Microsoft JhengHei"/>
+        <a:font script="Java" typeface="Javanese Text"/>
+        <a:font script="Lisu" typeface="Segoe UI"/>
+        <a:font script="Mymr" typeface="Myanmar Text"/>
+        <a:font script="Nkoo" typeface="Ebrima"/>
+        <a:font script="Olck" typeface="Nirmala UI"/>
+        <a:font script="Osma" typeface="Ebrima"/>
+        <a:font script="Phag" typeface="Phagspa"/>
+        <a:font script="Syrn" typeface="Estrangelo Edessa"/>
+        <a:font script="Syrj" typeface="Estrangelo Edessa"/>
+        <a:font script="Syre" typeface="Estrangelo Edessa"/>
+        <a:font script="Sora" typeface="Nirmala UI"/>
+        <a:font script="Tale" typeface="Microsoft Tai Le"/>
+        <a:font script="Talu" typeface="Microsoft New Tai Lue"/>
+        <a:font script="Tfng" typeface="Ebrima"/>
+      </a:majorFont>
+      <a:minorFont>
+        <a:latin typeface="Calibri" panose="020F0502020204030204"/>
+        <a:ea typeface=""/>
+        <a:cs typeface=""/>
+        <a:font script="Jpan" typeface="游明朝"/>
+        <a:font script="Hang" typeface="맑은 고딕"/>
+        <a:font script="Hans" typeface="等线"/>
+        <a:font script="Hant" typeface="新細明體"/>
+        <a:font script="Arab" typeface="Arial"/>
+        <a:font script="Hebr" typeface="Arial"/>
+        <a:font script="Thai" typeface="Cordia New"/>
+        <a:font script="Ethi" typeface="Nyala"/>
+        <a:font script="Beng" typeface="Vrinda"/>
+        <a:font script="Gujr" typeface="Shruti"/>
+        <a:font script="Khmr" typeface="DaunPenh"/>
+        <a:font script="Knda" typeface="Tunga"/>
+        <a:font script="Guru" typeface="Raavi"/>
+        <a:font script="Cans" typeface="Euphemia"/>
+        <a:font script="Cher" typeface="Plantagenet Cherokee"/>
+        <a:font script="Yiii" typeface="Microsoft Yi Baiti"/>
+        <a:font script="Tibt" typeface="Microsoft Himalaya"/>
+        <a:font script="Thaa" typeface="MV Boli"/>
+        <a:font script="Deva" typeface="Mangal"/>
+        <a:font script="Telu" typeface="Gautami"/>
+        <a:font script="Taml" typeface="Latha"/>
+        <a:font script="Syrc" typeface="Estrangelo Edessa"/>
+        <a:font script="Orya" typeface="Kalinga"/>
+        <a:font script="Mlym" typeface="Kartika"/>
+        <a:font script="Laoo" typeface="DokChampa"/>
+        <a:font script="Sinh" typeface="Iskoola Pota"/>
+        <a:font script="Mong" typeface="Mongolian Baiti"/>
+        <a:font script="Viet" typeface="Arial"/>
+        <a:font script="Uigh" typeface="Microsoft Uighur"/>
+        <a:font script="Geor" typeface="Sylfaen"/>
+        <a:font script="Armn" typeface="Arial"/>
+        <a:font script="Bugi" typeface="Leelawadee UI"/>
+        <a:font script="Bopo" typeface="Microsoft JhengHei"/>
+        <a:font script="Java" typeface="Javanese Text"/>
+        <a:font script="Lisu" typeface="Segoe UI"/>
+        <a:font script="Mymr" typeface="Myanmar Text"/>
+        <a:font script="Nkoo" typeface="Ebrima"/>
+        <a:font script="Olck" typeface="Nirmala UI"/>
+        <a:font script="Osma" typeface="Ebrima"/>
+        <a:font script="Phag" typeface="Phagspa"/>
+        <a:font script="Syrn" typeface="Estrangelo Edessa"/>
+        <a:font script="Syrj" typeface="Estrangelo Edessa"/>
+        <a:font script="Syre" typeface="Estrangelo Edessa"/>
+        <a:font script="Sora" typeface="Nirmala UI"/>
+        <a:font script="Tale" typeface="Microsoft Tai Le"/>
+        <a:font script="Talu" typeface="Microsoft New Tai Lue"/>
+        <a:font script="Tfng" typeface="Ebrima"/>
+      </a:minorFont>
+    </a:fontScheme>
+    <a:fmtScheme name="Office">
+      <a:fillStyleLst>
+        <a:solidFill>
+          <a:schemeClr val="phClr"/>
+        </a:solidFill>
+        <a:gradFill rotWithShape="true">
+          <a:gsLst>
+            <a:gs pos="0">
+              <a:schemeClr val="phClr">
+                <a:lumMod val="110000"/>
+                <a:satMod val="105000"/>
+                <a:tint val="67000"/>
+              </a:schemeClr>
+            </a:gs>
+            <a:gs pos="50000">
+              <a:schemeClr val="phClr">
+                <a:lumMod val="105000"/>
+                <a:satMod val="103000"/>
+                <a:tint val="73000"/>
+              </a:schemeClr>
+            </a:gs>
+            <a:gs pos="100000">
+              <a:schemeClr val="phClr">
+                <a:lumMod val="105000"/>
+                <a:satMod val="109000"/>
+                <a:tint val="81000"/>
+              </a:schemeClr>
+            </a:gs>
+          </a:gsLst>
+          <a:lin ang="5400000" scaled="false"/>
+        </a:gradFill>
+        <a:gradFill rotWithShape="true">
+          <a:gsLst>
+            <a:gs pos="0">
+              <a:schemeClr val="phClr">
+                <a:satMod val="103000"/>
+                <a:lumMod val="102000"/>
+                <a:tint val="94000"/>
+              </a:schemeClr>
+            </a:gs>
+            <a:gs pos="50000">
+              <a:schemeClr val="phClr">
+                <a:satMod val="110000"/>
+                <a:lumMod val="100000"/>
+                <a:shade val="100000"/>
+              </a:schemeClr>
+            </a:gs>
+            <a:gs pos="100000">
+              <a:schemeClr val="phClr">
+                <a:lumMod val="99000"/>
+                <a:satMod val="120000"/>
+                <a:shade val="78000"/>
+              </a:schemeClr>
+            </a:gs>
+          </a:gsLst>
+          <a:lin ang="5400000" scaled="false"/>
+        </a:gradFill>
+      </a:fillStyleLst>
+      <a:lnStyleLst>
+        <a:ln w="6350" cap="flat" cmpd="sng" algn="ctr">
+          <a:solidFill>
+            <a:schemeClr val="phClr"/>
+          </a:solidFill>
+          <a:prstDash val="solid"/>
+          <a:miter lim="800000"/>
+        </a:ln>
+        <a:ln w="12700" cap="flat" cmpd="sng" algn="ctr">
+          <a:solidFill>
+            <a:schemeClr val="phClr"/>
+          </a:solidFill>
+          <a:prstDash val="solid"/>
+          <a:miter lim="800000"/>
+        </a:ln>
+        <a:ln w="19050" cap="flat" cmpd="sng" algn="ctr">
+          <a:solidFill>
+            <a:schemeClr val="phClr"/>
+          </a:solidFill>
+          <a:prstDash val="solid"/>
+          <a:miter lim="800000"/>
+        </a:ln>
+      </a:lnStyleLst>
+      <a:effectStyleLst>
+        <a:effectStyle>
+          <a:effectLst/>
+        </a:effectStyle>
+        <a:effectStyle>
+          <a:effectLst/>
+        </a:effectStyle>
+        <a:effectStyle>
+          <a:effectLst>
+            <a:outerShdw blurRad="57150" dist="19050" dir="5400000" algn="ctr" rotWithShape="false">
+              <a:srgbClr val="000000">
+                <a:alpha val="63000"/>
+              </a:srgbClr>
+            </a:outerShdw>
+          </a:effectLst>
+        </a:effectStyle>
+      </a:effectStyleLst>
+      <a:bgFillStyleLst>
+        <a:solidFill>
+          <a:schemeClr val="phClr"/>
+        </a:solidFill>
+        <a:solidFill>
+          <a:schemeClr val="phClr">
+            <a:tint val="95000"/>
+            <a:satMod val="170000"/>
+          </a:schemeClr>
+        </a:solidFill>
+        <a:gradFill rotWithShape="true">
+          <a:gsLst>
+            <a:gs pos="0">
+              <a:schemeClr val="phClr">
+                <a:tint val="93000"/>
+                <a:satMod val="150000"/>
+                <a:shade val="98000"/>
+                <a:lumMod val="102000"/>
+              </a:schemeClr>
+            </a:gs>
+            <a:gs pos="50000">
+              <a:schemeClr val="phClr">
+                <a:tint val="98000"/>
+                <a:satMod val="130000"/>
+                <a:shade val="90000"/>
+                <a:lumMod val="103000"/>
+              </a:schemeClr>
+            </a:gs>
+            <a:gs pos="100000">
+              <a:schemeClr val="phClr">
+                <a:shade val="63000"/>
+                <a:satMod val="120000"/>
+              </a:schemeClr>
+            </a:gs>
+          </a:gsLst>
+          <a:lin ang="5400000" scaled="false"/>
+        </a:gradFill>
+      </a:bgFillStyleLst>
+    </a:fmtScheme>
+  </a:themeElements>
+  <a:objectDefaults/>
+  <a:extraClrSchemeLst/>
+</a:theme>
 </file>
</xml_diff>

<commit_message>
Testing checklists: 2-minute session expiry and saving exports on the phone
Co-Authored-By: Claude Opus 5.5 <noreply@anthropic.com>
Claude-Session: https://claude.ai/code/session_01FGCEzsecdEGjCSsNcfM7Ef
</commit_message>
<xml_diff>
--- a/docs/testing/Mangao-Team-Testing-Guide.docx
+++ b/docs/testing/Mangao-Team-Testing-Guide.docx
@@ -62,7 +62,7 @@
         </w:rPr>
         <w:t xml:space="preserve">1. On your Android phone, open this link in Chrome: </w:t>
       </w:r>
-      <w:hyperlink w:history="1" r:id="rIdvk1nemsalhk4ac8ne0ec_">
+      <w:hyperlink w:history="1" r:id="rId7-3rchahnw3arzlg6rqnj">
         <w:r>
           <w:rPr>
             <w:rFonts w:ascii="Arial" w:cs="Arial" w:eastAsia="Arial" w:hAnsi="Arial"/>
@@ -157,6 +157,20 @@
           <w:szCs w:val="20"/>
         </w:rPr>
         <w:t xml:space="preserve">You need internet on the phone (Wi-Fi or mobile data). Allow location and camera when the app asks.</w:t>
+      </w:r>
+    </w:p>
+    <w:p>
+      <w:pPr>
+        <w:spacing w:after="80" w:before="0"/>
+      </w:pPr>
+      <w:r>
+        <w:rPr>
+          <w:rFonts w:ascii="Arial" w:cs="Arial" w:eastAsia="Arial" w:hAnsi="Arial"/>
+          <w:color w:val="64707C"/>
+          <w:sz w:val="20"/>
+          <w:szCs w:val="20"/>
+        </w:rPr>
+        <w:t xml:space="preserve">For safety the app logs you out after 2 minutes without touching it (or when you leave it for 2 minutes). If that happens during a test, just log in again and continue.</w:t>
       </w:r>
     </w:p>
     <w:p>
@@ -1437,7 +1451,7 @@
           <w:sz w:val="20"/>
           <w:szCs w:val="20"/>
         </w:rPr>
-        <w:t xml:space="preserve">5 parts, 76 checks. With 4 testers, each takes one role (Parts A to D). Suggested order: everyone logs in first, do Part E together (it needs all four phones), then continue your own part. With fewer testers, one person can do two roles on two phones, or log out and log in as the other role.</w:t>
+        <w:t xml:space="preserve">5 parts, 79 checks. With 4 testers, each takes one role (Parts A to D). Suggested order: everyone logs in first, do Part E together (it needs all four phones), then continue your own part. With fewer testers, one person can do two roles on two phones, or log out and log in as the other role.</w:t>
       </w:r>
     </w:p>
     <w:tbl>
@@ -1759,7 +1773,7 @@
                 <w:sz w:val="19"/>
                 <w:szCs w:val="19"/>
               </w:rPr>
-              <w:t xml:space="preserve">22</w:t>
+              <w:t xml:space="preserve">23</w:t>
             </w:r>
           </w:p>
         </w:tc>
@@ -1923,7 +1937,7 @@
                 <w:sz w:val="19"/>
                 <w:szCs w:val="19"/>
               </w:rPr>
-              <w:t xml:space="preserve">24</w:t>
+              <w:t xml:space="preserve">26</w:t>
             </w:r>
           </w:p>
         </w:tc>
@@ -3300,7 +3314,7 @@
                 <w:sz w:val="19"/>
                 <w:szCs w:val="19"/>
               </w:rPr>
-              <w:t xml:space="preserve">Close the app fully (swipe it away from recent apps) and open it again.</w:t>
+              <w:t xml:space="preserve">Close the app fully (swipe it away from recent apps) and open it again right away.</w:t>
             </w:r>
           </w:p>
         </w:tc>
@@ -3477,7 +3491,7 @@
                 <w:sz w:val="19"/>
                 <w:szCs w:val="19"/>
               </w:rPr>
-              <w:t xml:space="preserve">Tap Order Now.</w:t>
+              <w:t xml:space="preserve">Go to another app (or lock the phone) for more than 2 minutes, then come back to Mangao WRS.</w:t>
             </w:r>
           </w:p>
         </w:tc>
@@ -3508,7 +3522,7 @@
                 <w:sz w:val="19"/>
                 <w:szCs w:val="19"/>
               </w:rPr>
-              <w:t xml:space="preserve">Order Form: "Refill my gallons" chosen, Gallons 1, Total ₱35.00, your phone already filled in, Payment "Cash on delivery (COD)".</w:t>
+              <w:t xml:space="preserve">The Log in page opens with the blue note "Session expired. You were away for 2 minutes, so you were logged out. Log in again." Log in again to continue. (This also happens if you leave the app untouched for 2 minutes.)</w:t>
             </w:r>
           </w:p>
         </w:tc>
@@ -3653,7 +3667,7 @@
                 <w:sz w:val="19"/>
                 <w:szCs w:val="19"/>
               </w:rPr>
-              <w:t xml:space="preserve">Tap + two times. Then tap "Buy a package", then "Refill my gallons" again.</w:t>
+              <w:t xml:space="preserve">Tap Order Now.</w:t>
             </w:r>
           </w:p>
         </w:tc>
@@ -3685,7 +3699,7 @@
                 <w:sz w:val="19"/>
                 <w:szCs w:val="19"/>
               </w:rPr>
-              <w:t xml:space="preserve">Refill: 3 gallons, ₱105.00. Package: ₱450.00. Back to Refill: ₱105.00.</w:t>
+              <w:t xml:space="preserve">Order Form: "Refill my gallons" chosen, Gallons 1, Total ₱35.00, your phone already filled in, Payment "Cash on delivery (COD)".</w:t>
             </w:r>
           </w:p>
         </w:tc>
@@ -3830,7 +3844,7 @@
                 <w:sz w:val="19"/>
                 <w:szCs w:val="19"/>
               </w:rPr>
-              <w:t xml:space="preserve">Tap Delivery address &gt; Pin on map &gt; "Use my location". Allow location when the phone asks.</w:t>
+              <w:t xml:space="preserve">Tap + two times. Then tap "Buy a package", then "Refill my gallons" again.</w:t>
             </w:r>
           </w:p>
         </w:tc>
@@ -3861,7 +3875,7 @@
                 <w:sz w:val="19"/>
                 <w:szCs w:val="19"/>
               </w:rPr>
-              <w:t xml:space="preserve">The map moves to where you are and shows "Pinned: near &lt;street&gt;, &lt;barangay&gt;". Tap "Use this address".</w:t>
+              <w:t xml:space="preserve">Refill: 3 gallons, ₱105.00. Package: ₱450.00. Back to Refill: ₱105.00.</w:t>
             </w:r>
           </w:p>
         </w:tc>
@@ -4006,7 +4020,7 @@
                 <w:sz w:val="19"/>
                 <w:szCs w:val="19"/>
               </w:rPr>
-              <w:t xml:space="preserve">Tap Place order.</w:t>
+              <w:t xml:space="preserve">Tap Delivery address &gt; Pin on map &gt; "Use my location". Allow location when the phone asks.</w:t>
             </w:r>
           </w:p>
         </w:tc>
@@ -4038,7 +4052,7 @@
                 <w:sz w:val="19"/>
                 <w:szCs w:val="19"/>
               </w:rPr>
-              <w:t xml:space="preserve">Popup "Confirm order?" with the gallons, address, payment and total.</w:t>
+              <w:t xml:space="preserve">The map moves to where you are and shows "Pinned: near &lt;street&gt;, &lt;barangay&gt;". Tap "Use this address".</w:t>
             </w:r>
           </w:p>
         </w:tc>
@@ -4183,7 +4197,7 @@
                 <w:sz w:val="19"/>
                 <w:szCs w:val="19"/>
               </w:rPr>
-              <w:t xml:space="preserve">Tap Confirm.</w:t>
+              <w:t xml:space="preserve">Tap Place order.</w:t>
             </w:r>
           </w:p>
         </w:tc>
@@ -4214,7 +4228,7 @@
                 <w:sz w:val="19"/>
                 <w:szCs w:val="19"/>
               </w:rPr>
-              <w:t xml:space="preserve">"Thank you for your order!" message. OK goes back to Home with a card "Waiting to be accepted". Tell the Owner tester your order is in.</w:t>
+              <w:t xml:space="preserve">Popup "Confirm order?" with the gallons, address, payment and total.</w:t>
             </w:r>
           </w:p>
         </w:tc>
@@ -4359,7 +4373,7 @@
                 <w:sz w:val="19"/>
                 <w:szCs w:val="19"/>
               </w:rPr>
-              <w:t xml:space="preserve">Wait on Home while the Owner accepts your order. Do not touch the screen.</w:t>
+              <w:t xml:space="preserve">Tap Confirm.</w:t>
             </w:r>
           </w:p>
         </w:tc>
@@ -4391,7 +4405,7 @@
                 <w:sz w:val="19"/>
                 <w:szCs w:val="19"/>
               </w:rPr>
-              <w:t xml:space="preserve">Within a few seconds the card changes to "Processing" with "Estimated delivery: by &lt;time&gt;", and a banner "Order accepted" shows.</w:t>
+              <w:t xml:space="preserve">"Thank you for your order!" message. OK goes back to Home with a card "Waiting to be accepted". Tell the Owner tester your order is in.</w:t>
             </w:r>
           </w:p>
         </w:tc>
@@ -4536,7 +4550,7 @@
                 <w:sz w:val="19"/>
                 <w:szCs w:val="19"/>
               </w:rPr>
-              <w:t xml:space="preserve">Tap the card.</w:t>
+              <w:t xml:space="preserve">Wait on Home while the Owner accepts your order. Do not touch the screen.</w:t>
             </w:r>
           </w:p>
         </w:tc>
@@ -4567,7 +4581,7 @@
                 <w:sz w:val="19"/>
                 <w:szCs w:val="19"/>
               </w:rPr>
-              <w:t xml:space="preserve">Order Details with 5 steps (Order accepted checked, Processing current) and a "Call station" button.</w:t>
+              <w:t xml:space="preserve">Within a few seconds the card changes to "Processing" with "Estimated delivery: by &lt;time&gt;", and a banner "Order accepted" shows.</w:t>
             </w:r>
           </w:p>
         </w:tc>
@@ -4712,7 +4726,7 @@
                 <w:sz w:val="19"/>
                 <w:szCs w:val="19"/>
               </w:rPr>
-              <w:t xml:space="preserve">Tap Call station.</w:t>
+              <w:t xml:space="preserve">Tap the card.</w:t>
             </w:r>
           </w:p>
         </w:tc>
@@ -4744,7 +4758,7 @@
                 <w:sz w:val="19"/>
                 <w:szCs w:val="19"/>
               </w:rPr>
-              <w:t xml:space="preserve">The phone dialer opens with the station number.</w:t>
+              <w:t xml:space="preserve">Order Details with 5 steps (Order accepted checked, Processing current) and a "Call station" button.</w:t>
             </w:r>
           </w:p>
         </w:tc>
@@ -4889,7 +4903,7 @@
                 <w:sz w:val="19"/>
                 <w:szCs w:val="19"/>
               </w:rPr>
-              <w:t xml:space="preserve">Place a second order (1 gallon). Open it from Home and tap Cancel order &gt; Confirm.</w:t>
+              <w:t xml:space="preserve">Tap Call station.</w:t>
             </w:r>
           </w:p>
         </w:tc>
@@ -4920,7 +4934,7 @@
                 <w:sz w:val="19"/>
                 <w:szCs w:val="19"/>
               </w:rPr>
-              <w:t xml:space="preserve">"Order cancelled; owner notified"; the order shows a Cancelled tag.</w:t>
+              <w:t xml:space="preserve">The phone dialer opens with the station number.</w:t>
             </w:r>
           </w:p>
         </w:tc>
@@ -5065,7 +5079,7 @@
                 <w:sz w:val="19"/>
                 <w:szCs w:val="19"/>
               </w:rPr>
-              <w:t xml:space="preserve">Open the My Orders tab.</w:t>
+              <w:t xml:space="preserve">Place a second order (1 gallon). Open it from Home and tap Cancel order &gt; Confirm.</w:t>
             </w:r>
           </w:p>
         </w:tc>
@@ -5097,7 +5111,7 @@
                 <w:sz w:val="19"/>
                 <w:szCs w:val="19"/>
               </w:rPr>
-              <w:t xml:space="preserve">Active orders on top; History has the cancelled order with a Reorder button.</w:t>
+              <w:t xml:space="preserve">"Order cancelled; owner notified"; the order shows a Cancelled tag.</w:t>
             </w:r>
           </w:p>
         </w:tc>
@@ -5242,7 +5256,7 @@
                 <w:sz w:val="19"/>
                 <w:szCs w:val="19"/>
               </w:rPr>
-              <w:t xml:space="preserve">Tap Reorder on the cancelled order.</w:t>
+              <w:t xml:space="preserve">Open the My Orders tab.</w:t>
             </w:r>
           </w:p>
         </w:tc>
@@ -5273,7 +5287,7 @@
                 <w:sz w:val="19"/>
                 <w:szCs w:val="19"/>
               </w:rPr>
-              <w:t xml:space="preserve">Order Form filled in with the same gallons and address. Tap Cancel &gt; Confirm to leave it.</w:t>
+              <w:t xml:space="preserve">Active orders on top; History has the cancelled order with a Reorder button.</w:t>
             </w:r>
           </w:p>
         </w:tc>
@@ -5418,7 +5432,7 @@
                 <w:sz w:val="19"/>
                 <w:szCs w:val="19"/>
               </w:rPr>
-              <w:t xml:space="preserve">My Account &gt; Saved Addresses &gt; Add address. Name "Work", Type address: house 5, street "Mabuhay St.", Barangay "Commonwealth" &gt; Save.</w:t>
+              <w:t xml:space="preserve">Tap Reorder on the cancelled order.</w:t>
             </w:r>
           </w:p>
         </w:tc>
@@ -5450,7 +5464,7 @@
                 <w:sz w:val="19"/>
                 <w:szCs w:val="19"/>
               </w:rPr>
-              <w:t xml:space="preserve">"Address saved"; Work is in the list. Next time you order, Work shows as a quick choice.</w:t>
+              <w:t xml:space="preserve">Order Form filled in with the same gallons and address. Tap Cancel &gt; Confirm to leave it.</w:t>
             </w:r>
           </w:p>
         </w:tc>
@@ -5595,7 +5609,7 @@
                 <w:sz w:val="19"/>
                 <w:szCs w:val="19"/>
               </w:rPr>
-              <w:t xml:space="preserve">When the Rider marks your first order Delivered (Part E or ask the Rider tester).</w:t>
+              <w:t xml:space="preserve">My Account &gt; Saved Addresses &gt; Add address. Name "Work", Type address: house 5, street "Mabuhay St.", Barangay "Commonwealth" &gt; Save.</w:t>
             </w:r>
           </w:p>
         </w:tc>
@@ -5626,7 +5640,7 @@
                 <w:sz w:val="19"/>
                 <w:szCs w:val="19"/>
               </w:rPr>
-              <w:t xml:space="preserve">The order changes to Delivered by itself with a banner "Delivered · Thank you! Enjoy your fresh water."</w:t>
+              <w:t xml:space="preserve">"Address saved"; Work is in the list. Next time you order, Work shows as a quick choice.</w:t>
             </w:r>
           </w:p>
         </w:tc>
@@ -5771,7 +5785,7 @@
                 <w:sz w:val="19"/>
                 <w:szCs w:val="19"/>
               </w:rPr>
-              <w:t xml:space="preserve">My Account &gt; Log out &gt; Confirm.</w:t>
+              <w:t xml:space="preserve">When the Rider marks your first order Delivered (Part E or ask the Rider tester).</w:t>
             </w:r>
           </w:p>
         </w:tc>
@@ -5803,7 +5817,7 @@
                 <w:sz w:val="19"/>
                 <w:szCs w:val="19"/>
               </w:rPr>
-              <w:t xml:space="preserve">Back to the Welcome screen.</w:t>
+              <w:t xml:space="preserve">The order changes to Delivered by itself with a banner "Delivered · Thank you! Enjoy your fresh water."</w:t>
             </w:r>
           </w:p>
         </w:tc>
@@ -5948,7 +5962,7 @@
                 <w:sz w:val="19"/>
                 <w:szCs w:val="19"/>
               </w:rPr>
-              <w:t xml:space="preserve">Tap "Continue as guest" &gt; Order Now. Leave Name empty and tap Place order.</w:t>
+              <w:t xml:space="preserve">My Account &gt; Log out &gt; Confirm.</w:t>
             </w:r>
           </w:p>
         </w:tc>
@@ -5979,7 +5993,7 @@
                 <w:sz w:val="19"/>
                 <w:szCs w:val="19"/>
               </w:rPr>
-              <w:t xml:space="preserve">Red box "Name missing".</w:t>
+              <w:t xml:space="preserve">Back to the Welcome screen.</w:t>
             </w:r>
           </w:p>
         </w:tc>
@@ -6124,7 +6138,7 @@
                 <w:sz w:val="19"/>
                 <w:szCs w:val="19"/>
               </w:rPr>
-              <w:t xml:space="preserve">Fill Name, phone 09185551212, type an address, place the order.</w:t>
+              <w:t xml:space="preserve">Tap "Continue as guest" &gt; Order Now. Leave Name empty and tap Place order.</w:t>
             </w:r>
           </w:p>
         </w:tc>
@@ -6156,7 +6170,7 @@
                 <w:sz w:val="19"/>
                 <w:szCs w:val="19"/>
               </w:rPr>
-              <w:t xml:space="preserve">Thank-you message; the order shows on Home with "This phone only; lost if the app is deleted".</w:t>
+              <w:t xml:space="preserve">Red box "Name missing".</w:t>
             </w:r>
           </w:p>
         </w:tc>
@@ -6301,7 +6315,7 @@
                 <w:sz w:val="19"/>
                 <w:szCs w:val="19"/>
               </w:rPr>
-              <w:t xml:space="preserve">My Account &gt; Create account. Use YOUR OWN name, your own phone number, an email and a password (6+ letters), tick the Terms box &gt; Create account.</w:t>
+              <w:t xml:space="preserve">Fill Name, phone 09185551212, type an address, place the order.</w:t>
             </w:r>
           </w:p>
         </w:tc>
@@ -6332,7 +6346,7 @@
                 <w:sz w:val="19"/>
                 <w:szCs w:val="19"/>
               </w:rPr>
-              <w:t xml:space="preserve">"Account created" and "The orders on this phone are now in your account." My Orders shows the guest order.</w:t>
+              <w:t xml:space="preserve">Thank-you message; the order shows on Home with "This phone only; lost if the app is deleted".</w:t>
             </w:r>
           </w:p>
         </w:tc>
@@ -6477,7 +6491,7 @@
                 <w:sz w:val="19"/>
                 <w:szCs w:val="19"/>
               </w:rPr>
-              <w:t xml:space="preserve">Log out. Tap Sign up and try the same phone number again.</w:t>
+              <w:t xml:space="preserve">My Account &gt; Create account. Use YOUR OWN name, your own phone number, an email and a password (6+ letters), tick the Terms box &gt; Create account.</w:t>
             </w:r>
           </w:p>
         </w:tc>
@@ -6509,7 +6523,7 @@
                 <w:sz w:val="19"/>
                 <w:szCs w:val="19"/>
               </w:rPr>
-              <w:t xml:space="preserve">Red box "Phone number already used"; the phone box has a red border.</w:t>
+              <w:t xml:space="preserve">"Account created" and "The orders on this phone are now in your account." My Orders shows the guest order.</w:t>
             </w:r>
           </w:p>
         </w:tc>
@@ -6569,6 +6583,180 @@
               <w:right w:val="single" w:color="B9D7F2" w:sz="4"/>
             </w:tcBorders>
             <w:shd w:fill="EAF4FD" w:color="auto" w:val="clear"/>
+            <w:tcMar>
+              <w:top w:type="dxa" w:w="70"/>
+              <w:left w:type="dxa" w:w="100"/>
+              <w:bottom w:type="dxa" w:w="70"/>
+              <w:right w:type="dxa" w:w="100"/>
+            </w:tcMar>
+          </w:tcPr>
+          <w:p>
+            <w:pPr>
+              <w:spacing w:after="0" w:before="0"/>
+            </w:pPr>
+            <w:r>
+              <w:rPr>
+                <w:rFonts w:ascii="Arial" w:cs="Arial" w:eastAsia="Arial" w:hAnsi="Arial"/>
+                <w:color w:val="15202B"/>
+                <w:sz w:val="19"/>
+                <w:szCs w:val="19"/>
+              </w:rPr>
+              <w:t xml:space="preserve"/>
+            </w:r>
+          </w:p>
+        </w:tc>
+      </w:tr>
+      <w:tr>
+        <w:trPr>
+          <w:cantSplit/>
+        </w:trPr>
+        <w:tc>
+          <w:tcPr>
+            <w:tcW w:type="dxa" w:w="700"/>
+            <w:tcBorders>
+              <w:top w:val="single" w:color="B9D7F2" w:sz="4"/>
+              <w:left w:val="single" w:color="B9D7F2" w:sz="4"/>
+              <w:bottom w:val="single" w:color="B9D7F2" w:sz="4"/>
+              <w:right w:val="single" w:color="B9D7F2" w:sz="4"/>
+            </w:tcBorders>
+            <w:tcMar>
+              <w:top w:type="dxa" w:w="70"/>
+              <w:left w:type="dxa" w:w="100"/>
+              <w:bottom w:type="dxa" w:w="70"/>
+              <w:right w:type="dxa" w:w="100"/>
+            </w:tcMar>
+          </w:tcPr>
+          <w:p>
+            <w:pPr>
+              <w:spacing w:after="0" w:before="0"/>
+            </w:pPr>
+            <w:r>
+              <w:rPr>
+                <w:rFonts w:ascii="Arial" w:cs="Arial" w:eastAsia="Arial" w:hAnsi="Arial"/>
+                <w:color w:val="15202B"/>
+                <w:sz w:val="19"/>
+                <w:szCs w:val="19"/>
+              </w:rPr>
+              <w:t xml:space="preserve">A23</w:t>
+            </w:r>
+          </w:p>
+        </w:tc>
+        <w:tc>
+          <w:tcPr>
+            <w:tcW w:type="dxa" w:w="3900"/>
+            <w:tcBorders>
+              <w:top w:val="single" w:color="B9D7F2" w:sz="4"/>
+              <w:left w:val="single" w:color="B9D7F2" w:sz="4"/>
+              <w:bottom w:val="single" w:color="B9D7F2" w:sz="4"/>
+              <w:right w:val="single" w:color="B9D7F2" w:sz="4"/>
+            </w:tcBorders>
+            <w:tcMar>
+              <w:top w:type="dxa" w:w="70"/>
+              <w:left w:type="dxa" w:w="100"/>
+              <w:bottom w:type="dxa" w:w="70"/>
+              <w:right w:type="dxa" w:w="100"/>
+            </w:tcMar>
+          </w:tcPr>
+          <w:p>
+            <w:pPr>
+              <w:spacing w:after="0" w:before="0"/>
+            </w:pPr>
+            <w:r>
+              <w:rPr>
+                <w:rFonts w:ascii="Arial" w:cs="Arial" w:eastAsia="Arial" w:hAnsi="Arial"/>
+                <w:color w:val="15202B"/>
+                <w:sz w:val="19"/>
+                <w:szCs w:val="19"/>
+              </w:rPr>
+              <w:t xml:space="preserve">Log out. Tap Sign up and try the same phone number again.</w:t>
+            </w:r>
+          </w:p>
+        </w:tc>
+        <w:tc>
+          <w:tcPr>
+            <w:tcW w:type="dxa" w:w="3900"/>
+            <w:tcBorders>
+              <w:top w:val="single" w:color="B9D7F2" w:sz="4"/>
+              <w:left w:val="single" w:color="B9D7F2" w:sz="4"/>
+              <w:bottom w:val="single" w:color="B9D7F2" w:sz="4"/>
+              <w:right w:val="single" w:color="B9D7F2" w:sz="4"/>
+            </w:tcBorders>
+            <w:tcMar>
+              <w:top w:type="dxa" w:w="70"/>
+              <w:left w:type="dxa" w:w="100"/>
+              <w:bottom w:type="dxa" w:w="70"/>
+              <w:right w:type="dxa" w:w="100"/>
+            </w:tcMar>
+          </w:tcPr>
+          <w:p>
+            <w:pPr>
+              <w:spacing w:after="0" w:before="0"/>
+            </w:pPr>
+            <w:r>
+              <w:rPr>
+                <w:rFonts w:ascii="Arial" w:cs="Arial" w:eastAsia="Arial" w:hAnsi="Arial"/>
+                <w:color w:val="15202B"/>
+                <w:sz w:val="19"/>
+                <w:szCs w:val="19"/>
+              </w:rPr>
+              <w:t xml:space="preserve">Red box "Phone number already used"; the phone box has a red border.</w:t>
+            </w:r>
+          </w:p>
+        </w:tc>
+        <w:tc>
+          <w:tcPr>
+            <w:tcW w:type="dxa" w:w="900"/>
+            <w:tcBorders>
+              <w:top w:val="single" w:color="B9D7F2" w:sz="4"/>
+              <w:left w:val="single" w:color="B9D7F2" w:sz="4"/>
+              <w:bottom w:val="single" w:color="B9D7F2" w:sz="4"/>
+              <w:right w:val="single" w:color="B9D7F2" w:sz="4"/>
+            </w:tcBorders>
+            <w:tcMar>
+              <w:top w:type="dxa" w:w="70"/>
+              <w:left w:type="dxa" w:w="100"/>
+              <w:bottom w:type="dxa" w:w="70"/>
+              <w:right w:type="dxa" w:w="100"/>
+            </w:tcMar>
+          </w:tcPr>
+          <w:p>
+            <w:pPr>
+              <w:spacing w:after="0" w:before="0"/>
+            </w:pPr>
+            <w:r>
+              <w:rPr>
+                <w:rFonts w:ascii="Arial" w:cs="Arial" w:eastAsia="Arial" w:hAnsi="Arial"/>
+                <w:color w:val="15202B"/>
+                <w:sz w:val="18"/>
+                <w:szCs w:val="18"/>
+              </w:rPr>
+              <w:t xml:space="preserve">☐ Pass</w:t>
+            </w:r>
+          </w:p>
+          <w:p>
+            <w:pPr>
+              <w:spacing w:after="0" w:before="0"/>
+            </w:pPr>
+            <w:r>
+              <w:rPr>
+                <w:rFonts w:ascii="Arial" w:cs="Arial" w:eastAsia="Arial" w:hAnsi="Arial"/>
+                <w:color w:val="15202B"/>
+                <w:sz w:val="18"/>
+                <w:szCs w:val="18"/>
+              </w:rPr>
+              <w:t xml:space="preserve">☐ Fail</w:t>
+            </w:r>
+          </w:p>
+        </w:tc>
+        <w:tc>
+          <w:tcPr>
+            <w:tcW w:type="dxa" w:w="1066"/>
+            <w:tcBorders>
+              <w:top w:val="single" w:color="B9D7F2" w:sz="4"/>
+              <w:left w:val="single" w:color="B9D7F2" w:sz="4"/>
+              <w:bottom w:val="single" w:color="B9D7F2" w:sz="4"/>
+              <w:right w:val="single" w:color="B9D7F2" w:sz="4"/>
+            </w:tcBorders>
             <w:tcMar>
               <w:top w:type="dxa" w:w="70"/>
               <w:left w:type="dxa" w:w="100"/>
@@ -10151,7 +10339,7 @@
                 <w:sz w:val="19"/>
                 <w:szCs w:val="19"/>
               </w:rPr>
-              <w:t xml:space="preserve">The PDF downloads or opens in the phone browser: logo, "Daily Sales Report", the numbers and the orders table.</w:t>
+              <w:t xml:space="preserve">The phone's Save screen opens with the name Mangao-Daily-Sales-&lt;date&gt;.pdf. Tap Save (Downloads). The app shows "File saved".</w:t>
             </w:r>
           </w:p>
         </w:tc>
@@ -10296,7 +10484,7 @@
                 <w:sz w:val="19"/>
                 <w:szCs w:val="19"/>
               </w:rPr>
-              <w:t xml:space="preserve">Open an order the Rider marked "Not delivered" (Orders &gt; Filter &gt; Not delivered) &gt; Re-deliver &gt; Confirm.</w:t>
+              <w:t xml:space="preserve">Open the Files app &gt; Downloads and tap the PDF.</w:t>
             </w:r>
           </w:p>
         </w:tc>
@@ -10328,7 +10516,7 @@
                 <w:sz w:val="19"/>
                 <w:szCs w:val="19"/>
               </w:rPr>
-              <w:t xml:space="preserve">"Back to Processing."; it goes back to the Processing tab with a new delivery time.</w:t>
+              <w:t xml:space="preserve">It opens: logo, "Daily Sales Report", the numbers and the orders table.</w:t>
             </w:r>
           </w:p>
         </w:tc>
@@ -10473,7 +10661,7 @@
                 <w:sz w:val="19"/>
                 <w:szCs w:val="19"/>
               </w:rPr>
-              <w:t xml:space="preserve">More &gt; Staff &amp; Riders.</w:t>
+              <w:t xml:space="preserve">Back in the app: Spreadsheet &gt; Create file &gt; Save.</w:t>
             </w:r>
           </w:p>
         </w:tc>
@@ -10504,7 +10692,7 @@
                 <w:sz w:val="19"/>
                 <w:szCs w:val="19"/>
               </w:rPr>
-              <w:t xml:space="preserve">Owner, Joy Ramos (Staff) and Juan Dela Cruz (Rider), each Active.</w:t>
+              <w:t xml:space="preserve">A .xlsx file is saved in Downloads; it opens in Google Sheets or Excel.</w:t>
             </w:r>
           </w:p>
         </w:tc>
@@ -10649,7 +10837,7 @@
                 <w:sz w:val="19"/>
                 <w:szCs w:val="19"/>
               </w:rPr>
-              <w:t xml:space="preserve">More &gt; Prices &amp; Settings.</w:t>
+              <w:t xml:space="preserve">Open an order the Rider marked "Not delivered" (Orders &gt; Filter &gt; Not delivered) &gt; Re-deliver &gt; Confirm.</w:t>
             </w:r>
           </w:p>
         </w:tc>
@@ -10681,7 +10869,7 @@
                 <w:sz w:val="19"/>
                 <w:szCs w:val="19"/>
               </w:rPr>
-              <w:t xml:space="preserve">Prices ₱30.00 / ₱35.00 / ₱150.00, Tank limit 60, Low-stock levels, Station location "98 Riverside Street, Barangay Commonwealth, Quezon City". (Look only.)</w:t>
+              <w:t xml:space="preserve">"Back to Processing."; it goes back to the Processing tab with a new delivery time.</w:t>
             </w:r>
           </w:p>
         </w:tc>
@@ -10826,7 +11014,7 @@
                 <w:sz w:val="19"/>
                 <w:szCs w:val="19"/>
               </w:rPr>
-              <w:t xml:space="preserve">Home &gt; when the tank counter is 60 or more: "Water tank refilled" &gt; Confirm.</w:t>
+              <w:t xml:space="preserve">More &gt; Staff &amp; Riders.</w:t>
             </w:r>
           </w:p>
         </w:tc>
@@ -10857,7 +11045,7 @@
                 <w:sz w:val="19"/>
                 <w:szCs w:val="19"/>
               </w:rPr>
-              <w:t xml:space="preserve">"Counter = 0; alert cleared"; the card shows 0 / 60.</w:t>
+              <w:t xml:space="preserve">Owner, Joy Ramos (Staff) and Juan Dela Cruz (Rider), each Active.</w:t>
             </w:r>
           </w:p>
         </w:tc>
@@ -10971,6 +11159,359 @@
                 <w:szCs w:val="19"/>
               </w:rPr>
               <w:t xml:space="preserve">B24</w:t>
+            </w:r>
+          </w:p>
+        </w:tc>
+        <w:tc>
+          <w:tcPr>
+            <w:tcW w:type="dxa" w:w="3900"/>
+            <w:tcBorders>
+              <w:top w:val="single" w:color="B9D7F2" w:sz="4"/>
+              <w:left w:val="single" w:color="B9D7F2" w:sz="4"/>
+              <w:bottom w:val="single" w:color="B9D7F2" w:sz="4"/>
+              <w:right w:val="single" w:color="B9D7F2" w:sz="4"/>
+            </w:tcBorders>
+            <w:shd w:fill="EAF4FD" w:color="auto" w:val="clear"/>
+            <w:tcMar>
+              <w:top w:type="dxa" w:w="70"/>
+              <w:left w:type="dxa" w:w="100"/>
+              <w:bottom w:type="dxa" w:w="70"/>
+              <w:right w:type="dxa" w:w="100"/>
+            </w:tcMar>
+          </w:tcPr>
+          <w:p>
+            <w:pPr>
+              <w:spacing w:after="0" w:before="0"/>
+            </w:pPr>
+            <w:r>
+              <w:rPr>
+                <w:rFonts w:ascii="Arial" w:cs="Arial" w:eastAsia="Arial" w:hAnsi="Arial"/>
+                <w:color w:val="15202B"/>
+                <w:sz w:val="19"/>
+                <w:szCs w:val="19"/>
+              </w:rPr>
+              <w:t xml:space="preserve">More &gt; Prices &amp; Settings.</w:t>
+            </w:r>
+          </w:p>
+        </w:tc>
+        <w:tc>
+          <w:tcPr>
+            <w:tcW w:type="dxa" w:w="3900"/>
+            <w:tcBorders>
+              <w:top w:val="single" w:color="B9D7F2" w:sz="4"/>
+              <w:left w:val="single" w:color="B9D7F2" w:sz="4"/>
+              <w:bottom w:val="single" w:color="B9D7F2" w:sz="4"/>
+              <w:right w:val="single" w:color="B9D7F2" w:sz="4"/>
+            </w:tcBorders>
+            <w:shd w:fill="EAF4FD" w:color="auto" w:val="clear"/>
+            <w:tcMar>
+              <w:top w:type="dxa" w:w="70"/>
+              <w:left w:type="dxa" w:w="100"/>
+              <w:bottom w:type="dxa" w:w="70"/>
+              <w:right w:type="dxa" w:w="100"/>
+            </w:tcMar>
+          </w:tcPr>
+          <w:p>
+            <w:pPr>
+              <w:spacing w:after="0" w:before="0"/>
+            </w:pPr>
+            <w:r>
+              <w:rPr>
+                <w:rFonts w:ascii="Arial" w:cs="Arial" w:eastAsia="Arial" w:hAnsi="Arial"/>
+                <w:color w:val="15202B"/>
+                <w:sz w:val="19"/>
+                <w:szCs w:val="19"/>
+              </w:rPr>
+              <w:t xml:space="preserve">Prices ₱30.00 / ₱35.00 / ₱150.00, Tank limit 60, Low-stock levels, Station location "98 Riverside Street, Barangay Commonwealth, Quezon City". (Look only.)</w:t>
+            </w:r>
+          </w:p>
+        </w:tc>
+        <w:tc>
+          <w:tcPr>
+            <w:tcW w:type="dxa" w:w="900"/>
+            <w:tcBorders>
+              <w:top w:val="single" w:color="B9D7F2" w:sz="4"/>
+              <w:left w:val="single" w:color="B9D7F2" w:sz="4"/>
+              <w:bottom w:val="single" w:color="B9D7F2" w:sz="4"/>
+              <w:right w:val="single" w:color="B9D7F2" w:sz="4"/>
+            </w:tcBorders>
+            <w:shd w:fill="EAF4FD" w:color="auto" w:val="clear"/>
+            <w:tcMar>
+              <w:top w:type="dxa" w:w="70"/>
+              <w:left w:type="dxa" w:w="100"/>
+              <w:bottom w:type="dxa" w:w="70"/>
+              <w:right w:type="dxa" w:w="100"/>
+            </w:tcMar>
+          </w:tcPr>
+          <w:p>
+            <w:pPr>
+              <w:spacing w:after="0" w:before="0"/>
+            </w:pPr>
+            <w:r>
+              <w:rPr>
+                <w:rFonts w:ascii="Arial" w:cs="Arial" w:eastAsia="Arial" w:hAnsi="Arial"/>
+                <w:color w:val="15202B"/>
+                <w:sz w:val="18"/>
+                <w:szCs w:val="18"/>
+              </w:rPr>
+              <w:t xml:space="preserve">☐ Pass</w:t>
+            </w:r>
+          </w:p>
+          <w:p>
+            <w:pPr>
+              <w:spacing w:after="0" w:before="0"/>
+            </w:pPr>
+            <w:r>
+              <w:rPr>
+                <w:rFonts w:ascii="Arial" w:cs="Arial" w:eastAsia="Arial" w:hAnsi="Arial"/>
+                <w:color w:val="15202B"/>
+                <w:sz w:val="18"/>
+                <w:szCs w:val="18"/>
+              </w:rPr>
+              <w:t xml:space="preserve">☐ Fail</w:t>
+            </w:r>
+          </w:p>
+        </w:tc>
+        <w:tc>
+          <w:tcPr>
+            <w:tcW w:type="dxa" w:w="1066"/>
+            <w:tcBorders>
+              <w:top w:val="single" w:color="B9D7F2" w:sz="4"/>
+              <w:left w:val="single" w:color="B9D7F2" w:sz="4"/>
+              <w:bottom w:val="single" w:color="B9D7F2" w:sz="4"/>
+              <w:right w:val="single" w:color="B9D7F2" w:sz="4"/>
+            </w:tcBorders>
+            <w:shd w:fill="EAF4FD" w:color="auto" w:val="clear"/>
+            <w:tcMar>
+              <w:top w:type="dxa" w:w="70"/>
+              <w:left w:type="dxa" w:w="100"/>
+              <w:bottom w:type="dxa" w:w="70"/>
+              <w:right w:type="dxa" w:w="100"/>
+            </w:tcMar>
+          </w:tcPr>
+          <w:p>
+            <w:pPr>
+              <w:spacing w:after="0" w:before="0"/>
+            </w:pPr>
+            <w:r>
+              <w:rPr>
+                <w:rFonts w:ascii="Arial" w:cs="Arial" w:eastAsia="Arial" w:hAnsi="Arial"/>
+                <w:color w:val="15202B"/>
+                <w:sz w:val="19"/>
+                <w:szCs w:val="19"/>
+              </w:rPr>
+              <w:t xml:space="preserve"/>
+            </w:r>
+          </w:p>
+        </w:tc>
+      </w:tr>
+      <w:tr>
+        <w:trPr>
+          <w:cantSplit/>
+        </w:trPr>
+        <w:tc>
+          <w:tcPr>
+            <w:tcW w:type="dxa" w:w="700"/>
+            <w:tcBorders>
+              <w:top w:val="single" w:color="B9D7F2" w:sz="4"/>
+              <w:left w:val="single" w:color="B9D7F2" w:sz="4"/>
+              <w:bottom w:val="single" w:color="B9D7F2" w:sz="4"/>
+              <w:right w:val="single" w:color="B9D7F2" w:sz="4"/>
+            </w:tcBorders>
+            <w:tcMar>
+              <w:top w:type="dxa" w:w="70"/>
+              <w:left w:type="dxa" w:w="100"/>
+              <w:bottom w:type="dxa" w:w="70"/>
+              <w:right w:type="dxa" w:w="100"/>
+            </w:tcMar>
+          </w:tcPr>
+          <w:p>
+            <w:pPr>
+              <w:spacing w:after="0" w:before="0"/>
+            </w:pPr>
+            <w:r>
+              <w:rPr>
+                <w:rFonts w:ascii="Arial" w:cs="Arial" w:eastAsia="Arial" w:hAnsi="Arial"/>
+                <w:color w:val="15202B"/>
+                <w:sz w:val="19"/>
+                <w:szCs w:val="19"/>
+              </w:rPr>
+              <w:t xml:space="preserve">B25</w:t>
+            </w:r>
+          </w:p>
+        </w:tc>
+        <w:tc>
+          <w:tcPr>
+            <w:tcW w:type="dxa" w:w="3900"/>
+            <w:tcBorders>
+              <w:top w:val="single" w:color="B9D7F2" w:sz="4"/>
+              <w:left w:val="single" w:color="B9D7F2" w:sz="4"/>
+              <w:bottom w:val="single" w:color="B9D7F2" w:sz="4"/>
+              <w:right w:val="single" w:color="B9D7F2" w:sz="4"/>
+            </w:tcBorders>
+            <w:tcMar>
+              <w:top w:type="dxa" w:w="70"/>
+              <w:left w:type="dxa" w:w="100"/>
+              <w:bottom w:type="dxa" w:w="70"/>
+              <w:right w:type="dxa" w:w="100"/>
+            </w:tcMar>
+          </w:tcPr>
+          <w:p>
+            <w:pPr>
+              <w:spacing w:after="0" w:before="0"/>
+            </w:pPr>
+            <w:r>
+              <w:rPr>
+                <w:rFonts w:ascii="Arial" w:cs="Arial" w:eastAsia="Arial" w:hAnsi="Arial"/>
+                <w:color w:val="15202B"/>
+                <w:sz w:val="19"/>
+                <w:szCs w:val="19"/>
+              </w:rPr>
+              <w:t xml:space="preserve">Home &gt; when the tank counter is 60 or more: "Water tank refilled" &gt; Confirm.</w:t>
+            </w:r>
+          </w:p>
+        </w:tc>
+        <w:tc>
+          <w:tcPr>
+            <w:tcW w:type="dxa" w:w="3900"/>
+            <w:tcBorders>
+              <w:top w:val="single" w:color="B9D7F2" w:sz="4"/>
+              <w:left w:val="single" w:color="B9D7F2" w:sz="4"/>
+              <w:bottom w:val="single" w:color="B9D7F2" w:sz="4"/>
+              <w:right w:val="single" w:color="B9D7F2" w:sz="4"/>
+            </w:tcBorders>
+            <w:tcMar>
+              <w:top w:type="dxa" w:w="70"/>
+              <w:left w:type="dxa" w:w="100"/>
+              <w:bottom w:type="dxa" w:w="70"/>
+              <w:right w:type="dxa" w:w="100"/>
+            </w:tcMar>
+          </w:tcPr>
+          <w:p>
+            <w:pPr>
+              <w:spacing w:after="0" w:before="0"/>
+            </w:pPr>
+            <w:r>
+              <w:rPr>
+                <w:rFonts w:ascii="Arial" w:cs="Arial" w:eastAsia="Arial" w:hAnsi="Arial"/>
+                <w:color w:val="15202B"/>
+                <w:sz w:val="19"/>
+                <w:szCs w:val="19"/>
+              </w:rPr>
+              <w:t xml:space="preserve">"Counter = 0; alert cleared"; the card shows 0 / 60.</w:t>
+            </w:r>
+          </w:p>
+        </w:tc>
+        <w:tc>
+          <w:tcPr>
+            <w:tcW w:type="dxa" w:w="900"/>
+            <w:tcBorders>
+              <w:top w:val="single" w:color="B9D7F2" w:sz="4"/>
+              <w:left w:val="single" w:color="B9D7F2" w:sz="4"/>
+              <w:bottom w:val="single" w:color="B9D7F2" w:sz="4"/>
+              <w:right w:val="single" w:color="B9D7F2" w:sz="4"/>
+            </w:tcBorders>
+            <w:tcMar>
+              <w:top w:type="dxa" w:w="70"/>
+              <w:left w:type="dxa" w:w="100"/>
+              <w:bottom w:type="dxa" w:w="70"/>
+              <w:right w:type="dxa" w:w="100"/>
+            </w:tcMar>
+          </w:tcPr>
+          <w:p>
+            <w:pPr>
+              <w:spacing w:after="0" w:before="0"/>
+            </w:pPr>
+            <w:r>
+              <w:rPr>
+                <w:rFonts w:ascii="Arial" w:cs="Arial" w:eastAsia="Arial" w:hAnsi="Arial"/>
+                <w:color w:val="15202B"/>
+                <w:sz w:val="18"/>
+                <w:szCs w:val="18"/>
+              </w:rPr>
+              <w:t xml:space="preserve">☐ Pass</w:t>
+            </w:r>
+          </w:p>
+          <w:p>
+            <w:pPr>
+              <w:spacing w:after="0" w:before="0"/>
+            </w:pPr>
+            <w:r>
+              <w:rPr>
+                <w:rFonts w:ascii="Arial" w:cs="Arial" w:eastAsia="Arial" w:hAnsi="Arial"/>
+                <w:color w:val="15202B"/>
+                <w:sz w:val="18"/>
+                <w:szCs w:val="18"/>
+              </w:rPr>
+              <w:t xml:space="preserve">☐ Fail</w:t>
+            </w:r>
+          </w:p>
+        </w:tc>
+        <w:tc>
+          <w:tcPr>
+            <w:tcW w:type="dxa" w:w="1066"/>
+            <w:tcBorders>
+              <w:top w:val="single" w:color="B9D7F2" w:sz="4"/>
+              <w:left w:val="single" w:color="B9D7F2" w:sz="4"/>
+              <w:bottom w:val="single" w:color="B9D7F2" w:sz="4"/>
+              <w:right w:val="single" w:color="B9D7F2" w:sz="4"/>
+            </w:tcBorders>
+            <w:tcMar>
+              <w:top w:type="dxa" w:w="70"/>
+              <w:left w:type="dxa" w:w="100"/>
+              <w:bottom w:type="dxa" w:w="70"/>
+              <w:right w:type="dxa" w:w="100"/>
+            </w:tcMar>
+          </w:tcPr>
+          <w:p>
+            <w:pPr>
+              <w:spacing w:after="0" w:before="0"/>
+            </w:pPr>
+            <w:r>
+              <w:rPr>
+                <w:rFonts w:ascii="Arial" w:cs="Arial" w:eastAsia="Arial" w:hAnsi="Arial"/>
+                <w:color w:val="15202B"/>
+                <w:sz w:val="19"/>
+                <w:szCs w:val="19"/>
+              </w:rPr>
+              <w:t xml:space="preserve"/>
+            </w:r>
+          </w:p>
+        </w:tc>
+      </w:tr>
+      <w:tr>
+        <w:trPr>
+          <w:cantSplit/>
+        </w:trPr>
+        <w:tc>
+          <w:tcPr>
+            <w:tcW w:type="dxa" w:w="700"/>
+            <w:tcBorders>
+              <w:top w:val="single" w:color="B9D7F2" w:sz="4"/>
+              <w:left w:val="single" w:color="B9D7F2" w:sz="4"/>
+              <w:bottom w:val="single" w:color="B9D7F2" w:sz="4"/>
+              <w:right w:val="single" w:color="B9D7F2" w:sz="4"/>
+            </w:tcBorders>
+            <w:shd w:fill="EAF4FD" w:color="auto" w:val="clear"/>
+            <w:tcMar>
+              <w:top w:type="dxa" w:w="70"/>
+              <w:left w:type="dxa" w:w="100"/>
+              <w:bottom w:type="dxa" w:w="70"/>
+              <w:right w:type="dxa" w:w="100"/>
+            </w:tcMar>
+          </w:tcPr>
+          <w:p>
+            <w:pPr>
+              <w:spacing w:after="0" w:before="0"/>
+            </w:pPr>
+            <w:r>
+              <w:rPr>
+                <w:rFonts w:ascii="Arial" w:cs="Arial" w:eastAsia="Arial" w:hAnsi="Arial"/>
+                <w:color w:val="15202B"/>
+                <w:sz w:val="19"/>
+                <w:szCs w:val="19"/>
+              </w:rPr>
+              <w:t xml:space="preserve">B26</w:t>
             </w:r>
           </w:p>
         </w:tc>

</xml_diff>

<commit_message>
Web export works on iPhone Safari: download in the same tab, Download button in the File ready box
Safari on iPhone blocks a new window opened after waiting for the server, so the file never came.
The web version now downloads in the same tab (the page stays, the server sends it as a download),
and the File ready box has a Download button; an old link (over 4 minutes) makes a new file first.

Co-Authored-By: Claude Opus 5.5 <noreply@anthropic.com>
Claude-Session: https://claude.ai/code/session_01FGCEzsecdEGjCSsNcfM7Ef
</commit_message>
<xml_diff>
--- a/docs/testing/Mangao-Team-Testing-Guide.docx
+++ b/docs/testing/Mangao-Team-Testing-Guide.docx
@@ -62,7 +62,7 @@
         </w:rPr>
         <w:t xml:space="preserve">1. On your Android phone, open this link in Chrome: </w:t>
       </w:r>
-      <w:hyperlink w:history="1" r:id="rId7-3rchahnw3arzlg6rqnj">
+      <w:hyperlink w:history="1" r:id="rIdlnpbu55ebcavba90sn0kx">
         <w:r>
           <w:rPr>
             <w:rFonts w:ascii="Arial" w:cs="Arial" w:eastAsia="Arial" w:hAnsi="Arial"/>
@@ -1451,7 +1451,7 @@
           <w:sz w:val="20"/>
           <w:szCs w:val="20"/>
         </w:rPr>
-        <w:t xml:space="preserve">5 parts, 79 checks. With 4 testers, each takes one role (Parts A to D). Suggested order: everyone logs in first, do Part E together (it needs all four phones), then continue your own part. With fewer testers, one person can do two roles on two phones, or log out and log in as the other role.</w:t>
+        <w:t xml:space="preserve">5 parts, 80 checks. With 4 testers, each takes one role (Parts A to D). Suggested order: everyone logs in first, do Part E together (it needs all four phones), then continue your own part. With fewer testers, one person can do two roles on two phones, or log out and log in as the other role.</w:t>
       </w:r>
     </w:p>
     <w:tbl>
@@ -1937,7 +1937,7 @@
                 <w:sz w:val="19"/>
                 <w:szCs w:val="19"/>
               </w:rPr>
-              <w:t xml:space="preserve">26</w:t>
+              <w:t xml:space="preserve">27</w:t>
             </w:r>
           </w:p>
         </w:tc>
@@ -10837,7 +10837,7 @@
                 <w:sz w:val="19"/>
                 <w:szCs w:val="19"/>
               </w:rPr>
-              <w:t xml:space="preserve">Open an order the Rider marked "Not delivered" (Orders &gt; Filter &gt; Not delivered) &gt; Re-deliver &gt; Confirm.</w:t>
+              <w:t xml:space="preserve">iPhone (web version in Safari): Sales &gt; Daily &gt; Export &gt; PDF &gt; Create file.</w:t>
             </w:r>
           </w:p>
         </w:tc>
@@ -10869,7 +10869,7 @@
                 <w:sz w:val="19"/>
                 <w:szCs w:val="19"/>
               </w:rPr>
-              <w:t xml:space="preserve">"Back to Processing."; it goes back to the Processing tab with a new delivery time.</w:t>
+              <w:t xml:space="preserve">Safari asks to download the file (if not, tap the Download button in the "File ready" box). Tap Download; open it from the Files app &gt; Downloads.</w:t>
             </w:r>
           </w:p>
         </w:tc>
@@ -11014,7 +11014,7 @@
                 <w:sz w:val="19"/>
                 <w:szCs w:val="19"/>
               </w:rPr>
-              <w:t xml:space="preserve">More &gt; Staff &amp; Riders.</w:t>
+              <w:t xml:space="preserve">Open an order the Rider marked "Not delivered" (Orders &gt; Filter &gt; Not delivered) &gt; Re-deliver &gt; Confirm.</w:t>
             </w:r>
           </w:p>
         </w:tc>
@@ -11045,7 +11045,7 @@
                 <w:sz w:val="19"/>
                 <w:szCs w:val="19"/>
               </w:rPr>
-              <w:t xml:space="preserve">Owner, Joy Ramos (Staff) and Juan Dela Cruz (Rider), each Active.</w:t>
+              <w:t xml:space="preserve">"Back to Processing."; it goes back to the Processing tab with a new delivery time.</w:t>
             </w:r>
           </w:p>
         </w:tc>
@@ -11190,7 +11190,7 @@
                 <w:sz w:val="19"/>
                 <w:szCs w:val="19"/>
               </w:rPr>
-              <w:t xml:space="preserve">More &gt; Prices &amp; Settings.</w:t>
+              <w:t xml:space="preserve">More &gt; Staff &amp; Riders.</w:t>
             </w:r>
           </w:p>
         </w:tc>
@@ -11222,7 +11222,7 @@
                 <w:sz w:val="19"/>
                 <w:szCs w:val="19"/>
               </w:rPr>
-              <w:t xml:space="preserve">Prices ₱30.00 / ₱35.00 / ₱150.00, Tank limit 60, Low-stock levels, Station location "98 Riverside Street, Barangay Commonwealth, Quezon City". (Look only.)</w:t>
+              <w:t xml:space="preserve">Owner, Joy Ramos (Staff) and Juan Dela Cruz (Rider), each Active.</w:t>
             </w:r>
           </w:p>
         </w:tc>
@@ -11367,7 +11367,7 @@
                 <w:sz w:val="19"/>
                 <w:szCs w:val="19"/>
               </w:rPr>
-              <w:t xml:space="preserve">Home &gt; when the tank counter is 60 or more: "Water tank refilled" &gt; Confirm.</w:t>
+              <w:t xml:space="preserve">More &gt; Prices &amp; Settings.</w:t>
             </w:r>
           </w:p>
         </w:tc>
@@ -11398,7 +11398,7 @@
                 <w:sz w:val="19"/>
                 <w:szCs w:val="19"/>
               </w:rPr>
-              <w:t xml:space="preserve">"Counter = 0; alert cleared"; the card shows 0 / 60.</w:t>
+              <w:t xml:space="preserve">Prices ₱30.00 / ₱35.00 / ₱150.00, Tank limit 60, Low-stock levels, Station location "98 Riverside Street, Barangay Commonwealth, Quezon City". (Look only.)</w:t>
             </w:r>
           </w:p>
         </w:tc>
@@ -11543,7 +11543,7 @@
                 <w:sz w:val="19"/>
                 <w:szCs w:val="19"/>
               </w:rPr>
-              <w:t xml:space="preserve">Tap the "Admin" button in the top bar &gt; Staff &gt; Open view. Then switch back to Admin.</w:t>
+              <w:t xml:space="preserve">Home &gt; when the tank counter is 60 or more: "Water tank refilled" &gt; Confirm.</w:t>
             </w:r>
           </w:p>
         </w:tc>
@@ -11575,7 +11575,7 @@
                 <w:sz w:val="19"/>
                 <w:szCs w:val="19"/>
               </w:rPr>
-              <w:t xml:space="preserve">The staff screens show (To Do, Live Map, Done Today, My Account); switching back shows the owner screens.</w:t>
+              <w:t xml:space="preserve">"Counter = 0; alert cleared"; the card shows 0 / 60.</w:t>
             </w:r>
           </w:p>
         </w:tc>
@@ -11635,6 +11635,180 @@
               <w:right w:val="single" w:color="B9D7F2" w:sz="4"/>
             </w:tcBorders>
             <w:shd w:fill="EAF4FD" w:color="auto" w:val="clear"/>
+            <w:tcMar>
+              <w:top w:type="dxa" w:w="70"/>
+              <w:left w:type="dxa" w:w="100"/>
+              <w:bottom w:type="dxa" w:w="70"/>
+              <w:right w:type="dxa" w:w="100"/>
+            </w:tcMar>
+          </w:tcPr>
+          <w:p>
+            <w:pPr>
+              <w:spacing w:after="0" w:before="0"/>
+            </w:pPr>
+            <w:r>
+              <w:rPr>
+                <w:rFonts w:ascii="Arial" w:cs="Arial" w:eastAsia="Arial" w:hAnsi="Arial"/>
+                <w:color w:val="15202B"/>
+                <w:sz w:val="19"/>
+                <w:szCs w:val="19"/>
+              </w:rPr>
+              <w:t xml:space="preserve"/>
+            </w:r>
+          </w:p>
+        </w:tc>
+      </w:tr>
+      <w:tr>
+        <w:trPr>
+          <w:cantSplit/>
+        </w:trPr>
+        <w:tc>
+          <w:tcPr>
+            <w:tcW w:type="dxa" w:w="700"/>
+            <w:tcBorders>
+              <w:top w:val="single" w:color="B9D7F2" w:sz="4"/>
+              <w:left w:val="single" w:color="B9D7F2" w:sz="4"/>
+              <w:bottom w:val="single" w:color="B9D7F2" w:sz="4"/>
+              <w:right w:val="single" w:color="B9D7F2" w:sz="4"/>
+            </w:tcBorders>
+            <w:tcMar>
+              <w:top w:type="dxa" w:w="70"/>
+              <w:left w:type="dxa" w:w="100"/>
+              <w:bottom w:type="dxa" w:w="70"/>
+              <w:right w:type="dxa" w:w="100"/>
+            </w:tcMar>
+          </w:tcPr>
+          <w:p>
+            <w:pPr>
+              <w:spacing w:after="0" w:before="0"/>
+            </w:pPr>
+            <w:r>
+              <w:rPr>
+                <w:rFonts w:ascii="Arial" w:cs="Arial" w:eastAsia="Arial" w:hAnsi="Arial"/>
+                <w:color w:val="15202B"/>
+                <w:sz w:val="19"/>
+                <w:szCs w:val="19"/>
+              </w:rPr>
+              <w:t xml:space="preserve">B27</w:t>
+            </w:r>
+          </w:p>
+        </w:tc>
+        <w:tc>
+          <w:tcPr>
+            <w:tcW w:type="dxa" w:w="3900"/>
+            <w:tcBorders>
+              <w:top w:val="single" w:color="B9D7F2" w:sz="4"/>
+              <w:left w:val="single" w:color="B9D7F2" w:sz="4"/>
+              <w:bottom w:val="single" w:color="B9D7F2" w:sz="4"/>
+              <w:right w:val="single" w:color="B9D7F2" w:sz="4"/>
+            </w:tcBorders>
+            <w:tcMar>
+              <w:top w:type="dxa" w:w="70"/>
+              <w:left w:type="dxa" w:w="100"/>
+              <w:bottom w:type="dxa" w:w="70"/>
+              <w:right w:type="dxa" w:w="100"/>
+            </w:tcMar>
+          </w:tcPr>
+          <w:p>
+            <w:pPr>
+              <w:spacing w:after="0" w:before="0"/>
+            </w:pPr>
+            <w:r>
+              <w:rPr>
+                <w:rFonts w:ascii="Arial" w:cs="Arial" w:eastAsia="Arial" w:hAnsi="Arial"/>
+                <w:color w:val="15202B"/>
+                <w:sz w:val="19"/>
+                <w:szCs w:val="19"/>
+              </w:rPr>
+              <w:t xml:space="preserve">Tap the "Admin" button in the top bar &gt; Staff &gt; Open view. Then switch back to Admin.</w:t>
+            </w:r>
+          </w:p>
+        </w:tc>
+        <w:tc>
+          <w:tcPr>
+            <w:tcW w:type="dxa" w:w="3900"/>
+            <w:tcBorders>
+              <w:top w:val="single" w:color="B9D7F2" w:sz="4"/>
+              <w:left w:val="single" w:color="B9D7F2" w:sz="4"/>
+              <w:bottom w:val="single" w:color="B9D7F2" w:sz="4"/>
+              <w:right w:val="single" w:color="B9D7F2" w:sz="4"/>
+            </w:tcBorders>
+            <w:tcMar>
+              <w:top w:type="dxa" w:w="70"/>
+              <w:left w:type="dxa" w:w="100"/>
+              <w:bottom w:type="dxa" w:w="70"/>
+              <w:right w:type="dxa" w:w="100"/>
+            </w:tcMar>
+          </w:tcPr>
+          <w:p>
+            <w:pPr>
+              <w:spacing w:after="0" w:before="0"/>
+            </w:pPr>
+            <w:r>
+              <w:rPr>
+                <w:rFonts w:ascii="Arial" w:cs="Arial" w:eastAsia="Arial" w:hAnsi="Arial"/>
+                <w:color w:val="15202B"/>
+                <w:sz w:val="19"/>
+                <w:szCs w:val="19"/>
+              </w:rPr>
+              <w:t xml:space="preserve">The staff screens show (To Do, Live Map, Done Today, My Account); switching back shows the owner screens.</w:t>
+            </w:r>
+          </w:p>
+        </w:tc>
+        <w:tc>
+          <w:tcPr>
+            <w:tcW w:type="dxa" w:w="900"/>
+            <w:tcBorders>
+              <w:top w:val="single" w:color="B9D7F2" w:sz="4"/>
+              <w:left w:val="single" w:color="B9D7F2" w:sz="4"/>
+              <w:bottom w:val="single" w:color="B9D7F2" w:sz="4"/>
+              <w:right w:val="single" w:color="B9D7F2" w:sz="4"/>
+            </w:tcBorders>
+            <w:tcMar>
+              <w:top w:type="dxa" w:w="70"/>
+              <w:left w:type="dxa" w:w="100"/>
+              <w:bottom w:type="dxa" w:w="70"/>
+              <w:right w:type="dxa" w:w="100"/>
+            </w:tcMar>
+          </w:tcPr>
+          <w:p>
+            <w:pPr>
+              <w:spacing w:after="0" w:before="0"/>
+            </w:pPr>
+            <w:r>
+              <w:rPr>
+                <w:rFonts w:ascii="Arial" w:cs="Arial" w:eastAsia="Arial" w:hAnsi="Arial"/>
+                <w:color w:val="15202B"/>
+                <w:sz w:val="18"/>
+                <w:szCs w:val="18"/>
+              </w:rPr>
+              <w:t xml:space="preserve">☐ Pass</w:t>
+            </w:r>
+          </w:p>
+          <w:p>
+            <w:pPr>
+              <w:spacing w:after="0" w:before="0"/>
+            </w:pPr>
+            <w:r>
+              <w:rPr>
+                <w:rFonts w:ascii="Arial" w:cs="Arial" w:eastAsia="Arial" w:hAnsi="Arial"/>
+                <w:color w:val="15202B"/>
+                <w:sz w:val="18"/>
+                <w:szCs w:val="18"/>
+              </w:rPr>
+              <w:t xml:space="preserve">☐ Fail</w:t>
+            </w:r>
+          </w:p>
+        </w:tc>
+        <w:tc>
+          <w:tcPr>
+            <w:tcW w:type="dxa" w:w="1066"/>
+            <w:tcBorders>
+              <w:top w:val="single" w:color="B9D7F2" w:sz="4"/>
+              <w:left w:val="single" w:color="B9D7F2" w:sz="4"/>
+              <w:bottom w:val="single" w:color="B9D7F2" w:sz="4"/>
+              <w:right w:val="single" w:color="B9D7F2" w:sz="4"/>
+            </w:tcBorders>
             <w:tcMar>
               <w:top w:type="dxa" w:w="70"/>
               <w:left w:type="dxa" w:w="100"/>

</xml_diff>

<commit_message>
Live map like Grab: sidecar marker that glides and turns, route along the streets, minutes and km left
- widgets/delivery_map.dart: original sidecar drawing (CustomPainter), gliding marker
  (TweenAnimationBuilder), heading from GPS movement, route from the OSRM route service
  (OpenStreetMap roads) with a dashed straight line when it does not answer, travelled part cut off
- Customer order tracking: house at the address, sidecar, route, 'About 6 min away · 1.8 km'
- Owner/staff Live Map: every rider as a sidecar with the route to the nearest stop and 'To 1 · 6 min';
  rider card shows the next stop with minutes and km
- Testing checklists updated

Co-Authored-By: Claude Opus 5.5 <noreply@anthropic.com>
Claude-Session: https://claude.ai/code/session_01FGCEzsecdEGjCSsNcfM7Ef
</commit_message>
<xml_diff>
--- a/docs/testing/Mangao-Team-Testing-Guide.docx
+++ b/docs/testing/Mangao-Team-Testing-Guide.docx
@@ -62,7 +62,7 @@
         </w:rPr>
         <w:t xml:space="preserve">1. On your Android phone, open this link in Chrome: </w:t>
       </w:r>
-      <w:hyperlink w:history="1" r:id="rIdlnpbu55ebcavba90sn0kx">
+      <w:hyperlink w:history="1" r:id="rIdyfqguto_pqaw_vkkoc8i5">
         <w:r>
           <w:rPr>
             <w:rFonts w:ascii="Arial" w:cs="Arial" w:eastAsia="Arial" w:hAnsi="Arial"/>
@@ -9104,7 +9104,7 @@
                 <w:sz w:val="19"/>
                 <w:szCs w:val="19"/>
               </w:rPr>
-              <w:t xml:space="preserve">Map with the station, a blue rider marker and numbered pins for the orders on the road. Tap the rider: name, orders, Call.</w:t>
+              <w:t xml:space="preserve">Map with the station, numbered pins for the orders on the road, and the rider as a blue sidecar (motorcycle with a sidecar and a water gallon) with a blue route line to the nearest pin and a label like "To 1 · 6 min". Tap the sidecar: name, "Next stop" with the minutes and km, orders, Call.</w:t>
             </w:r>
           </w:p>
         </w:tc>
@@ -13954,7 +13954,7 @@
                 <w:sz w:val="19"/>
                 <w:szCs w:val="19"/>
               </w:rPr>
-              <w:t xml:space="preserve">Same map as the owner: station, rider marker and order pins.</w:t>
+              <w:t xml:space="preserve">Same map as the owner: station, the rider's sidecar with the route line, and order pins.</w:t>
             </w:r>
           </w:p>
         </w:tc>
@@ -17503,7 +17503,7 @@
                 <w:sz w:val="19"/>
                 <w:szCs w:val="19"/>
               </w:rPr>
-              <w:t xml:space="preserve">Owner: the rider marker is where the Rider phone is. Customer: a map with the delivery pin and the rider's blue dot.</w:t>
+              <w:t xml:space="preserve">Owner: the sidecar is where the Rider phone is. Customer: above the map "About n min away · n km"; on the map a house at the delivery address, the sidecar, and a blue line along the streets between them.</w:t>
             </w:r>
           </w:p>
         </w:tc>

</xml_diff>

<commit_message>
Testing checklists: start at the station, travelled line, demo ride; session expiry checks removed
Co-Authored-By: Claude Opus 5.5 <noreply@anthropic.com>
Claude-Session: https://claude.ai/code/session_01FGCEzsecdEGjCSsNcfM7Ef
</commit_message>
<xml_diff>
--- a/docs/testing/Mangao-Team-Testing-Guide.docx
+++ b/docs/testing/Mangao-Team-Testing-Guide.docx
@@ -62,7 +62,7 @@
         </w:rPr>
         <w:t xml:space="preserve">1. On your Android phone, open this link in Chrome: </w:t>
       </w:r>
-      <w:hyperlink w:history="1" r:id="rIdyfqguto_pqaw_vkkoc8i5">
+      <w:hyperlink w:history="1" r:id="rIddsupujccv3eazomafnmyj">
         <w:r>
           <w:rPr>
             <w:rFonts w:ascii="Arial" w:cs="Arial" w:eastAsia="Arial" w:hAnsi="Arial"/>
@@ -170,7 +170,7 @@
           <w:sz w:val="20"/>
           <w:szCs w:val="20"/>
         </w:rPr>
-        <w:t xml:space="preserve">For safety the app logs you out after 2 minutes without touching it (or when you leave it for 2 minutes). If that happens during a test, just log in again and continue.</w:t>
+        <w:t xml:space="preserve">Testing indoors? The owner can turn on More &gt; Prices &amp; Settings &gt; Demo ride: the sidecar then drives from the station to the customer by itself. Turn it off afterwards.</w:t>
       </w:r>
     </w:p>
     <w:p>
@@ -1451,7 +1451,7 @@
           <w:sz w:val="20"/>
           <w:szCs w:val="20"/>
         </w:rPr>
-        <w:t xml:space="preserve">5 parts, 80 checks. With 4 testers, each takes one role (Parts A to D). Suggested order: everyone logs in first, do Part E together (it needs all four phones), then continue your own part. With fewer testers, one person can do two roles on two phones, or log out and log in as the other role.</w:t>
+        <w:t xml:space="preserve">5 parts, 79 checks. With 4 testers, each takes one role (Parts A to D). Suggested order: everyone logs in first, do Part E together (it needs all four phones), then continue your own part. With fewer testers, one person can do two roles on two phones, or log out and log in as the other role.</w:t>
       </w:r>
     </w:p>
     <w:tbl>
@@ -1773,7 +1773,7 @@
                 <w:sz w:val="19"/>
                 <w:szCs w:val="19"/>
               </w:rPr>
-              <w:t xml:space="preserve">23</w:t>
+              <w:t xml:space="preserve">22</w:t>
             </w:r>
           </w:p>
         </w:tc>
@@ -3491,7 +3491,7 @@
                 <w:sz w:val="19"/>
                 <w:szCs w:val="19"/>
               </w:rPr>
-              <w:t xml:space="preserve">Go to another app (or lock the phone) for more than 2 minutes, then come back to Mangao WRS.</w:t>
+              <w:t xml:space="preserve">Tap Order Now.</w:t>
             </w:r>
           </w:p>
         </w:tc>
@@ -3522,7 +3522,7 @@
                 <w:sz w:val="19"/>
                 <w:szCs w:val="19"/>
               </w:rPr>
-              <w:t xml:space="preserve">The Log in page opens with the blue note "Session expired. You were away for 2 minutes, so you were logged out. Log in again." Log in again to continue. (This also happens if you leave the app untouched for 2 minutes.)</w:t>
+              <w:t xml:space="preserve">Order Form: "Refill my gallons" chosen, Gallons 1, Total ₱35.00, your phone already filled in, Payment "Cash on delivery (COD)".</w:t>
             </w:r>
           </w:p>
         </w:tc>
@@ -3667,7 +3667,7 @@
                 <w:sz w:val="19"/>
                 <w:szCs w:val="19"/>
               </w:rPr>
-              <w:t xml:space="preserve">Tap Order Now.</w:t>
+              <w:t xml:space="preserve">Tap + two times. Then tap "Buy a package", then "Refill my gallons" again.</w:t>
             </w:r>
           </w:p>
         </w:tc>
@@ -3699,7 +3699,7 @@
                 <w:sz w:val="19"/>
                 <w:szCs w:val="19"/>
               </w:rPr>
-              <w:t xml:space="preserve">Order Form: "Refill my gallons" chosen, Gallons 1, Total ₱35.00, your phone already filled in, Payment "Cash on delivery (COD)".</w:t>
+              <w:t xml:space="preserve">Refill: 3 gallons, ₱105.00. Package: ₱450.00. Back to Refill: ₱105.00.</w:t>
             </w:r>
           </w:p>
         </w:tc>
@@ -3844,7 +3844,7 @@
                 <w:sz w:val="19"/>
                 <w:szCs w:val="19"/>
               </w:rPr>
-              <w:t xml:space="preserve">Tap + two times. Then tap "Buy a package", then "Refill my gallons" again.</w:t>
+              <w:t xml:space="preserve">Tap Delivery address &gt; Pin on map &gt; "Use my location". Allow location when the phone asks.</w:t>
             </w:r>
           </w:p>
         </w:tc>
@@ -3875,7 +3875,7 @@
                 <w:sz w:val="19"/>
                 <w:szCs w:val="19"/>
               </w:rPr>
-              <w:t xml:space="preserve">Refill: 3 gallons, ₱105.00. Package: ₱450.00. Back to Refill: ₱105.00.</w:t>
+              <w:t xml:space="preserve">The map moves to where you are and shows "Pinned: near &lt;street&gt;, &lt;barangay&gt;". Tap "Use this address".</w:t>
             </w:r>
           </w:p>
         </w:tc>
@@ -4020,7 +4020,7 @@
                 <w:sz w:val="19"/>
                 <w:szCs w:val="19"/>
               </w:rPr>
-              <w:t xml:space="preserve">Tap Delivery address &gt; Pin on map &gt; "Use my location". Allow location when the phone asks.</w:t>
+              <w:t xml:space="preserve">Tap Place order.</w:t>
             </w:r>
           </w:p>
         </w:tc>
@@ -4052,7 +4052,7 @@
                 <w:sz w:val="19"/>
                 <w:szCs w:val="19"/>
               </w:rPr>
-              <w:t xml:space="preserve">The map moves to where you are and shows "Pinned: near &lt;street&gt;, &lt;barangay&gt;". Tap "Use this address".</w:t>
+              <w:t xml:space="preserve">Popup "Confirm order?" with the gallons, address, payment and total.</w:t>
             </w:r>
           </w:p>
         </w:tc>
@@ -4197,7 +4197,7 @@
                 <w:sz w:val="19"/>
                 <w:szCs w:val="19"/>
               </w:rPr>
-              <w:t xml:space="preserve">Tap Place order.</w:t>
+              <w:t xml:space="preserve">Tap Confirm.</w:t>
             </w:r>
           </w:p>
         </w:tc>
@@ -4228,7 +4228,7 @@
                 <w:sz w:val="19"/>
                 <w:szCs w:val="19"/>
               </w:rPr>
-              <w:t xml:space="preserve">Popup "Confirm order?" with the gallons, address, payment and total.</w:t>
+              <w:t xml:space="preserve">"Thank you for your order!" message. OK goes back to Home with a card "Waiting to be accepted". Tell the Owner tester your order is in.</w:t>
             </w:r>
           </w:p>
         </w:tc>
@@ -4373,7 +4373,7 @@
                 <w:sz w:val="19"/>
                 <w:szCs w:val="19"/>
               </w:rPr>
-              <w:t xml:space="preserve">Tap Confirm.</w:t>
+              <w:t xml:space="preserve">Wait on Home while the Owner accepts your order. Do not touch the screen.</w:t>
             </w:r>
           </w:p>
         </w:tc>
@@ -4405,7 +4405,7 @@
                 <w:sz w:val="19"/>
                 <w:szCs w:val="19"/>
               </w:rPr>
-              <w:t xml:space="preserve">"Thank you for your order!" message. OK goes back to Home with a card "Waiting to be accepted". Tell the Owner tester your order is in.</w:t>
+              <w:t xml:space="preserve">Within a few seconds the card changes to "Processing" with "Estimated delivery: by &lt;time&gt;", and a banner "Order accepted" shows.</w:t>
             </w:r>
           </w:p>
         </w:tc>
@@ -4550,7 +4550,7 @@
                 <w:sz w:val="19"/>
                 <w:szCs w:val="19"/>
               </w:rPr>
-              <w:t xml:space="preserve">Wait on Home while the Owner accepts your order. Do not touch the screen.</w:t>
+              <w:t xml:space="preserve">Tap the card.</w:t>
             </w:r>
           </w:p>
         </w:tc>
@@ -4581,7 +4581,7 @@
                 <w:sz w:val="19"/>
                 <w:szCs w:val="19"/>
               </w:rPr>
-              <w:t xml:space="preserve">Within a few seconds the card changes to "Processing" with "Estimated delivery: by &lt;time&gt;", and a banner "Order accepted" shows.</w:t>
+              <w:t xml:space="preserve">Order Details with 5 steps (Order accepted checked, Processing current) and a "Call station" button.</w:t>
             </w:r>
           </w:p>
         </w:tc>
@@ -4726,7 +4726,7 @@
                 <w:sz w:val="19"/>
                 <w:szCs w:val="19"/>
               </w:rPr>
-              <w:t xml:space="preserve">Tap the card.</w:t>
+              <w:t xml:space="preserve">Tap Call station.</w:t>
             </w:r>
           </w:p>
         </w:tc>
@@ -4758,7 +4758,7 @@
                 <w:sz w:val="19"/>
                 <w:szCs w:val="19"/>
               </w:rPr>
-              <w:t xml:space="preserve">Order Details with 5 steps (Order accepted checked, Processing current) and a "Call station" button.</w:t>
+              <w:t xml:space="preserve">The phone dialer opens with the station number.</w:t>
             </w:r>
           </w:p>
         </w:tc>
@@ -4903,7 +4903,7 @@
                 <w:sz w:val="19"/>
                 <w:szCs w:val="19"/>
               </w:rPr>
-              <w:t xml:space="preserve">Tap Call station.</w:t>
+              <w:t xml:space="preserve">Place a second order (1 gallon). Open it from Home and tap Cancel order &gt; Confirm.</w:t>
             </w:r>
           </w:p>
         </w:tc>
@@ -4934,7 +4934,7 @@
                 <w:sz w:val="19"/>
                 <w:szCs w:val="19"/>
               </w:rPr>
-              <w:t xml:space="preserve">The phone dialer opens with the station number.</w:t>
+              <w:t xml:space="preserve">"Order cancelled; owner notified"; the order shows a Cancelled tag.</w:t>
             </w:r>
           </w:p>
         </w:tc>
@@ -5079,7 +5079,7 @@
                 <w:sz w:val="19"/>
                 <w:szCs w:val="19"/>
               </w:rPr>
-              <w:t xml:space="preserve">Place a second order (1 gallon). Open it from Home and tap Cancel order &gt; Confirm.</w:t>
+              <w:t xml:space="preserve">Open the My Orders tab.</w:t>
             </w:r>
           </w:p>
         </w:tc>
@@ -5111,7 +5111,7 @@
                 <w:sz w:val="19"/>
                 <w:szCs w:val="19"/>
               </w:rPr>
-              <w:t xml:space="preserve">"Order cancelled; owner notified"; the order shows a Cancelled tag.</w:t>
+              <w:t xml:space="preserve">Active orders on top; History has the cancelled order with a Reorder button.</w:t>
             </w:r>
           </w:p>
         </w:tc>
@@ -5256,7 +5256,7 @@
                 <w:sz w:val="19"/>
                 <w:szCs w:val="19"/>
               </w:rPr>
-              <w:t xml:space="preserve">Open the My Orders tab.</w:t>
+              <w:t xml:space="preserve">Tap Reorder on the cancelled order.</w:t>
             </w:r>
           </w:p>
         </w:tc>
@@ -5287,7 +5287,7 @@
                 <w:sz w:val="19"/>
                 <w:szCs w:val="19"/>
               </w:rPr>
-              <w:t xml:space="preserve">Active orders on top; History has the cancelled order with a Reorder button.</w:t>
+              <w:t xml:space="preserve">Order Form filled in with the same gallons and address. Tap Cancel &gt; Confirm to leave it.</w:t>
             </w:r>
           </w:p>
         </w:tc>
@@ -5432,7 +5432,7 @@
                 <w:sz w:val="19"/>
                 <w:szCs w:val="19"/>
               </w:rPr>
-              <w:t xml:space="preserve">Tap Reorder on the cancelled order.</w:t>
+              <w:t xml:space="preserve">My Account &gt; Saved Addresses &gt; Add address. Name "Work", Type address: house 5, street "Mabuhay St.", Barangay "Commonwealth" &gt; Save.</w:t>
             </w:r>
           </w:p>
         </w:tc>
@@ -5464,7 +5464,7 @@
                 <w:sz w:val="19"/>
                 <w:szCs w:val="19"/>
               </w:rPr>
-              <w:t xml:space="preserve">Order Form filled in with the same gallons and address. Tap Cancel &gt; Confirm to leave it.</w:t>
+              <w:t xml:space="preserve">"Address saved"; Work is in the list. Next time you order, Work shows as a quick choice.</w:t>
             </w:r>
           </w:p>
         </w:tc>
@@ -5609,7 +5609,7 @@
                 <w:sz w:val="19"/>
                 <w:szCs w:val="19"/>
               </w:rPr>
-              <w:t xml:space="preserve">My Account &gt; Saved Addresses &gt; Add address. Name "Work", Type address: house 5, street "Mabuhay St.", Barangay "Commonwealth" &gt; Save.</w:t>
+              <w:t xml:space="preserve">When the Rider marks your first order Delivered (Part E or ask the Rider tester).</w:t>
             </w:r>
           </w:p>
         </w:tc>
@@ -5640,7 +5640,7 @@
                 <w:sz w:val="19"/>
                 <w:szCs w:val="19"/>
               </w:rPr>
-              <w:t xml:space="preserve">"Address saved"; Work is in the list. Next time you order, Work shows as a quick choice.</w:t>
+              <w:t xml:space="preserve">The order changes to Delivered by itself with a banner "Delivered · Thank you! Enjoy your fresh water."</w:t>
             </w:r>
           </w:p>
         </w:tc>
@@ -5785,7 +5785,7 @@
                 <w:sz w:val="19"/>
                 <w:szCs w:val="19"/>
               </w:rPr>
-              <w:t xml:space="preserve">When the Rider marks your first order Delivered (Part E or ask the Rider tester).</w:t>
+              <w:t xml:space="preserve">My Account &gt; Log out &gt; Confirm.</w:t>
             </w:r>
           </w:p>
         </w:tc>
@@ -5817,7 +5817,7 @@
                 <w:sz w:val="19"/>
                 <w:szCs w:val="19"/>
               </w:rPr>
-              <w:t xml:space="preserve">The order changes to Delivered by itself with a banner "Delivered · Thank you! Enjoy your fresh water."</w:t>
+              <w:t xml:space="preserve">Back to the Welcome screen.</w:t>
             </w:r>
           </w:p>
         </w:tc>
@@ -5962,7 +5962,7 @@
                 <w:sz w:val="19"/>
                 <w:szCs w:val="19"/>
               </w:rPr>
-              <w:t xml:space="preserve">My Account &gt; Log out &gt; Confirm.</w:t>
+              <w:t xml:space="preserve">Tap "Continue as guest" &gt; Order Now. Leave Name empty and tap Place order.</w:t>
             </w:r>
           </w:p>
         </w:tc>
@@ -5993,7 +5993,7 @@
                 <w:sz w:val="19"/>
                 <w:szCs w:val="19"/>
               </w:rPr>
-              <w:t xml:space="preserve">Back to the Welcome screen.</w:t>
+              <w:t xml:space="preserve">Red box "Name missing".</w:t>
             </w:r>
           </w:p>
         </w:tc>
@@ -6138,7 +6138,7 @@
                 <w:sz w:val="19"/>
                 <w:szCs w:val="19"/>
               </w:rPr>
-              <w:t xml:space="preserve">Tap "Continue as guest" &gt; Order Now. Leave Name empty and tap Place order.</w:t>
+              <w:t xml:space="preserve">Fill Name, phone 09185551212, type an address, place the order.</w:t>
             </w:r>
           </w:p>
         </w:tc>
@@ -6170,7 +6170,7 @@
                 <w:sz w:val="19"/>
                 <w:szCs w:val="19"/>
               </w:rPr>
-              <w:t xml:space="preserve">Red box "Name missing".</w:t>
+              <w:t xml:space="preserve">Thank-you message; the order shows on Home with "This phone only; lost if the app is deleted".</w:t>
             </w:r>
           </w:p>
         </w:tc>
@@ -6315,7 +6315,7 @@
                 <w:sz w:val="19"/>
                 <w:szCs w:val="19"/>
               </w:rPr>
-              <w:t xml:space="preserve">Fill Name, phone 09185551212, type an address, place the order.</w:t>
+              <w:t xml:space="preserve">My Account &gt; Create account. Use YOUR OWN name, your own phone number, an email and a password (6+ letters), tick the Terms box &gt; Create account.</w:t>
             </w:r>
           </w:p>
         </w:tc>
@@ -6346,7 +6346,7 @@
                 <w:sz w:val="19"/>
                 <w:szCs w:val="19"/>
               </w:rPr>
-              <w:t xml:space="preserve">Thank-you message; the order shows on Home with "This phone only; lost if the app is deleted".</w:t>
+              <w:t xml:space="preserve">"Account created" and "The orders on this phone are now in your account." My Orders shows the guest order.</w:t>
             </w:r>
           </w:p>
         </w:tc>
@@ -6491,7 +6491,7 @@
                 <w:sz w:val="19"/>
                 <w:szCs w:val="19"/>
               </w:rPr>
-              <w:t xml:space="preserve">My Account &gt; Create account. Use YOUR OWN name, your own phone number, an email and a password (6+ letters), tick the Terms box &gt; Create account.</w:t>
+              <w:t xml:space="preserve">Log out. Tap Sign up and try the same phone number again.</w:t>
             </w:r>
           </w:p>
         </w:tc>
@@ -6523,7 +6523,7 @@
                 <w:sz w:val="19"/>
                 <w:szCs w:val="19"/>
               </w:rPr>
-              <w:t xml:space="preserve">"Account created" and "The orders on this phone are now in your account." My Orders shows the guest order.</w:t>
+              <w:t xml:space="preserve">Red box "Phone number already used"; the phone box has a red border.</w:t>
             </w:r>
           </w:p>
         </w:tc>
@@ -6583,180 +6583,6 @@
               <w:right w:val="single" w:color="B9D7F2" w:sz="4"/>
             </w:tcBorders>
             <w:shd w:fill="EAF4FD" w:color="auto" w:val="clear"/>
-            <w:tcMar>
-              <w:top w:type="dxa" w:w="70"/>
-              <w:left w:type="dxa" w:w="100"/>
-              <w:bottom w:type="dxa" w:w="70"/>
-              <w:right w:type="dxa" w:w="100"/>
-            </w:tcMar>
-          </w:tcPr>
-          <w:p>
-            <w:pPr>
-              <w:spacing w:after="0" w:before="0"/>
-            </w:pPr>
-            <w:r>
-              <w:rPr>
-                <w:rFonts w:ascii="Arial" w:cs="Arial" w:eastAsia="Arial" w:hAnsi="Arial"/>
-                <w:color w:val="15202B"/>
-                <w:sz w:val="19"/>
-                <w:szCs w:val="19"/>
-              </w:rPr>
-              <w:t xml:space="preserve"/>
-            </w:r>
-          </w:p>
-        </w:tc>
-      </w:tr>
-      <w:tr>
-        <w:trPr>
-          <w:cantSplit/>
-        </w:trPr>
-        <w:tc>
-          <w:tcPr>
-            <w:tcW w:type="dxa" w:w="700"/>
-            <w:tcBorders>
-              <w:top w:val="single" w:color="B9D7F2" w:sz="4"/>
-              <w:left w:val="single" w:color="B9D7F2" w:sz="4"/>
-              <w:bottom w:val="single" w:color="B9D7F2" w:sz="4"/>
-              <w:right w:val="single" w:color="B9D7F2" w:sz="4"/>
-            </w:tcBorders>
-            <w:tcMar>
-              <w:top w:type="dxa" w:w="70"/>
-              <w:left w:type="dxa" w:w="100"/>
-              <w:bottom w:type="dxa" w:w="70"/>
-              <w:right w:type="dxa" w:w="100"/>
-            </w:tcMar>
-          </w:tcPr>
-          <w:p>
-            <w:pPr>
-              <w:spacing w:after="0" w:before="0"/>
-            </w:pPr>
-            <w:r>
-              <w:rPr>
-                <w:rFonts w:ascii="Arial" w:cs="Arial" w:eastAsia="Arial" w:hAnsi="Arial"/>
-                <w:color w:val="15202B"/>
-                <w:sz w:val="19"/>
-                <w:szCs w:val="19"/>
-              </w:rPr>
-              <w:t xml:space="preserve">A23</w:t>
-            </w:r>
-          </w:p>
-        </w:tc>
-        <w:tc>
-          <w:tcPr>
-            <w:tcW w:type="dxa" w:w="3900"/>
-            <w:tcBorders>
-              <w:top w:val="single" w:color="B9D7F2" w:sz="4"/>
-              <w:left w:val="single" w:color="B9D7F2" w:sz="4"/>
-              <w:bottom w:val="single" w:color="B9D7F2" w:sz="4"/>
-              <w:right w:val="single" w:color="B9D7F2" w:sz="4"/>
-            </w:tcBorders>
-            <w:tcMar>
-              <w:top w:type="dxa" w:w="70"/>
-              <w:left w:type="dxa" w:w="100"/>
-              <w:bottom w:type="dxa" w:w="70"/>
-              <w:right w:type="dxa" w:w="100"/>
-            </w:tcMar>
-          </w:tcPr>
-          <w:p>
-            <w:pPr>
-              <w:spacing w:after="0" w:before="0"/>
-            </w:pPr>
-            <w:r>
-              <w:rPr>
-                <w:rFonts w:ascii="Arial" w:cs="Arial" w:eastAsia="Arial" w:hAnsi="Arial"/>
-                <w:color w:val="15202B"/>
-                <w:sz w:val="19"/>
-                <w:szCs w:val="19"/>
-              </w:rPr>
-              <w:t xml:space="preserve">Log out. Tap Sign up and try the same phone number again.</w:t>
-            </w:r>
-          </w:p>
-        </w:tc>
-        <w:tc>
-          <w:tcPr>
-            <w:tcW w:type="dxa" w:w="3900"/>
-            <w:tcBorders>
-              <w:top w:val="single" w:color="B9D7F2" w:sz="4"/>
-              <w:left w:val="single" w:color="B9D7F2" w:sz="4"/>
-              <w:bottom w:val="single" w:color="B9D7F2" w:sz="4"/>
-              <w:right w:val="single" w:color="B9D7F2" w:sz="4"/>
-            </w:tcBorders>
-            <w:tcMar>
-              <w:top w:type="dxa" w:w="70"/>
-              <w:left w:type="dxa" w:w="100"/>
-              <w:bottom w:type="dxa" w:w="70"/>
-              <w:right w:type="dxa" w:w="100"/>
-            </w:tcMar>
-          </w:tcPr>
-          <w:p>
-            <w:pPr>
-              <w:spacing w:after="0" w:before="0"/>
-            </w:pPr>
-            <w:r>
-              <w:rPr>
-                <w:rFonts w:ascii="Arial" w:cs="Arial" w:eastAsia="Arial" w:hAnsi="Arial"/>
-                <w:color w:val="15202B"/>
-                <w:sz w:val="19"/>
-                <w:szCs w:val="19"/>
-              </w:rPr>
-              <w:t xml:space="preserve">Red box "Phone number already used"; the phone box has a red border.</w:t>
-            </w:r>
-          </w:p>
-        </w:tc>
-        <w:tc>
-          <w:tcPr>
-            <w:tcW w:type="dxa" w:w="900"/>
-            <w:tcBorders>
-              <w:top w:val="single" w:color="B9D7F2" w:sz="4"/>
-              <w:left w:val="single" w:color="B9D7F2" w:sz="4"/>
-              <w:bottom w:val="single" w:color="B9D7F2" w:sz="4"/>
-              <w:right w:val="single" w:color="B9D7F2" w:sz="4"/>
-            </w:tcBorders>
-            <w:tcMar>
-              <w:top w:type="dxa" w:w="70"/>
-              <w:left w:type="dxa" w:w="100"/>
-              <w:bottom w:type="dxa" w:w="70"/>
-              <w:right w:type="dxa" w:w="100"/>
-            </w:tcMar>
-          </w:tcPr>
-          <w:p>
-            <w:pPr>
-              <w:spacing w:after="0" w:before="0"/>
-            </w:pPr>
-            <w:r>
-              <w:rPr>
-                <w:rFonts w:ascii="Arial" w:cs="Arial" w:eastAsia="Arial" w:hAnsi="Arial"/>
-                <w:color w:val="15202B"/>
-                <w:sz w:val="18"/>
-                <w:szCs w:val="18"/>
-              </w:rPr>
-              <w:t xml:space="preserve">☐ Pass</w:t>
-            </w:r>
-          </w:p>
-          <w:p>
-            <w:pPr>
-              <w:spacing w:after="0" w:before="0"/>
-            </w:pPr>
-            <w:r>
-              <w:rPr>
-                <w:rFonts w:ascii="Arial" w:cs="Arial" w:eastAsia="Arial" w:hAnsi="Arial"/>
-                <w:color w:val="15202B"/>
-                <w:sz w:val="18"/>
-                <w:szCs w:val="18"/>
-              </w:rPr>
-              <w:t xml:space="preserve">☐ Fail</w:t>
-            </w:r>
-          </w:p>
-        </w:tc>
-        <w:tc>
-          <w:tcPr>
-            <w:tcW w:type="dxa" w:w="1066"/>
-            <w:tcBorders>
-              <w:top w:val="single" w:color="B9D7F2" w:sz="4"/>
-              <w:left w:val="single" w:color="B9D7F2" w:sz="4"/>
-              <w:bottom w:val="single" w:color="B9D7F2" w:sz="4"/>
-              <w:right w:val="single" w:color="B9D7F2" w:sz="4"/>
-            </w:tcBorders>
             <w:tcMar>
               <w:top w:type="dxa" w:w="70"/>
               <w:left w:type="dxa" w:w="100"/>
@@ -17503,7 +17329,7 @@
                 <w:sz w:val="19"/>
                 <w:szCs w:val="19"/>
               </w:rPr>
-              <w:t xml:space="preserve">Owner: the sidecar is where the Rider phone is. Customer: above the map "About n min away · n km"; on the map a house at the delivery address, the sidecar, and a blue line along the streets between them.</w:t>
+              <w:t xml:space="preserve">Owner: the sidecar starts at the station, then is where the Rider phone is. Customer: above the map "About n min away · n km"; on the map the station, a house at the delivery address, the sidecar, a light line behind it from the station and a blue line along the streets ahead.</w:t>
             </w:r>
           </w:p>
         </w:tc>

</xml_diff>

<commit_message>
Testing: check the app version matches the newest release
Co-Authored-By: Claude Opus 5.5 <noreply@anthropic.com>
Claude-Session: https://claude.ai/code/session_01FGCEzsecdEGjCSsNcfM7Ef
</commit_message>
<xml_diff>
--- a/docs/testing/Mangao-Team-Testing-Guide.docx
+++ b/docs/testing/Mangao-Team-Testing-Guide.docx
@@ -62,7 +62,7 @@
         </w:rPr>
         <w:t xml:space="preserve">1. On your Android phone, open this link in Chrome: </w:t>
       </w:r>
-      <w:hyperlink w:history="1" r:id="rIddsupujccv3eazomafnmyj">
+      <w:hyperlink w:history="1" r:id="rIdeqqdflc7ifwphbzo-gwoa">
         <w:r>
           <w:rPr>
             <w:rFonts w:ascii="Arial" w:cs="Arial" w:eastAsia="Arial" w:hAnsi="Arial"/>
@@ -143,6 +143,20 @@
           <w:szCs w:val="20"/>
         </w:rPr>
         <w:t xml:space="preserve">5. Open "Mangao WRS". The first time it can take up to 1 minute while the online server wakes up.</w:t>
+      </w:r>
+    </w:p>
+    <w:p>
+      <w:pPr>
+        <w:spacing w:after="80" w:before="0"/>
+      </w:pPr>
+      <w:r>
+        <w:rPr>
+          <w:rFonts w:ascii="Arial" w:cs="Arial" w:eastAsia="Arial" w:hAnsi="Arial"/>
+          <w:color w:val="15202B"/>
+          <w:sz w:val="20"/>
+          <w:szCs w:val="20"/>
+        </w:rPr>
+        <w:t xml:space="preserve">6. Check the version under the buttons on the Welcome screen (also at the bottom of My Account). It must match the newest version on the GitHub page (e.g. "version 1.0.13"). If it is older, install the new APK again; in the web version close the tab and open the link again.</w:t>
       </w:r>
     </w:p>
     <w:p>

</xml_diff>

<commit_message>
Phone notification setup guide (Firebase) and testing checks for the Oct 20 additions
Co-Authored-By: Claude Opus 5.5 <noreply@anthropic.com>
Claude-Session: https://claude.ai/code/session_01FGCEzsecdEGjCSsNcfM7Ef
</commit_message>
<xml_diff>
--- a/docs/testing/Mangao-Team-Testing-Guide.docx
+++ b/docs/testing/Mangao-Team-Testing-Guide.docx
@@ -62,7 +62,7 @@
         </w:rPr>
         <w:t xml:space="preserve">1. On your Android phone, open this link in Chrome: </w:t>
       </w:r>
-      <w:hyperlink w:history="1" r:id="rIdeqqdflc7ifwphbzo-gwoa">
+      <w:hyperlink w:history="1" r:id="rIdtiodowseskwf_vc8r0_a5">
         <w:r>
           <w:rPr>
             <w:rFonts w:ascii="Arial" w:cs="Arial" w:eastAsia="Arial" w:hAnsi="Arial"/>
@@ -1465,7 +1465,7 @@
           <w:sz w:val="20"/>
           <w:szCs w:val="20"/>
         </w:rPr>
-        <w:t xml:space="preserve">5 parts, 79 checks. With 4 testers, each takes one role (Parts A to D). Suggested order: everyone logs in first, do Part E together (it needs all four phones), then continue your own part. With fewer testers, one person can do two roles on two phones, or log out and log in as the other role.</w:t>
+        <w:t xml:space="preserve">5 parts, 84 checks. With 4 testers, each takes one role (Parts A to D). Suggested order: everyone logs in first, do Part E together (it needs all four phones), then continue your own part. With fewer testers, one person can do two roles on two phones, or log out and log in as the other role.</w:t>
       </w:r>
     </w:p>
     <w:tbl>
@@ -2437,7 +2437,7 @@
                 <w:sz w:val="19"/>
                 <w:szCs w:val="19"/>
               </w:rPr>
-              <w:t xml:space="preserve">6</w:t>
+              <w:t xml:space="preserve">11</w:t>
             </w:r>
           </w:p>
         </w:tc>
@@ -16813,7 +16813,7 @@
                 <w:sz w:val="19"/>
                 <w:szCs w:val="19"/>
               </w:rPr>
-              <w:t xml:space="preserve">Owner: the order appears by itself with a "New order" banner and the bell number goes up.</w:t>
+              <w:t xml:space="preserve">Owner: the order appears by itself with a "New order" banner and the bell number goes up. The card shows "Ordered &lt;date&gt;, &lt;time&gt;", "As soon as possible" and "cancels at &lt;time&gt; if not accepted". The bell list shows the date and time of each alert.</w:t>
             </w:r>
           </w:p>
         </w:tc>
@@ -16958,7 +16958,7 @@
                 <w:sz w:val="19"/>
                 <w:szCs w:val="19"/>
               </w:rPr>
-              <w:t xml:space="preserve">Customer: open the order and wait. Owner: Accept it with rider Juan Dela Cruz.</w:t>
+              <w:t xml:space="preserve">Owner phone (Android app, Firebase set up): close the app. Customer: place another order.</w:t>
             </w:r>
           </w:p>
         </w:tc>
@@ -16990,7 +16990,7 @@
                 <w:sz w:val="19"/>
                 <w:szCs w:val="19"/>
               </w:rPr>
-              <w:t xml:space="preserve">Customer: the screen jumps to Processing with the delivery time and an "Order accepted" banner. Staff: it appears in To Do &gt; Processing by itself.</w:t>
+              <w:t xml:space="preserve">The owner phone shows "New order" in the notification bar (with the order date and time). Tapping it opens the order.</w:t>
             </w:r>
           </w:p>
         </w:tc>
@@ -17135,7 +17135,7 @@
                 <w:sz w:val="19"/>
                 <w:szCs w:val="19"/>
               </w:rPr>
-              <w:t xml:space="preserve">Rider: stay on Deliveries. Staff: Mark it Out for Delivery.</w:t>
+              <w:t xml:space="preserve">Customer: place an order with Delivery date &gt; Choose a date &gt; tomorrow.</w:t>
             </w:r>
           </w:p>
         </w:tc>
@@ -17166,7 +17166,7 @@
                 <w:sz w:val="19"/>
                 <w:szCs w:val="19"/>
               </w:rPr>
-              <w:t xml:space="preserve">Rider: the order appears by itself; Location Sharing turns on. Customer: "Out for Delivery" with "Your rider is on the way." Tank counter goes up by 2.</w:t>
+              <w:t xml:space="preserve">Owner New card: "Deliver on &lt;day&gt;". After Accept, the customer sees "Estimated Delivery: &lt;date&gt;, 7:30 AM to 6:00 PM".</w:t>
             </w:r>
           </w:p>
         </w:tc>
@@ -17311,7 +17311,7 @@
                 <w:sz w:val="19"/>
                 <w:szCs w:val="19"/>
               </w:rPr>
-              <w:t xml:space="preserve">Owner: Orders &gt; Live Map. Customer: look at the order.</w:t>
+              <w:t xml:space="preserve">Customer: open the order and wait. Owner: Accept it with rider Juan Dela Cruz.</w:t>
             </w:r>
           </w:p>
         </w:tc>
@@ -17343,7 +17343,7 @@
                 <w:sz w:val="19"/>
                 <w:szCs w:val="19"/>
               </w:rPr>
-              <w:t xml:space="preserve">Owner: the sidecar starts at the station, then is where the Rider phone is. Customer: above the map "About n min away · n km"; on the map the station, a house at the delivery address, the sidecar, a light line behind it from the station and a blue line along the streets ahead.</w:t>
+              <w:t xml:space="preserve">Customer: the screen jumps to Processing with the delivery time and an "Order accepted" banner. Staff: it appears in To Do &gt; Processing by itself.</w:t>
             </w:r>
           </w:p>
         </w:tc>
@@ -17488,7 +17488,7 @@
                 <w:sz w:val="19"/>
                 <w:szCs w:val="19"/>
               </w:rPr>
-              <w:t xml:space="preserve">Rider: Delivered &gt; Paid.</w:t>
+              <w:t xml:space="preserve">Rider: stay on Deliveries. Staff: Mark it Out for Delivery.</w:t>
             </w:r>
           </w:p>
         </w:tc>
@@ -17519,7 +17519,7 @@
                 <w:sz w:val="19"/>
                 <w:szCs w:val="19"/>
               </w:rPr>
-              <w:t xml:space="preserve">Customer: "Delivered" with a banner. Owner: Home Delivered tile and Sales go up; Sales &gt; Daily lists the order.</w:t>
+              <w:t xml:space="preserve">Rider: the order appears by itself; Location Sharing turns on. Customer: "Out for Delivery" with "Your rider is on the way." Tank counter goes up by 2.</w:t>
             </w:r>
           </w:p>
         </w:tc>
@@ -17664,7 +17664,7 @@
                 <w:sz w:val="19"/>
                 <w:szCs w:val="19"/>
               </w:rPr>
-              <w:t xml:space="preserve">Customer: turn off Wi-Fi/data for 10 seconds, then on again. Owner: accept another order meanwhile.</w:t>
+              <w:t xml:space="preserve">Owner: Orders &gt; Live Map. Customer: look at the order.</w:t>
             </w:r>
           </w:p>
         </w:tc>
@@ -17696,7 +17696,7 @@
                 <w:sz w:val="19"/>
                 <w:szCs w:val="19"/>
               </w:rPr>
-              <w:t xml:space="preserve">The app does not crash; after the internet is back the customer screen catches up by itself (or after pulling down).</w:t>
+              <w:t xml:space="preserve">Owner: ONE sidecar; it starts at the station, then is where the Rider phone is. Customer: above the map "About n min away · n km"; on the map the station, a house at the delivery address, the sidecar, a light line behind it from the station and a blue line along the streets ahead.</w:t>
             </w:r>
           </w:p>
         </w:tc>
@@ -17756,6 +17756,886 @@
               <w:right w:val="single" w:color="B9D7F2" w:sz="4"/>
             </w:tcBorders>
             <w:shd w:fill="EAF4FD" w:color="auto" w:val="clear"/>
+            <w:tcMar>
+              <w:top w:type="dxa" w:w="70"/>
+              <w:left w:type="dxa" w:w="100"/>
+              <w:bottom w:type="dxa" w:w="70"/>
+              <w:right w:type="dxa" w:w="100"/>
+            </w:tcMar>
+          </w:tcPr>
+          <w:p>
+            <w:pPr>
+              <w:spacing w:after="0" w:before="0"/>
+            </w:pPr>
+            <w:r>
+              <w:rPr>
+                <w:rFonts w:ascii="Arial" w:cs="Arial" w:eastAsia="Arial" w:hAnsi="Arial"/>
+                <w:color w:val="15202B"/>
+                <w:sz w:val="19"/>
+                <w:szCs w:val="19"/>
+              </w:rPr>
+              <w:t xml:space="preserve"/>
+            </w:r>
+          </w:p>
+        </w:tc>
+      </w:tr>
+      <w:tr>
+        <w:trPr>
+          <w:cantSplit/>
+        </w:trPr>
+        <w:tc>
+          <w:tcPr>
+            <w:tcW w:type="dxa" w:w="700"/>
+            <w:tcBorders>
+              <w:top w:val="single" w:color="B9D7F2" w:sz="4"/>
+              <w:left w:val="single" w:color="B9D7F2" w:sz="4"/>
+              <w:bottom w:val="single" w:color="B9D7F2" w:sz="4"/>
+              <w:right w:val="single" w:color="B9D7F2" w:sz="4"/>
+            </w:tcBorders>
+            <w:tcMar>
+              <w:top w:type="dxa" w:w="70"/>
+              <w:left w:type="dxa" w:w="100"/>
+              <w:bottom w:type="dxa" w:w="70"/>
+              <w:right w:type="dxa" w:w="100"/>
+            </w:tcMar>
+          </w:tcPr>
+          <w:p>
+            <w:pPr>
+              <w:spacing w:after="0" w:before="0"/>
+            </w:pPr>
+            <w:r>
+              <w:rPr>
+                <w:rFonts w:ascii="Arial" w:cs="Arial" w:eastAsia="Arial" w:hAnsi="Arial"/>
+                <w:color w:val="15202B"/>
+                <w:sz w:val="19"/>
+                <w:szCs w:val="19"/>
+              </w:rPr>
+              <w:t xml:space="preserve">E7</w:t>
+            </w:r>
+          </w:p>
+        </w:tc>
+        <w:tc>
+          <w:tcPr>
+            <w:tcW w:type="dxa" w:w="3900"/>
+            <w:tcBorders>
+              <w:top w:val="single" w:color="B9D7F2" w:sz="4"/>
+              <w:left w:val="single" w:color="B9D7F2" w:sz="4"/>
+              <w:bottom w:val="single" w:color="B9D7F2" w:sz="4"/>
+              <w:right w:val="single" w:color="B9D7F2" w:sz="4"/>
+            </w:tcBorders>
+            <w:tcMar>
+              <w:top w:type="dxa" w:w="70"/>
+              <w:left w:type="dxa" w:w="100"/>
+              <w:bottom w:type="dxa" w:w="70"/>
+              <w:right w:type="dxa" w:w="100"/>
+            </w:tcMar>
+          </w:tcPr>
+          <w:p>
+            <w:pPr>
+              <w:spacing w:after="0" w:before="0"/>
+            </w:pPr>
+            <w:r>
+              <w:rPr>
+                <w:rFonts w:ascii="Arial" w:cs="Arial" w:eastAsia="Arial" w:hAnsi="Arial"/>
+                <w:color w:val="15202B"/>
+                <w:sz w:val="19"/>
+                <w:szCs w:val="19"/>
+              </w:rPr>
+              <w:t xml:space="preserve">Rider (or the Demo ride) comes within about 300 m of the customer.</w:t>
+            </w:r>
+          </w:p>
+        </w:tc>
+        <w:tc>
+          <w:tcPr>
+            <w:tcW w:type="dxa" w:w="3900"/>
+            <w:tcBorders>
+              <w:top w:val="single" w:color="B9D7F2" w:sz="4"/>
+              <w:left w:val="single" w:color="B9D7F2" w:sz="4"/>
+              <w:bottom w:val="single" w:color="B9D7F2" w:sz="4"/>
+              <w:right w:val="single" w:color="B9D7F2" w:sz="4"/>
+            </w:tcBorders>
+            <w:tcMar>
+              <w:top w:type="dxa" w:w="70"/>
+              <w:left w:type="dxa" w:w="100"/>
+              <w:bottom w:type="dxa" w:w="70"/>
+              <w:right w:type="dxa" w:w="100"/>
+            </w:tcMar>
+          </w:tcPr>
+          <w:p>
+            <w:pPr>
+              <w:spacing w:after="0" w:before="0"/>
+            </w:pPr>
+            <w:r>
+              <w:rPr>
+                <w:rFonts w:ascii="Arial" w:cs="Arial" w:eastAsia="Arial" w:hAnsi="Arial"/>
+                <w:color w:val="15202B"/>
+                <w:sz w:val="19"/>
+                <w:szCs w:val="19"/>
+              </w:rPr>
+              <w:t xml:space="preserve">Customer: "Arriving - please prepare ₱70.00" above the map and an alert "Your water is arriving". Owner map label: "Arriving at 1".</w:t>
+            </w:r>
+          </w:p>
+        </w:tc>
+        <w:tc>
+          <w:tcPr>
+            <w:tcW w:type="dxa" w:w="900"/>
+            <w:tcBorders>
+              <w:top w:val="single" w:color="B9D7F2" w:sz="4"/>
+              <w:left w:val="single" w:color="B9D7F2" w:sz="4"/>
+              <w:bottom w:val="single" w:color="B9D7F2" w:sz="4"/>
+              <w:right w:val="single" w:color="B9D7F2" w:sz="4"/>
+            </w:tcBorders>
+            <w:tcMar>
+              <w:top w:type="dxa" w:w="70"/>
+              <w:left w:type="dxa" w:w="100"/>
+              <w:bottom w:type="dxa" w:w="70"/>
+              <w:right w:type="dxa" w:w="100"/>
+            </w:tcMar>
+          </w:tcPr>
+          <w:p>
+            <w:pPr>
+              <w:spacing w:after="0" w:before="0"/>
+            </w:pPr>
+            <w:r>
+              <w:rPr>
+                <w:rFonts w:ascii="Arial" w:cs="Arial" w:eastAsia="Arial" w:hAnsi="Arial"/>
+                <w:color w:val="15202B"/>
+                <w:sz w:val="18"/>
+                <w:szCs w:val="18"/>
+              </w:rPr>
+              <w:t xml:space="preserve">☐ Pass</w:t>
+            </w:r>
+          </w:p>
+          <w:p>
+            <w:pPr>
+              <w:spacing w:after="0" w:before="0"/>
+            </w:pPr>
+            <w:r>
+              <w:rPr>
+                <w:rFonts w:ascii="Arial" w:cs="Arial" w:eastAsia="Arial" w:hAnsi="Arial"/>
+                <w:color w:val="15202B"/>
+                <w:sz w:val="18"/>
+                <w:szCs w:val="18"/>
+              </w:rPr>
+              <w:t xml:space="preserve">☐ Fail</w:t>
+            </w:r>
+          </w:p>
+        </w:tc>
+        <w:tc>
+          <w:tcPr>
+            <w:tcW w:type="dxa" w:w="1066"/>
+            <w:tcBorders>
+              <w:top w:val="single" w:color="B9D7F2" w:sz="4"/>
+              <w:left w:val="single" w:color="B9D7F2" w:sz="4"/>
+              <w:bottom w:val="single" w:color="B9D7F2" w:sz="4"/>
+              <w:right w:val="single" w:color="B9D7F2" w:sz="4"/>
+            </w:tcBorders>
+            <w:tcMar>
+              <w:top w:type="dxa" w:w="70"/>
+              <w:left w:type="dxa" w:w="100"/>
+              <w:bottom w:type="dxa" w:w="70"/>
+              <w:right w:type="dxa" w:w="100"/>
+            </w:tcMar>
+          </w:tcPr>
+          <w:p>
+            <w:pPr>
+              <w:spacing w:after="0" w:before="0"/>
+            </w:pPr>
+            <w:r>
+              <w:rPr>
+                <w:rFonts w:ascii="Arial" w:cs="Arial" w:eastAsia="Arial" w:hAnsi="Arial"/>
+                <w:color w:val="15202B"/>
+                <w:sz w:val="19"/>
+                <w:szCs w:val="19"/>
+              </w:rPr>
+              <w:t xml:space="preserve"/>
+            </w:r>
+          </w:p>
+        </w:tc>
+      </w:tr>
+      <w:tr>
+        <w:trPr>
+          <w:cantSplit/>
+        </w:trPr>
+        <w:tc>
+          <w:tcPr>
+            <w:tcW w:type="dxa" w:w="700"/>
+            <w:tcBorders>
+              <w:top w:val="single" w:color="B9D7F2" w:sz="4"/>
+              <w:left w:val="single" w:color="B9D7F2" w:sz="4"/>
+              <w:bottom w:val="single" w:color="B9D7F2" w:sz="4"/>
+              <w:right w:val="single" w:color="B9D7F2" w:sz="4"/>
+            </w:tcBorders>
+            <w:shd w:fill="EAF4FD" w:color="auto" w:val="clear"/>
+            <w:tcMar>
+              <w:top w:type="dxa" w:w="70"/>
+              <w:left w:type="dxa" w:w="100"/>
+              <w:bottom w:type="dxa" w:w="70"/>
+              <w:right w:type="dxa" w:w="100"/>
+            </w:tcMar>
+          </w:tcPr>
+          <w:p>
+            <w:pPr>
+              <w:spacing w:after="0" w:before="0"/>
+            </w:pPr>
+            <w:r>
+              <w:rPr>
+                <w:rFonts w:ascii="Arial" w:cs="Arial" w:eastAsia="Arial" w:hAnsi="Arial"/>
+                <w:color w:val="15202B"/>
+                <w:sz w:val="19"/>
+                <w:szCs w:val="19"/>
+              </w:rPr>
+              <w:t xml:space="preserve">E8</w:t>
+            </w:r>
+          </w:p>
+        </w:tc>
+        <w:tc>
+          <w:tcPr>
+            <w:tcW w:type="dxa" w:w="3900"/>
+            <w:tcBorders>
+              <w:top w:val="single" w:color="B9D7F2" w:sz="4"/>
+              <w:left w:val="single" w:color="B9D7F2" w:sz="4"/>
+              <w:bottom w:val="single" w:color="B9D7F2" w:sz="4"/>
+              <w:right w:val="single" w:color="B9D7F2" w:sz="4"/>
+            </w:tcBorders>
+            <w:shd w:fill="EAF4FD" w:color="auto" w:val="clear"/>
+            <w:tcMar>
+              <w:top w:type="dxa" w:w="70"/>
+              <w:left w:type="dxa" w:w="100"/>
+              <w:bottom w:type="dxa" w:w="70"/>
+              <w:right w:type="dxa" w:w="100"/>
+            </w:tcMar>
+          </w:tcPr>
+          <w:p>
+            <w:pPr>
+              <w:spacing w:after="0" w:before="0"/>
+            </w:pPr>
+            <w:r>
+              <w:rPr>
+                <w:rFonts w:ascii="Arial" w:cs="Arial" w:eastAsia="Arial" w:hAnsi="Arial"/>
+                <w:color w:val="15202B"/>
+                <w:sz w:val="19"/>
+                <w:szCs w:val="19"/>
+              </w:rPr>
+              <w:t xml:space="preserve">Rider reaches the customer (within about 50 m).</w:t>
+            </w:r>
+          </w:p>
+        </w:tc>
+        <w:tc>
+          <w:tcPr>
+            <w:tcW w:type="dxa" w:w="3900"/>
+            <w:tcBorders>
+              <w:top w:val="single" w:color="B9D7F2" w:sz="4"/>
+              <w:left w:val="single" w:color="B9D7F2" w:sz="4"/>
+              <w:bottom w:val="single" w:color="B9D7F2" w:sz="4"/>
+              <w:right w:val="single" w:color="B9D7F2" w:sz="4"/>
+            </w:tcBorders>
+            <w:shd w:fill="EAF4FD" w:color="auto" w:val="clear"/>
+            <w:tcMar>
+              <w:top w:type="dxa" w:w="70"/>
+              <w:left w:type="dxa" w:w="100"/>
+              <w:bottom w:type="dxa" w:w="70"/>
+              <w:right w:type="dxa" w:w="100"/>
+            </w:tcMar>
+          </w:tcPr>
+          <w:p>
+            <w:pPr>
+              <w:spacing w:after="0" w:before="0"/>
+            </w:pPr>
+            <w:r>
+              <w:rPr>
+                <w:rFonts w:ascii="Arial" w:cs="Arial" w:eastAsia="Arial" w:hAnsi="Arial"/>
+                <w:color w:val="15202B"/>
+                <w:sz w:val="19"/>
+                <w:szCs w:val="19"/>
+              </w:rPr>
+              <w:t xml:space="preserve">Customer: "Your rider has arrived. Please prepare ₱70.00" and an alert "Your rider has arrived". Owner map label: "Arrived at 1".</w:t>
+            </w:r>
+          </w:p>
+        </w:tc>
+        <w:tc>
+          <w:tcPr>
+            <w:tcW w:type="dxa" w:w="900"/>
+            <w:tcBorders>
+              <w:top w:val="single" w:color="B9D7F2" w:sz="4"/>
+              <w:left w:val="single" w:color="B9D7F2" w:sz="4"/>
+              <w:bottom w:val="single" w:color="B9D7F2" w:sz="4"/>
+              <w:right w:val="single" w:color="B9D7F2" w:sz="4"/>
+            </w:tcBorders>
+            <w:shd w:fill="EAF4FD" w:color="auto" w:val="clear"/>
+            <w:tcMar>
+              <w:top w:type="dxa" w:w="70"/>
+              <w:left w:type="dxa" w:w="100"/>
+              <w:bottom w:type="dxa" w:w="70"/>
+              <w:right w:type="dxa" w:w="100"/>
+            </w:tcMar>
+          </w:tcPr>
+          <w:p>
+            <w:pPr>
+              <w:spacing w:after="0" w:before="0"/>
+            </w:pPr>
+            <w:r>
+              <w:rPr>
+                <w:rFonts w:ascii="Arial" w:cs="Arial" w:eastAsia="Arial" w:hAnsi="Arial"/>
+                <w:color w:val="15202B"/>
+                <w:sz w:val="18"/>
+                <w:szCs w:val="18"/>
+              </w:rPr>
+              <w:t xml:space="preserve">☐ Pass</w:t>
+            </w:r>
+          </w:p>
+          <w:p>
+            <w:pPr>
+              <w:spacing w:after="0" w:before="0"/>
+            </w:pPr>
+            <w:r>
+              <w:rPr>
+                <w:rFonts w:ascii="Arial" w:cs="Arial" w:eastAsia="Arial" w:hAnsi="Arial"/>
+                <w:color w:val="15202B"/>
+                <w:sz w:val="18"/>
+                <w:szCs w:val="18"/>
+              </w:rPr>
+              <w:t xml:space="preserve">☐ Fail</w:t>
+            </w:r>
+          </w:p>
+        </w:tc>
+        <w:tc>
+          <w:tcPr>
+            <w:tcW w:type="dxa" w:w="1066"/>
+            <w:tcBorders>
+              <w:top w:val="single" w:color="B9D7F2" w:sz="4"/>
+              <w:left w:val="single" w:color="B9D7F2" w:sz="4"/>
+              <w:bottom w:val="single" w:color="B9D7F2" w:sz="4"/>
+              <w:right w:val="single" w:color="B9D7F2" w:sz="4"/>
+            </w:tcBorders>
+            <w:shd w:fill="EAF4FD" w:color="auto" w:val="clear"/>
+            <w:tcMar>
+              <w:top w:type="dxa" w:w="70"/>
+              <w:left w:type="dxa" w:w="100"/>
+              <w:bottom w:type="dxa" w:w="70"/>
+              <w:right w:type="dxa" w:w="100"/>
+            </w:tcMar>
+          </w:tcPr>
+          <w:p>
+            <w:pPr>
+              <w:spacing w:after="0" w:before="0"/>
+            </w:pPr>
+            <w:r>
+              <w:rPr>
+                <w:rFonts w:ascii="Arial" w:cs="Arial" w:eastAsia="Arial" w:hAnsi="Arial"/>
+                <w:color w:val="15202B"/>
+                <w:sz w:val="19"/>
+                <w:szCs w:val="19"/>
+              </w:rPr>
+              <w:t xml:space="preserve"/>
+            </w:r>
+          </w:p>
+        </w:tc>
+      </w:tr>
+      <w:tr>
+        <w:trPr>
+          <w:cantSplit/>
+        </w:trPr>
+        <w:tc>
+          <w:tcPr>
+            <w:tcW w:type="dxa" w:w="700"/>
+            <w:tcBorders>
+              <w:top w:val="single" w:color="B9D7F2" w:sz="4"/>
+              <w:left w:val="single" w:color="B9D7F2" w:sz="4"/>
+              <w:bottom w:val="single" w:color="B9D7F2" w:sz="4"/>
+              <w:right w:val="single" w:color="B9D7F2" w:sz="4"/>
+            </w:tcBorders>
+            <w:tcMar>
+              <w:top w:type="dxa" w:w="70"/>
+              <w:left w:type="dxa" w:w="100"/>
+              <w:bottom w:type="dxa" w:w="70"/>
+              <w:right w:type="dxa" w:w="100"/>
+            </w:tcMar>
+          </w:tcPr>
+          <w:p>
+            <w:pPr>
+              <w:spacing w:after="0" w:before="0"/>
+            </w:pPr>
+            <w:r>
+              <w:rPr>
+                <w:rFonts w:ascii="Arial" w:cs="Arial" w:eastAsia="Arial" w:hAnsi="Arial"/>
+                <w:color w:val="15202B"/>
+                <w:sz w:val="19"/>
+                <w:szCs w:val="19"/>
+              </w:rPr>
+              <w:t xml:space="preserve">E9</w:t>
+            </w:r>
+          </w:p>
+        </w:tc>
+        <w:tc>
+          <w:tcPr>
+            <w:tcW w:type="dxa" w:w="3900"/>
+            <w:tcBorders>
+              <w:top w:val="single" w:color="B9D7F2" w:sz="4"/>
+              <w:left w:val="single" w:color="B9D7F2" w:sz="4"/>
+              <w:bottom w:val="single" w:color="B9D7F2" w:sz="4"/>
+              <w:right w:val="single" w:color="B9D7F2" w:sz="4"/>
+            </w:tcBorders>
+            <w:tcMar>
+              <w:top w:type="dxa" w:w="70"/>
+              <w:left w:type="dxa" w:w="100"/>
+              <w:bottom w:type="dxa" w:w="70"/>
+              <w:right w:type="dxa" w:w="100"/>
+            </w:tcMar>
+          </w:tcPr>
+          <w:p>
+            <w:pPr>
+              <w:spacing w:after="0" w:before="0"/>
+            </w:pPr>
+            <w:r>
+              <w:rPr>
+                <w:rFonts w:ascii="Arial" w:cs="Arial" w:eastAsia="Arial" w:hAnsi="Arial"/>
+                <w:color w:val="15202B"/>
+                <w:sz w:val="19"/>
+                <w:szCs w:val="19"/>
+              </w:rPr>
+              <w:t xml:space="preserve">Rider: Delivered &gt; Paid.</w:t>
+            </w:r>
+          </w:p>
+        </w:tc>
+        <w:tc>
+          <w:tcPr>
+            <w:tcW w:type="dxa" w:w="3900"/>
+            <w:tcBorders>
+              <w:top w:val="single" w:color="B9D7F2" w:sz="4"/>
+              <w:left w:val="single" w:color="B9D7F2" w:sz="4"/>
+              <w:bottom w:val="single" w:color="B9D7F2" w:sz="4"/>
+              <w:right w:val="single" w:color="B9D7F2" w:sz="4"/>
+            </w:tcBorders>
+            <w:tcMar>
+              <w:top w:type="dxa" w:w="70"/>
+              <w:left w:type="dxa" w:w="100"/>
+              <w:bottom w:type="dxa" w:w="70"/>
+              <w:right w:type="dxa" w:w="100"/>
+            </w:tcMar>
+          </w:tcPr>
+          <w:p>
+            <w:pPr>
+              <w:spacing w:after="0" w:before="0"/>
+            </w:pPr>
+            <w:r>
+              <w:rPr>
+                <w:rFonts w:ascii="Arial" w:cs="Arial" w:eastAsia="Arial" w:hAnsi="Arial"/>
+                <w:color w:val="15202B"/>
+                <w:sz w:val="19"/>
+                <w:szCs w:val="19"/>
+              </w:rPr>
+              <w:t xml:space="preserve">Customer: "Delivered" with a banner; the map is gone. Owner: Live Map shows "No deliveries running"; Home Delivered tile and Sales go up; Sales &gt; Daily lists the order.</w:t>
+            </w:r>
+          </w:p>
+        </w:tc>
+        <w:tc>
+          <w:tcPr>
+            <w:tcW w:type="dxa" w:w="900"/>
+            <w:tcBorders>
+              <w:top w:val="single" w:color="B9D7F2" w:sz="4"/>
+              <w:left w:val="single" w:color="B9D7F2" w:sz="4"/>
+              <w:bottom w:val="single" w:color="B9D7F2" w:sz="4"/>
+              <w:right w:val="single" w:color="B9D7F2" w:sz="4"/>
+            </w:tcBorders>
+            <w:tcMar>
+              <w:top w:type="dxa" w:w="70"/>
+              <w:left w:type="dxa" w:w="100"/>
+              <w:bottom w:type="dxa" w:w="70"/>
+              <w:right w:type="dxa" w:w="100"/>
+            </w:tcMar>
+          </w:tcPr>
+          <w:p>
+            <w:pPr>
+              <w:spacing w:after="0" w:before="0"/>
+            </w:pPr>
+            <w:r>
+              <w:rPr>
+                <w:rFonts w:ascii="Arial" w:cs="Arial" w:eastAsia="Arial" w:hAnsi="Arial"/>
+                <w:color w:val="15202B"/>
+                <w:sz w:val="18"/>
+                <w:szCs w:val="18"/>
+              </w:rPr>
+              <w:t xml:space="preserve">☐ Pass</w:t>
+            </w:r>
+          </w:p>
+          <w:p>
+            <w:pPr>
+              <w:spacing w:after="0" w:before="0"/>
+            </w:pPr>
+            <w:r>
+              <w:rPr>
+                <w:rFonts w:ascii="Arial" w:cs="Arial" w:eastAsia="Arial" w:hAnsi="Arial"/>
+                <w:color w:val="15202B"/>
+                <w:sz w:val="18"/>
+                <w:szCs w:val="18"/>
+              </w:rPr>
+              <w:t xml:space="preserve">☐ Fail</w:t>
+            </w:r>
+          </w:p>
+        </w:tc>
+        <w:tc>
+          <w:tcPr>
+            <w:tcW w:type="dxa" w:w="1066"/>
+            <w:tcBorders>
+              <w:top w:val="single" w:color="B9D7F2" w:sz="4"/>
+              <w:left w:val="single" w:color="B9D7F2" w:sz="4"/>
+              <w:bottom w:val="single" w:color="B9D7F2" w:sz="4"/>
+              <w:right w:val="single" w:color="B9D7F2" w:sz="4"/>
+            </w:tcBorders>
+            <w:tcMar>
+              <w:top w:type="dxa" w:w="70"/>
+              <w:left w:type="dxa" w:w="100"/>
+              <w:bottom w:type="dxa" w:w="70"/>
+              <w:right w:type="dxa" w:w="100"/>
+            </w:tcMar>
+          </w:tcPr>
+          <w:p>
+            <w:pPr>
+              <w:spacing w:after="0" w:before="0"/>
+            </w:pPr>
+            <w:r>
+              <w:rPr>
+                <w:rFonts w:ascii="Arial" w:cs="Arial" w:eastAsia="Arial" w:hAnsi="Arial"/>
+                <w:color w:val="15202B"/>
+                <w:sz w:val="19"/>
+                <w:szCs w:val="19"/>
+              </w:rPr>
+              <w:t xml:space="preserve"/>
+            </w:r>
+          </w:p>
+        </w:tc>
+      </w:tr>
+      <w:tr>
+        <w:trPr>
+          <w:cantSplit/>
+        </w:trPr>
+        <w:tc>
+          <w:tcPr>
+            <w:tcW w:type="dxa" w:w="700"/>
+            <w:tcBorders>
+              <w:top w:val="single" w:color="B9D7F2" w:sz="4"/>
+              <w:left w:val="single" w:color="B9D7F2" w:sz="4"/>
+              <w:bottom w:val="single" w:color="B9D7F2" w:sz="4"/>
+              <w:right w:val="single" w:color="B9D7F2" w:sz="4"/>
+            </w:tcBorders>
+            <w:shd w:fill="EAF4FD" w:color="auto" w:val="clear"/>
+            <w:tcMar>
+              <w:top w:type="dxa" w:w="70"/>
+              <w:left w:type="dxa" w:w="100"/>
+              <w:bottom w:type="dxa" w:w="70"/>
+              <w:right w:type="dxa" w:w="100"/>
+            </w:tcMar>
+          </w:tcPr>
+          <w:p>
+            <w:pPr>
+              <w:spacing w:after="0" w:before="0"/>
+            </w:pPr>
+            <w:r>
+              <w:rPr>
+                <w:rFonts w:ascii="Arial" w:cs="Arial" w:eastAsia="Arial" w:hAnsi="Arial"/>
+                <w:color w:val="15202B"/>
+                <w:sz w:val="19"/>
+                <w:szCs w:val="19"/>
+              </w:rPr>
+              <w:t xml:space="preserve">E10</w:t>
+            </w:r>
+          </w:p>
+        </w:tc>
+        <w:tc>
+          <w:tcPr>
+            <w:tcW w:type="dxa" w:w="3900"/>
+            <w:tcBorders>
+              <w:top w:val="single" w:color="B9D7F2" w:sz="4"/>
+              <w:left w:val="single" w:color="B9D7F2" w:sz="4"/>
+              <w:bottom w:val="single" w:color="B9D7F2" w:sz="4"/>
+              <w:right w:val="single" w:color="B9D7F2" w:sz="4"/>
+            </w:tcBorders>
+            <w:shd w:fill="EAF4FD" w:color="auto" w:val="clear"/>
+            <w:tcMar>
+              <w:top w:type="dxa" w:w="70"/>
+              <w:left w:type="dxa" w:w="100"/>
+              <w:bottom w:type="dxa" w:w="70"/>
+              <w:right w:type="dxa" w:w="100"/>
+            </w:tcMar>
+          </w:tcPr>
+          <w:p>
+            <w:pPr>
+              <w:spacing w:after="0" w:before="0"/>
+            </w:pPr>
+            <w:r>
+              <w:rPr>
+                <w:rFonts w:ascii="Arial" w:cs="Arial" w:eastAsia="Arial" w:hAnsi="Arial"/>
+                <w:color w:val="15202B"/>
+                <w:sz w:val="19"/>
+                <w:szCs w:val="19"/>
+              </w:rPr>
+              <w:t xml:space="preserve">Two orders out together: Rider delivers the first one.</w:t>
+            </w:r>
+          </w:p>
+        </w:tc>
+        <w:tc>
+          <w:tcPr>
+            <w:tcW w:type="dxa" w:w="3900"/>
+            <w:tcBorders>
+              <w:top w:val="single" w:color="B9D7F2" w:sz="4"/>
+              <w:left w:val="single" w:color="B9D7F2" w:sz="4"/>
+              <w:bottom w:val="single" w:color="B9D7F2" w:sz="4"/>
+              <w:right w:val="single" w:color="B9D7F2" w:sz="4"/>
+            </w:tcBorders>
+            <w:shd w:fill="EAF4FD" w:color="auto" w:val="clear"/>
+            <w:tcMar>
+              <w:top w:type="dxa" w:w="70"/>
+              <w:left w:type="dxa" w:w="100"/>
+              <w:bottom w:type="dxa" w:w="70"/>
+              <w:right w:type="dxa" w:w="100"/>
+            </w:tcMar>
+          </w:tcPr>
+          <w:p>
+            <w:pPr>
+              <w:spacing w:after="0" w:before="0"/>
+            </w:pPr>
+            <w:r>
+              <w:rPr>
+                <w:rFonts w:ascii="Arial" w:cs="Arial" w:eastAsia="Arial" w:hAnsi="Arial"/>
+                <w:color w:val="15202B"/>
+                <w:sz w:val="19"/>
+                <w:szCs w:val="19"/>
+              </w:rPr>
+              <w:t xml:space="preserve">The sidecar stays on the map and goes on to the second house; that customer gets "arriving" and "has arrived" the same way. After the last one: "No deliveries running".</w:t>
+            </w:r>
+          </w:p>
+        </w:tc>
+        <w:tc>
+          <w:tcPr>
+            <w:tcW w:type="dxa" w:w="900"/>
+            <w:tcBorders>
+              <w:top w:val="single" w:color="B9D7F2" w:sz="4"/>
+              <w:left w:val="single" w:color="B9D7F2" w:sz="4"/>
+              <w:bottom w:val="single" w:color="B9D7F2" w:sz="4"/>
+              <w:right w:val="single" w:color="B9D7F2" w:sz="4"/>
+            </w:tcBorders>
+            <w:shd w:fill="EAF4FD" w:color="auto" w:val="clear"/>
+            <w:tcMar>
+              <w:top w:type="dxa" w:w="70"/>
+              <w:left w:type="dxa" w:w="100"/>
+              <w:bottom w:type="dxa" w:w="70"/>
+              <w:right w:type="dxa" w:w="100"/>
+            </w:tcMar>
+          </w:tcPr>
+          <w:p>
+            <w:pPr>
+              <w:spacing w:after="0" w:before="0"/>
+            </w:pPr>
+            <w:r>
+              <w:rPr>
+                <w:rFonts w:ascii="Arial" w:cs="Arial" w:eastAsia="Arial" w:hAnsi="Arial"/>
+                <w:color w:val="15202B"/>
+                <w:sz w:val="18"/>
+                <w:szCs w:val="18"/>
+              </w:rPr>
+              <w:t xml:space="preserve">☐ Pass</w:t>
+            </w:r>
+          </w:p>
+          <w:p>
+            <w:pPr>
+              <w:spacing w:after="0" w:before="0"/>
+            </w:pPr>
+            <w:r>
+              <w:rPr>
+                <w:rFonts w:ascii="Arial" w:cs="Arial" w:eastAsia="Arial" w:hAnsi="Arial"/>
+                <w:color w:val="15202B"/>
+                <w:sz w:val="18"/>
+                <w:szCs w:val="18"/>
+              </w:rPr>
+              <w:t xml:space="preserve">☐ Fail</w:t>
+            </w:r>
+          </w:p>
+        </w:tc>
+        <w:tc>
+          <w:tcPr>
+            <w:tcW w:type="dxa" w:w="1066"/>
+            <w:tcBorders>
+              <w:top w:val="single" w:color="B9D7F2" w:sz="4"/>
+              <w:left w:val="single" w:color="B9D7F2" w:sz="4"/>
+              <w:bottom w:val="single" w:color="B9D7F2" w:sz="4"/>
+              <w:right w:val="single" w:color="B9D7F2" w:sz="4"/>
+            </w:tcBorders>
+            <w:shd w:fill="EAF4FD" w:color="auto" w:val="clear"/>
+            <w:tcMar>
+              <w:top w:type="dxa" w:w="70"/>
+              <w:left w:type="dxa" w:w="100"/>
+              <w:bottom w:type="dxa" w:w="70"/>
+              <w:right w:type="dxa" w:w="100"/>
+            </w:tcMar>
+          </w:tcPr>
+          <w:p>
+            <w:pPr>
+              <w:spacing w:after="0" w:before="0"/>
+            </w:pPr>
+            <w:r>
+              <w:rPr>
+                <w:rFonts w:ascii="Arial" w:cs="Arial" w:eastAsia="Arial" w:hAnsi="Arial"/>
+                <w:color w:val="15202B"/>
+                <w:sz w:val="19"/>
+                <w:szCs w:val="19"/>
+              </w:rPr>
+              <w:t xml:space="preserve"/>
+            </w:r>
+          </w:p>
+        </w:tc>
+      </w:tr>
+      <w:tr>
+        <w:trPr>
+          <w:cantSplit/>
+        </w:trPr>
+        <w:tc>
+          <w:tcPr>
+            <w:tcW w:type="dxa" w:w="700"/>
+            <w:tcBorders>
+              <w:top w:val="single" w:color="B9D7F2" w:sz="4"/>
+              <w:left w:val="single" w:color="B9D7F2" w:sz="4"/>
+              <w:bottom w:val="single" w:color="B9D7F2" w:sz="4"/>
+              <w:right w:val="single" w:color="B9D7F2" w:sz="4"/>
+            </w:tcBorders>
+            <w:tcMar>
+              <w:top w:type="dxa" w:w="70"/>
+              <w:left w:type="dxa" w:w="100"/>
+              <w:bottom w:type="dxa" w:w="70"/>
+              <w:right w:type="dxa" w:w="100"/>
+            </w:tcMar>
+          </w:tcPr>
+          <w:p>
+            <w:pPr>
+              <w:spacing w:after="0" w:before="0"/>
+            </w:pPr>
+            <w:r>
+              <w:rPr>
+                <w:rFonts w:ascii="Arial" w:cs="Arial" w:eastAsia="Arial" w:hAnsi="Arial"/>
+                <w:color w:val="15202B"/>
+                <w:sz w:val="19"/>
+                <w:szCs w:val="19"/>
+              </w:rPr>
+              <w:t xml:space="preserve">E11</w:t>
+            </w:r>
+          </w:p>
+        </w:tc>
+        <w:tc>
+          <w:tcPr>
+            <w:tcW w:type="dxa" w:w="3900"/>
+            <w:tcBorders>
+              <w:top w:val="single" w:color="B9D7F2" w:sz="4"/>
+              <w:left w:val="single" w:color="B9D7F2" w:sz="4"/>
+              <w:bottom w:val="single" w:color="B9D7F2" w:sz="4"/>
+              <w:right w:val="single" w:color="B9D7F2" w:sz="4"/>
+            </w:tcBorders>
+            <w:tcMar>
+              <w:top w:type="dxa" w:w="70"/>
+              <w:left w:type="dxa" w:w="100"/>
+              <w:bottom w:type="dxa" w:w="70"/>
+              <w:right w:type="dxa" w:w="100"/>
+            </w:tcMar>
+          </w:tcPr>
+          <w:p>
+            <w:pPr>
+              <w:spacing w:after="0" w:before="0"/>
+            </w:pPr>
+            <w:r>
+              <w:rPr>
+                <w:rFonts w:ascii="Arial" w:cs="Arial" w:eastAsia="Arial" w:hAnsi="Arial"/>
+                <w:color w:val="15202B"/>
+                <w:sz w:val="19"/>
+                <w:szCs w:val="19"/>
+              </w:rPr>
+              <w:t xml:space="preserve">Customer: turn off Wi-Fi/data for 10 seconds, then on again. Owner: accept another order meanwhile.</w:t>
+            </w:r>
+          </w:p>
+        </w:tc>
+        <w:tc>
+          <w:tcPr>
+            <w:tcW w:type="dxa" w:w="3900"/>
+            <w:tcBorders>
+              <w:top w:val="single" w:color="B9D7F2" w:sz="4"/>
+              <w:left w:val="single" w:color="B9D7F2" w:sz="4"/>
+              <w:bottom w:val="single" w:color="B9D7F2" w:sz="4"/>
+              <w:right w:val="single" w:color="B9D7F2" w:sz="4"/>
+            </w:tcBorders>
+            <w:tcMar>
+              <w:top w:type="dxa" w:w="70"/>
+              <w:left w:type="dxa" w:w="100"/>
+              <w:bottom w:type="dxa" w:w="70"/>
+              <w:right w:type="dxa" w:w="100"/>
+            </w:tcMar>
+          </w:tcPr>
+          <w:p>
+            <w:pPr>
+              <w:spacing w:after="0" w:before="0"/>
+            </w:pPr>
+            <w:r>
+              <w:rPr>
+                <w:rFonts w:ascii="Arial" w:cs="Arial" w:eastAsia="Arial" w:hAnsi="Arial"/>
+                <w:color w:val="15202B"/>
+                <w:sz w:val="19"/>
+                <w:szCs w:val="19"/>
+              </w:rPr>
+              <w:t xml:space="preserve">The app does not crash; after the internet is back the customer screen catches up by itself (or after pulling down).</w:t>
+            </w:r>
+          </w:p>
+        </w:tc>
+        <w:tc>
+          <w:tcPr>
+            <w:tcW w:type="dxa" w:w="900"/>
+            <w:tcBorders>
+              <w:top w:val="single" w:color="B9D7F2" w:sz="4"/>
+              <w:left w:val="single" w:color="B9D7F2" w:sz="4"/>
+              <w:bottom w:val="single" w:color="B9D7F2" w:sz="4"/>
+              <w:right w:val="single" w:color="B9D7F2" w:sz="4"/>
+            </w:tcBorders>
+            <w:tcMar>
+              <w:top w:type="dxa" w:w="70"/>
+              <w:left w:type="dxa" w:w="100"/>
+              <w:bottom w:type="dxa" w:w="70"/>
+              <w:right w:type="dxa" w:w="100"/>
+            </w:tcMar>
+          </w:tcPr>
+          <w:p>
+            <w:pPr>
+              <w:spacing w:after="0" w:before="0"/>
+            </w:pPr>
+            <w:r>
+              <w:rPr>
+                <w:rFonts w:ascii="Arial" w:cs="Arial" w:eastAsia="Arial" w:hAnsi="Arial"/>
+                <w:color w:val="15202B"/>
+                <w:sz w:val="18"/>
+                <w:szCs w:val="18"/>
+              </w:rPr>
+              <w:t xml:space="preserve">☐ Pass</w:t>
+            </w:r>
+          </w:p>
+          <w:p>
+            <w:pPr>
+              <w:spacing w:after="0" w:before="0"/>
+            </w:pPr>
+            <w:r>
+              <w:rPr>
+                <w:rFonts w:ascii="Arial" w:cs="Arial" w:eastAsia="Arial" w:hAnsi="Arial"/>
+                <w:color w:val="15202B"/>
+                <w:sz w:val="18"/>
+                <w:szCs w:val="18"/>
+              </w:rPr>
+              <w:t xml:space="preserve">☐ Fail</w:t>
+            </w:r>
+          </w:p>
+        </w:tc>
+        <w:tc>
+          <w:tcPr>
+            <w:tcW w:type="dxa" w:w="1066"/>
+            <w:tcBorders>
+              <w:top w:val="single" w:color="B9D7F2" w:sz="4"/>
+              <w:left w:val="single" w:color="B9D7F2" w:sz="4"/>
+              <w:bottom w:val="single" w:color="B9D7F2" w:sz="4"/>
+              <w:right w:val="single" w:color="B9D7F2" w:sz="4"/>
+            </w:tcBorders>
             <w:tcMar>
               <w:top w:type="dxa" w:w="70"/>
               <w:left w:type="dxa" w:w="100"/>

</xml_diff>

<commit_message>
Testing: alert card while the app is open; no phone note in Preferences
Co-Authored-By: Claude Opus 5.5 <noreply@anthropic.com>
Claude-Session: https://claude.ai/code/session_01FGCEzsecdEGjCSsNcfM7Ef
</commit_message>
<xml_diff>
--- a/docs/testing/Mangao-Team-Testing-Guide.docx
+++ b/docs/testing/Mangao-Team-Testing-Guide.docx
@@ -62,7 +62,7 @@
         </w:rPr>
         <w:t xml:space="preserve">1. On your Android phone, open this link in Chrome: </w:t>
       </w:r>
-      <w:hyperlink w:history="1" r:id="rIdtiodowseskwf_vc8r0_a5">
+      <w:hyperlink w:history="1" r:id="rIdwx3zzzqftiqamye8ml5yc">
         <w:r>
           <w:rPr>
             <w:rFonts w:ascii="Arial" w:cs="Arial" w:eastAsia="Arial" w:hAnsi="Arial"/>
@@ -16813,7 +16813,7 @@
                 <w:sz w:val="19"/>
                 <w:szCs w:val="19"/>
               </w:rPr>
-              <w:t xml:space="preserve">Owner: the order appears by itself with a "New order" banner and the bell number goes up. The card shows "Ordered &lt;date&gt;, &lt;time&gt;", "As soon as possible" and "cancels at &lt;time&gt; if not accepted". The bell list shows the date and time of each alert.</w:t>
+              <w:t xml:space="preserve">Owner: the order appears by itself; a white alert card "New order" slides in at the top (tap it to open the order) and the bell number goes up. The card shows "Ordered &lt;date&gt;, &lt;time&gt;", "As soon as possible" and "cancels at &lt;time&gt; if not accepted". The bell list shows the date and time of each alert.</w:t>
             </w:r>
           </w:p>
         </w:tc>

</xml_diff>

<commit_message>
Checklists: live alert card needs app 1.0.24 or newer
Co-Authored-By: Claude Opus 5.5 <noreply@anthropic.com>
Claude-Session: https://claude.ai/code/session_01FGCEzsecdEGjCSsNcfM7Ef
</commit_message>
<xml_diff>
--- a/docs/testing/Mangao-Team-Testing-Guide.docx
+++ b/docs/testing/Mangao-Team-Testing-Guide.docx
@@ -62,7 +62,7 @@
         </w:rPr>
         <w:t xml:space="preserve">1. On your Android phone, open this link in Chrome: </w:t>
       </w:r>
-      <w:hyperlink w:history="1" r:id="rIdwx3zzzqftiqamye8ml5yc">
+      <w:hyperlink w:history="1" r:id="rIdqzlfgv6evoqtalz76iefm">
         <w:r>
           <w:rPr>
             <w:rFonts w:ascii="Arial" w:cs="Arial" w:eastAsia="Arial" w:hAnsi="Arial"/>
@@ -16782,7 +16782,7 @@
                 <w:sz w:val="19"/>
                 <w:szCs w:val="19"/>
               </w:rPr>
-              <w:t xml:space="preserve">Owner: stay on Orders &gt; New. Customer: place a 2-gallon order.</w:t>
+              <w:t xml:space="preserve">Owner (app 1.0.24 or newer, or the web version): stay on Orders &gt; New. Customer: place a 2-gallon order.</w:t>
             </w:r>
           </w:p>
         </w:tc>

</xml_diff>

<commit_message>
Checklists: Oct 21 additions (status follows the map, place search, first saved address, rider Live Map)
Co-Authored-By: Claude Opus 5.5 <noreply@anthropic.com>
Claude-Session: https://claude.ai/code/session_01FGCEzsecdEGjCSsNcfM7Ef
</commit_message>
<xml_diff>
--- a/docs/testing/Mangao-Team-Testing-Guide.docx
+++ b/docs/testing/Mangao-Team-Testing-Guide.docx
@@ -62,7 +62,7 @@
         </w:rPr>
         <w:t xml:space="preserve">1. On your Android phone, open this link in Chrome: </w:t>
       </w:r>
-      <w:hyperlink w:history="1" r:id="rIdqzlfgv6evoqtalz76iefm">
+      <w:hyperlink w:history="1" r:id="rId8phdyxc_ezyl5hshzou6l">
         <w:r>
           <w:rPr>
             <w:rFonts w:ascii="Arial" w:cs="Arial" w:eastAsia="Arial" w:hAnsi="Arial"/>
@@ -1465,7 +1465,7 @@
           <w:sz w:val="20"/>
           <w:szCs w:val="20"/>
         </w:rPr>
-        <w:t xml:space="preserve">5 parts, 84 checks. With 4 testers, each takes one role (Parts A to D). Suggested order: everyone logs in first, do Part E together (it needs all four phones), then continue your own part. With fewer testers, one person can do two roles on two phones, or log out and log in as the other role.</w:t>
+        <w:t xml:space="preserve">5 parts, 86 checks. With 4 testers, each takes one role (Parts A to D). Suggested order: everyone logs in first, do Part E together (it needs all four phones), then continue your own part. With fewer testers, one person can do two roles on two phones, or log out and log in as the other role.</w:t>
       </w:r>
     </w:p>
     <w:tbl>
@@ -1787,7 +1787,7 @@
                 <w:sz w:val="19"/>
                 <w:szCs w:val="19"/>
               </w:rPr>
-              <w:t xml:space="preserve">22</w:t>
+              <w:t xml:space="preserve">23</w:t>
             </w:r>
           </w:p>
         </w:tc>
@@ -2437,7 +2437,7 @@
                 <w:sz w:val="19"/>
                 <w:szCs w:val="19"/>
               </w:rPr>
-              <w:t xml:space="preserve">11</w:t>
+              <w:t xml:space="preserve">12</w:t>
             </w:r>
           </w:p>
         </w:tc>
@@ -4034,7 +4034,7 @@
                 <w:sz w:val="19"/>
                 <w:szCs w:val="19"/>
               </w:rPr>
-              <w:t xml:space="preserve">Tap Place order.</w:t>
+              <w:t xml:space="preserve">Open Pin on map again and type a place such as "SM Fairview" in the search box.</w:t>
             </w:r>
           </w:p>
         </w:tc>
@@ -4066,7 +4066,7 @@
                 <w:sz w:val="19"/>
                 <w:szCs w:val="19"/>
               </w:rPr>
-              <w:t xml:space="preserve">Popup "Confirm order?" with the gallons, address, payment and total.</w:t>
+              <w:t xml:space="preserve">Suggestions show while typing; tapping one moves the map and the pin there.</w:t>
             </w:r>
           </w:p>
         </w:tc>
@@ -4211,7 +4211,7 @@
                 <w:sz w:val="19"/>
                 <w:szCs w:val="19"/>
               </w:rPr>
-              <w:t xml:space="preserve">Tap Confirm.</w:t>
+              <w:t xml:space="preserve">Tap Place order.</w:t>
             </w:r>
           </w:p>
         </w:tc>
@@ -4242,7 +4242,7 @@
                 <w:sz w:val="19"/>
                 <w:szCs w:val="19"/>
               </w:rPr>
-              <w:t xml:space="preserve">"Thank you for your order!" message. OK goes back to Home with a card "Waiting to be accepted". Tell the Owner tester your order is in.</w:t>
+              <w:t xml:space="preserve">Popup "Confirm order?" with the gallons, address, payment and total.</w:t>
             </w:r>
           </w:p>
         </w:tc>
@@ -4387,7 +4387,7 @@
                 <w:sz w:val="19"/>
                 <w:szCs w:val="19"/>
               </w:rPr>
-              <w:t xml:space="preserve">Wait on Home while the Owner accepts your order. Do not touch the screen.</w:t>
+              <w:t xml:space="preserve">Tap Confirm.</w:t>
             </w:r>
           </w:p>
         </w:tc>
@@ -4419,7 +4419,7 @@
                 <w:sz w:val="19"/>
                 <w:szCs w:val="19"/>
               </w:rPr>
-              <w:t xml:space="preserve">Within a few seconds the card changes to "Processing" with "Estimated delivery: by &lt;time&gt;", and a banner "Order accepted" shows.</w:t>
+              <w:t xml:space="preserve">"Thank you for your order!" message. OK goes back to Home with a card "Waiting to be accepted". Tell the Owner tester your order is in.</w:t>
             </w:r>
           </w:p>
         </w:tc>
@@ -4564,7 +4564,7 @@
                 <w:sz w:val="19"/>
                 <w:szCs w:val="19"/>
               </w:rPr>
-              <w:t xml:space="preserve">Tap the card.</w:t>
+              <w:t xml:space="preserve">Wait on Home while the Owner accepts your order. Do not touch the screen.</w:t>
             </w:r>
           </w:p>
         </w:tc>
@@ -4595,7 +4595,7 @@
                 <w:sz w:val="19"/>
                 <w:szCs w:val="19"/>
               </w:rPr>
-              <w:t xml:space="preserve">Order Details with 5 steps (Order accepted checked, Processing current) and a "Call station" button.</w:t>
+              <w:t xml:space="preserve">Within a few seconds the card changes to "Processing" with "Estimated delivery: by &lt;time&gt;", and a banner "Order accepted" shows.</w:t>
             </w:r>
           </w:p>
         </w:tc>
@@ -4740,7 +4740,7 @@
                 <w:sz w:val="19"/>
                 <w:szCs w:val="19"/>
               </w:rPr>
-              <w:t xml:space="preserve">Tap Call station.</w:t>
+              <w:t xml:space="preserve">Tap the card.</w:t>
             </w:r>
           </w:p>
         </w:tc>
@@ -4772,7 +4772,7 @@
                 <w:sz w:val="19"/>
                 <w:szCs w:val="19"/>
               </w:rPr>
-              <w:t xml:space="preserve">The phone dialer opens with the station number.</w:t>
+              <w:t xml:space="preserve">Order Details with 7 steps (Order accepted checked, Processing current) and a "Call station" button.</w:t>
             </w:r>
           </w:p>
         </w:tc>
@@ -4917,7 +4917,7 @@
                 <w:sz w:val="19"/>
                 <w:szCs w:val="19"/>
               </w:rPr>
-              <w:t xml:space="preserve">Place a second order (1 gallon). Open it from Home and tap Cancel order &gt; Confirm.</w:t>
+              <w:t xml:space="preserve">Tap Call station.</w:t>
             </w:r>
           </w:p>
         </w:tc>
@@ -4948,7 +4948,7 @@
                 <w:sz w:val="19"/>
                 <w:szCs w:val="19"/>
               </w:rPr>
-              <w:t xml:space="preserve">"Order cancelled; owner notified"; the order shows a Cancelled tag.</w:t>
+              <w:t xml:space="preserve">The phone dialer opens with the station number.</w:t>
             </w:r>
           </w:p>
         </w:tc>
@@ -5093,7 +5093,7 @@
                 <w:sz w:val="19"/>
                 <w:szCs w:val="19"/>
               </w:rPr>
-              <w:t xml:space="preserve">Open the My Orders tab.</w:t>
+              <w:t xml:space="preserve">Place a second order (1 gallon). Open it from Home and tap Cancel order &gt; Confirm.</w:t>
             </w:r>
           </w:p>
         </w:tc>
@@ -5125,7 +5125,7 @@
                 <w:sz w:val="19"/>
                 <w:szCs w:val="19"/>
               </w:rPr>
-              <w:t xml:space="preserve">Active orders on top; History has the cancelled order with a Reorder button.</w:t>
+              <w:t xml:space="preserve">"Order cancelled; owner notified"; the order shows a Cancelled tag.</w:t>
             </w:r>
           </w:p>
         </w:tc>
@@ -5270,7 +5270,7 @@
                 <w:sz w:val="19"/>
                 <w:szCs w:val="19"/>
               </w:rPr>
-              <w:t xml:space="preserve">Tap Reorder on the cancelled order.</w:t>
+              <w:t xml:space="preserve">Open the My Orders tab.</w:t>
             </w:r>
           </w:p>
         </w:tc>
@@ -5301,7 +5301,7 @@
                 <w:sz w:val="19"/>
                 <w:szCs w:val="19"/>
               </w:rPr>
-              <w:t xml:space="preserve">Order Form filled in with the same gallons and address. Tap Cancel &gt; Confirm to leave it.</w:t>
+              <w:t xml:space="preserve">Active orders on top; History has the cancelled order with a Reorder button.</w:t>
             </w:r>
           </w:p>
         </w:tc>
@@ -5446,7 +5446,7 @@
                 <w:sz w:val="19"/>
                 <w:szCs w:val="19"/>
               </w:rPr>
-              <w:t xml:space="preserve">My Account &gt; Saved Addresses &gt; Add address. Name "Work", Type address: house 5, street "Mabuhay St.", Barangay "Commonwealth" &gt; Save.</w:t>
+              <w:t xml:space="preserve">Tap Reorder on the cancelled order.</w:t>
             </w:r>
           </w:p>
         </w:tc>
@@ -5478,7 +5478,7 @@
                 <w:sz w:val="19"/>
                 <w:szCs w:val="19"/>
               </w:rPr>
-              <w:t xml:space="preserve">"Address saved"; Work is in the list. Next time you order, Work shows as a quick choice.</w:t>
+              <w:t xml:space="preserve">Order Form filled in with the same gallons and address. Tap Cancel &gt; Confirm to leave it.</w:t>
             </w:r>
           </w:p>
         </w:tc>
@@ -5623,7 +5623,7 @@
                 <w:sz w:val="19"/>
                 <w:szCs w:val="19"/>
               </w:rPr>
-              <w:t xml:space="preserve">When the Rider marks your first order Delivered (Part E or ask the Rider tester).</w:t>
+              <w:t xml:space="preserve">My Account &gt; Saved Addresses &gt; Add address. Name "Work", Type address: house 5, street "Mabuhay St.", Barangay "Commonwealth" &gt; Save.</w:t>
             </w:r>
           </w:p>
         </w:tc>
@@ -5654,7 +5654,7 @@
                 <w:sz w:val="19"/>
                 <w:szCs w:val="19"/>
               </w:rPr>
-              <w:t xml:space="preserve">The order changes to Delivered by itself with a banner "Delivered · Thank you! Enjoy your fresh water."</w:t>
+              <w:t xml:space="preserve">"Address saved"; Work is in the list. Next time you order, Work shows as a quick choice.</w:t>
             </w:r>
           </w:p>
         </w:tc>
@@ -5799,7 +5799,7 @@
                 <w:sz w:val="19"/>
                 <w:szCs w:val="19"/>
               </w:rPr>
-              <w:t xml:space="preserve">My Account &gt; Log out &gt; Confirm.</w:t>
+              <w:t xml:space="preserve">When the Rider marks your first order Delivered (Part E or ask the Rider tester).</w:t>
             </w:r>
           </w:p>
         </w:tc>
@@ -5831,7 +5831,7 @@
                 <w:sz w:val="19"/>
                 <w:szCs w:val="19"/>
               </w:rPr>
-              <w:t xml:space="preserve">Back to the Welcome screen.</w:t>
+              <w:t xml:space="preserve">The order changes to Delivered by itself with a banner "Delivered · Thank you! Enjoy your fresh water."</w:t>
             </w:r>
           </w:p>
         </w:tc>
@@ -5976,7 +5976,7 @@
                 <w:sz w:val="19"/>
                 <w:szCs w:val="19"/>
               </w:rPr>
-              <w:t xml:space="preserve">Tap "Continue as guest" &gt; Order Now. Leave Name empty and tap Place order.</w:t>
+              <w:t xml:space="preserve">My Account &gt; Log out &gt; Confirm.</w:t>
             </w:r>
           </w:p>
         </w:tc>
@@ -6007,7 +6007,7 @@
                 <w:sz w:val="19"/>
                 <w:szCs w:val="19"/>
               </w:rPr>
-              <w:t xml:space="preserve">Red box "Name missing".</w:t>
+              <w:t xml:space="preserve">Back to the Welcome screen.</w:t>
             </w:r>
           </w:p>
         </w:tc>
@@ -6152,7 +6152,7 @@
                 <w:sz w:val="19"/>
                 <w:szCs w:val="19"/>
               </w:rPr>
-              <w:t xml:space="preserve">Fill Name, phone 09185551212, type an address, place the order.</w:t>
+              <w:t xml:space="preserve">Tap "Continue as guest" &gt; Order Now. Leave Name empty and tap Place order.</w:t>
             </w:r>
           </w:p>
         </w:tc>
@@ -6184,7 +6184,7 @@
                 <w:sz w:val="19"/>
                 <w:szCs w:val="19"/>
               </w:rPr>
-              <w:t xml:space="preserve">Thank-you message; the order shows on Home with "This phone only; lost if the app is deleted".</w:t>
+              <w:t xml:space="preserve">Red box "Name missing".</w:t>
             </w:r>
           </w:p>
         </w:tc>
@@ -6329,7 +6329,7 @@
                 <w:sz w:val="19"/>
                 <w:szCs w:val="19"/>
               </w:rPr>
-              <w:t xml:space="preserve">My Account &gt; Create account. Use YOUR OWN name, your own phone number, an email and a password (6+ letters), tick the Terms box &gt; Create account.</w:t>
+              <w:t xml:space="preserve">Fill Name, phone 09185551212, type an address, place the order.</w:t>
             </w:r>
           </w:p>
         </w:tc>
@@ -6360,7 +6360,7 @@
                 <w:sz w:val="19"/>
                 <w:szCs w:val="19"/>
               </w:rPr>
-              <w:t xml:space="preserve">"Account created" and "The orders on this phone are now in your account." My Orders shows the guest order.</w:t>
+              <w:t xml:space="preserve">Thank-you message; the order shows on Home with "This phone only; lost if the app is deleted".</w:t>
             </w:r>
           </w:p>
         </w:tc>
@@ -6505,7 +6505,7 @@
                 <w:sz w:val="19"/>
                 <w:szCs w:val="19"/>
               </w:rPr>
-              <w:t xml:space="preserve">Log out. Tap Sign up and try the same phone number again.</w:t>
+              <w:t xml:space="preserve">My Account &gt; Create account. Use YOUR OWN name, your own phone number, an email and a password (6+ letters), tick the Terms box &gt; Create account.</w:t>
             </w:r>
           </w:p>
         </w:tc>
@@ -6537,7 +6537,7 @@
                 <w:sz w:val="19"/>
                 <w:szCs w:val="19"/>
               </w:rPr>
-              <w:t xml:space="preserve">Red box "Phone number already used"; the phone box has a red border.</w:t>
+              <w:t xml:space="preserve">"Account created" and "The orders on this phone are now in your account." My Orders shows the guest order.</w:t>
             </w:r>
           </w:p>
         </w:tc>
@@ -6597,6 +6597,180 @@
               <w:right w:val="single" w:color="B9D7F2" w:sz="4"/>
             </w:tcBorders>
             <w:shd w:fill="EAF4FD" w:color="auto" w:val="clear"/>
+            <w:tcMar>
+              <w:top w:type="dxa" w:w="70"/>
+              <w:left w:type="dxa" w:w="100"/>
+              <w:bottom w:type="dxa" w:w="70"/>
+              <w:right w:type="dxa" w:w="100"/>
+            </w:tcMar>
+          </w:tcPr>
+          <w:p>
+            <w:pPr>
+              <w:spacing w:after="0" w:before="0"/>
+            </w:pPr>
+            <w:r>
+              <w:rPr>
+                <w:rFonts w:ascii="Arial" w:cs="Arial" w:eastAsia="Arial" w:hAnsi="Arial"/>
+                <w:color w:val="15202B"/>
+                <w:sz w:val="19"/>
+                <w:szCs w:val="19"/>
+              </w:rPr>
+              <w:t xml:space="preserve"/>
+            </w:r>
+          </w:p>
+        </w:tc>
+      </w:tr>
+      <w:tr>
+        <w:trPr>
+          <w:cantSplit/>
+        </w:trPr>
+        <w:tc>
+          <w:tcPr>
+            <w:tcW w:type="dxa" w:w="700"/>
+            <w:tcBorders>
+              <w:top w:val="single" w:color="B9D7F2" w:sz="4"/>
+              <w:left w:val="single" w:color="B9D7F2" w:sz="4"/>
+              <w:bottom w:val="single" w:color="B9D7F2" w:sz="4"/>
+              <w:right w:val="single" w:color="B9D7F2" w:sz="4"/>
+            </w:tcBorders>
+            <w:tcMar>
+              <w:top w:type="dxa" w:w="70"/>
+              <w:left w:type="dxa" w:w="100"/>
+              <w:bottom w:type="dxa" w:w="70"/>
+              <w:right w:type="dxa" w:w="100"/>
+            </w:tcMar>
+          </w:tcPr>
+          <w:p>
+            <w:pPr>
+              <w:spacing w:after="0" w:before="0"/>
+            </w:pPr>
+            <w:r>
+              <w:rPr>
+                <w:rFonts w:ascii="Arial" w:cs="Arial" w:eastAsia="Arial" w:hAnsi="Arial"/>
+                <w:color w:val="15202B"/>
+                <w:sz w:val="19"/>
+                <w:szCs w:val="19"/>
+              </w:rPr>
+              <w:t xml:space="preserve">A23</w:t>
+            </w:r>
+          </w:p>
+        </w:tc>
+        <w:tc>
+          <w:tcPr>
+            <w:tcW w:type="dxa" w:w="3900"/>
+            <w:tcBorders>
+              <w:top w:val="single" w:color="B9D7F2" w:sz="4"/>
+              <w:left w:val="single" w:color="B9D7F2" w:sz="4"/>
+              <w:bottom w:val="single" w:color="B9D7F2" w:sz="4"/>
+              <w:right w:val="single" w:color="B9D7F2" w:sz="4"/>
+            </w:tcBorders>
+            <w:tcMar>
+              <w:top w:type="dxa" w:w="70"/>
+              <w:left w:type="dxa" w:w="100"/>
+              <w:bottom w:type="dxa" w:w="70"/>
+              <w:right w:type="dxa" w:w="100"/>
+            </w:tcMar>
+          </w:tcPr>
+          <w:p>
+            <w:pPr>
+              <w:spacing w:after="0" w:before="0"/>
+            </w:pPr>
+            <w:r>
+              <w:rPr>
+                <w:rFonts w:ascii="Arial" w:cs="Arial" w:eastAsia="Arial" w:hAnsi="Arial"/>
+                <w:color w:val="15202B"/>
+                <w:sz w:val="19"/>
+                <w:szCs w:val="19"/>
+              </w:rPr>
+              <w:t xml:space="preserve">Log out. Tap Sign up and try the same phone number again.</w:t>
+            </w:r>
+          </w:p>
+        </w:tc>
+        <w:tc>
+          <w:tcPr>
+            <w:tcW w:type="dxa" w:w="3900"/>
+            <w:tcBorders>
+              <w:top w:val="single" w:color="B9D7F2" w:sz="4"/>
+              <w:left w:val="single" w:color="B9D7F2" w:sz="4"/>
+              <w:bottom w:val="single" w:color="B9D7F2" w:sz="4"/>
+              <w:right w:val="single" w:color="B9D7F2" w:sz="4"/>
+            </w:tcBorders>
+            <w:tcMar>
+              <w:top w:type="dxa" w:w="70"/>
+              <w:left w:type="dxa" w:w="100"/>
+              <w:bottom w:type="dxa" w:w="70"/>
+              <w:right w:type="dxa" w:w="100"/>
+            </w:tcMar>
+          </w:tcPr>
+          <w:p>
+            <w:pPr>
+              <w:spacing w:after="0" w:before="0"/>
+            </w:pPr>
+            <w:r>
+              <w:rPr>
+                <w:rFonts w:ascii="Arial" w:cs="Arial" w:eastAsia="Arial" w:hAnsi="Arial"/>
+                <w:color w:val="15202B"/>
+                <w:sz w:val="19"/>
+                <w:szCs w:val="19"/>
+              </w:rPr>
+              <w:t xml:space="preserve">Red box "Phone number already used"; the phone box has a red border.</w:t>
+            </w:r>
+          </w:p>
+        </w:tc>
+        <w:tc>
+          <w:tcPr>
+            <w:tcW w:type="dxa" w:w="900"/>
+            <w:tcBorders>
+              <w:top w:val="single" w:color="B9D7F2" w:sz="4"/>
+              <w:left w:val="single" w:color="B9D7F2" w:sz="4"/>
+              <w:bottom w:val="single" w:color="B9D7F2" w:sz="4"/>
+              <w:right w:val="single" w:color="B9D7F2" w:sz="4"/>
+            </w:tcBorders>
+            <w:tcMar>
+              <w:top w:type="dxa" w:w="70"/>
+              <w:left w:type="dxa" w:w="100"/>
+              <w:bottom w:type="dxa" w:w="70"/>
+              <w:right w:type="dxa" w:w="100"/>
+            </w:tcMar>
+          </w:tcPr>
+          <w:p>
+            <w:pPr>
+              <w:spacing w:after="0" w:before="0"/>
+            </w:pPr>
+            <w:r>
+              <w:rPr>
+                <w:rFonts w:ascii="Arial" w:cs="Arial" w:eastAsia="Arial" w:hAnsi="Arial"/>
+                <w:color w:val="15202B"/>
+                <w:sz w:val="18"/>
+                <w:szCs w:val="18"/>
+              </w:rPr>
+              <w:t xml:space="preserve">☐ Pass</w:t>
+            </w:r>
+          </w:p>
+          <w:p>
+            <w:pPr>
+              <w:spacing w:after="0" w:before="0"/>
+            </w:pPr>
+            <w:r>
+              <w:rPr>
+                <w:rFonts w:ascii="Arial" w:cs="Arial" w:eastAsia="Arial" w:hAnsi="Arial"/>
+                <w:color w:val="15202B"/>
+                <w:sz w:val="18"/>
+                <w:szCs w:val="18"/>
+              </w:rPr>
+              <w:t xml:space="preserve">☐ Fail</w:t>
+            </w:r>
+          </w:p>
+        </w:tc>
+        <w:tc>
+          <w:tcPr>
+            <w:tcW w:type="dxa" w:w="1066"/>
+            <w:tcBorders>
+              <w:top w:val="single" w:color="B9D7F2" w:sz="4"/>
+              <w:left w:val="single" w:color="B9D7F2" w:sz="4"/>
+              <w:bottom w:val="single" w:color="B9D7F2" w:sz="4"/>
+              <w:right w:val="single" w:color="B9D7F2" w:sz="4"/>
+            </w:tcBorders>
             <w:tcMar>
               <w:top w:type="dxa" w:w="70"/>
               <w:left w:type="dxa" w:w="100"/>
@@ -17872,7 +18046,7 @@
                 <w:sz w:val="19"/>
                 <w:szCs w:val="19"/>
               </w:rPr>
-              <w:t xml:space="preserve">Customer: "Arriving - please prepare ₱70.00" above the map and an alert "Your water is arriving". Owner map label: "Arriving at 1".</w:t>
+              <w:t xml:space="preserve">Customer: "Arriving - please prepare ₱70.00" above the map, an alert "Your water is arriving", and the status step changes by itself from Out for Delivery to Arriving. Owner: tag "Arriving", map label "Arriving at 1". Rider: tag "Arriving" on the card.</w:t>
             </w:r>
           </w:p>
         </w:tc>
@@ -18017,7 +18191,7 @@
                 <w:sz w:val="19"/>
                 <w:szCs w:val="19"/>
               </w:rPr>
-              <w:t xml:space="preserve">Rider reaches the customer (within about 50 m).</w:t>
+              <w:t xml:space="preserve">Rider reaches the customer (within about 50 m, or where the road ends near the pin).</w:t>
             </w:r>
           </w:p>
         </w:tc>
@@ -18049,7 +18223,7 @@
                 <w:sz w:val="19"/>
                 <w:szCs w:val="19"/>
               </w:rPr>
-              <w:t xml:space="preserve">Customer: "Your rider has arrived. Please prepare ₱70.00" and an alert "Your rider has arrived". Owner map label: "Arrived at 1".</w:t>
+              <w:t xml:space="preserve">Customer: "Your rider has arrived. Please prepare ₱70.00", an alert "Your rider has arrived", and the step "Rider has arrived". Owner: tag "Arrived", map label "Arrived at 1". It does not stay on Arriving.</w:t>
             </w:r>
           </w:p>
         </w:tc>
@@ -18194,7 +18368,7 @@
                 <w:sz w:val="19"/>
                 <w:szCs w:val="19"/>
               </w:rPr>
-              <w:t xml:space="preserve">Rider: Delivered &gt; Paid.</w:t>
+              <w:t xml:space="preserve">Rider: open the Live Map tab.</w:t>
             </w:r>
           </w:p>
         </w:tc>
@@ -18225,7 +18399,7 @@
                 <w:sz w:val="19"/>
                 <w:szCs w:val="19"/>
               </w:rPr>
-              <w:t xml:space="preserve">Customer: "Delivered" with a banner; the map is gone. Owner: Live Map shows "No deliveries running"; Home Delivered tile and Sales go up; Sales &gt; Daily lists the order.</w:t>
+              <w:t xml:space="preserve">The rider sees their own trip: station, numbered stops, sidecar and route.</w:t>
             </w:r>
           </w:p>
         </w:tc>
@@ -18370,7 +18544,7 @@
                 <w:sz w:val="19"/>
                 <w:szCs w:val="19"/>
               </w:rPr>
-              <w:t xml:space="preserve">Two orders out together: Rider delivers the first one.</w:t>
+              <w:t xml:space="preserve">Rider: Delivered &gt; Paid.</w:t>
             </w:r>
           </w:p>
         </w:tc>
@@ -18402,7 +18576,7 @@
                 <w:sz w:val="19"/>
                 <w:szCs w:val="19"/>
               </w:rPr>
-              <w:t xml:space="preserve">The sidecar stays on the map and goes on to the second house; that customer gets "arriving" and "has arrived" the same way. After the last one: "No deliveries running".</w:t>
+              <w:t xml:space="preserve">Customer: "Delivered" with a banner; the map is gone. Owner: Live Map shows "No deliveries running"; Home Delivered tile and Sales go up; Sales &gt; Daily lists the order.</w:t>
             </w:r>
           </w:p>
         </w:tc>
@@ -18547,7 +18721,7 @@
                 <w:sz w:val="19"/>
                 <w:szCs w:val="19"/>
               </w:rPr>
-              <w:t xml:space="preserve">Customer: turn off Wi-Fi/data for 10 seconds, then on again. Owner: accept another order meanwhile.</w:t>
+              <w:t xml:space="preserve">Two orders out together: Rider delivers the first one.</w:t>
             </w:r>
           </w:p>
         </w:tc>
@@ -18578,7 +18752,7 @@
                 <w:sz w:val="19"/>
                 <w:szCs w:val="19"/>
               </w:rPr>
-              <w:t xml:space="preserve">The app does not crash; after the internet is back the customer screen catches up by itself (or after pulling down).</w:t>
+              <w:t xml:space="preserve">The sidecar stays on the map and goes on to the second house; that customer gets "arriving" and "has arrived" the same way. After the last one: "No deliveries running".</w:t>
             </w:r>
           </w:p>
         </w:tc>
@@ -18636,6 +18810,185 @@
               <w:bottom w:val="single" w:color="B9D7F2" w:sz="4"/>
               <w:right w:val="single" w:color="B9D7F2" w:sz="4"/>
             </w:tcBorders>
+            <w:tcMar>
+              <w:top w:type="dxa" w:w="70"/>
+              <w:left w:type="dxa" w:w="100"/>
+              <w:bottom w:type="dxa" w:w="70"/>
+              <w:right w:type="dxa" w:w="100"/>
+            </w:tcMar>
+          </w:tcPr>
+          <w:p>
+            <w:pPr>
+              <w:spacing w:after="0" w:before="0"/>
+            </w:pPr>
+            <w:r>
+              <w:rPr>
+                <w:rFonts w:ascii="Arial" w:cs="Arial" w:eastAsia="Arial" w:hAnsi="Arial"/>
+                <w:color w:val="15202B"/>
+                <w:sz w:val="19"/>
+                <w:szCs w:val="19"/>
+              </w:rPr>
+              <w:t xml:space="preserve"/>
+            </w:r>
+          </w:p>
+        </w:tc>
+      </w:tr>
+      <w:tr>
+        <w:trPr>
+          <w:cantSplit/>
+        </w:trPr>
+        <w:tc>
+          <w:tcPr>
+            <w:tcW w:type="dxa" w:w="700"/>
+            <w:tcBorders>
+              <w:top w:val="single" w:color="B9D7F2" w:sz="4"/>
+              <w:left w:val="single" w:color="B9D7F2" w:sz="4"/>
+              <w:bottom w:val="single" w:color="B9D7F2" w:sz="4"/>
+              <w:right w:val="single" w:color="B9D7F2" w:sz="4"/>
+            </w:tcBorders>
+            <w:shd w:fill="EAF4FD" w:color="auto" w:val="clear"/>
+            <w:tcMar>
+              <w:top w:type="dxa" w:w="70"/>
+              <w:left w:type="dxa" w:w="100"/>
+              <w:bottom w:type="dxa" w:w="70"/>
+              <w:right w:type="dxa" w:w="100"/>
+            </w:tcMar>
+          </w:tcPr>
+          <w:p>
+            <w:pPr>
+              <w:spacing w:after="0" w:before="0"/>
+            </w:pPr>
+            <w:r>
+              <w:rPr>
+                <w:rFonts w:ascii="Arial" w:cs="Arial" w:eastAsia="Arial" w:hAnsi="Arial"/>
+                <w:color w:val="15202B"/>
+                <w:sz w:val="19"/>
+                <w:szCs w:val="19"/>
+              </w:rPr>
+              <w:t xml:space="preserve">E12</w:t>
+            </w:r>
+          </w:p>
+        </w:tc>
+        <w:tc>
+          <w:tcPr>
+            <w:tcW w:type="dxa" w:w="3900"/>
+            <w:tcBorders>
+              <w:top w:val="single" w:color="B9D7F2" w:sz="4"/>
+              <w:left w:val="single" w:color="B9D7F2" w:sz="4"/>
+              <w:bottom w:val="single" w:color="B9D7F2" w:sz="4"/>
+              <w:right w:val="single" w:color="B9D7F2" w:sz="4"/>
+            </w:tcBorders>
+            <w:shd w:fill="EAF4FD" w:color="auto" w:val="clear"/>
+            <w:tcMar>
+              <w:top w:type="dxa" w:w="70"/>
+              <w:left w:type="dxa" w:w="100"/>
+              <w:bottom w:type="dxa" w:w="70"/>
+              <w:right w:type="dxa" w:w="100"/>
+            </w:tcMar>
+          </w:tcPr>
+          <w:p>
+            <w:pPr>
+              <w:spacing w:after="0" w:before="0"/>
+            </w:pPr>
+            <w:r>
+              <w:rPr>
+                <w:rFonts w:ascii="Arial" w:cs="Arial" w:eastAsia="Arial" w:hAnsi="Arial"/>
+                <w:color w:val="15202B"/>
+                <w:sz w:val="19"/>
+                <w:szCs w:val="19"/>
+              </w:rPr>
+              <w:t xml:space="preserve">Customer: turn off Wi-Fi/data for 10 seconds, then on again. Owner: accept another order meanwhile.</w:t>
+            </w:r>
+          </w:p>
+        </w:tc>
+        <w:tc>
+          <w:tcPr>
+            <w:tcW w:type="dxa" w:w="3900"/>
+            <w:tcBorders>
+              <w:top w:val="single" w:color="B9D7F2" w:sz="4"/>
+              <w:left w:val="single" w:color="B9D7F2" w:sz="4"/>
+              <w:bottom w:val="single" w:color="B9D7F2" w:sz="4"/>
+              <w:right w:val="single" w:color="B9D7F2" w:sz="4"/>
+            </w:tcBorders>
+            <w:shd w:fill="EAF4FD" w:color="auto" w:val="clear"/>
+            <w:tcMar>
+              <w:top w:type="dxa" w:w="70"/>
+              <w:left w:type="dxa" w:w="100"/>
+              <w:bottom w:type="dxa" w:w="70"/>
+              <w:right w:type="dxa" w:w="100"/>
+            </w:tcMar>
+          </w:tcPr>
+          <w:p>
+            <w:pPr>
+              <w:spacing w:after="0" w:before="0"/>
+            </w:pPr>
+            <w:r>
+              <w:rPr>
+                <w:rFonts w:ascii="Arial" w:cs="Arial" w:eastAsia="Arial" w:hAnsi="Arial"/>
+                <w:color w:val="15202B"/>
+                <w:sz w:val="19"/>
+                <w:szCs w:val="19"/>
+              </w:rPr>
+              <w:t xml:space="preserve">The app does not crash; after the internet is back the customer screen catches up by itself (or after pulling down).</w:t>
+            </w:r>
+          </w:p>
+        </w:tc>
+        <w:tc>
+          <w:tcPr>
+            <w:tcW w:type="dxa" w:w="900"/>
+            <w:tcBorders>
+              <w:top w:val="single" w:color="B9D7F2" w:sz="4"/>
+              <w:left w:val="single" w:color="B9D7F2" w:sz="4"/>
+              <w:bottom w:val="single" w:color="B9D7F2" w:sz="4"/>
+              <w:right w:val="single" w:color="B9D7F2" w:sz="4"/>
+            </w:tcBorders>
+            <w:shd w:fill="EAF4FD" w:color="auto" w:val="clear"/>
+            <w:tcMar>
+              <w:top w:type="dxa" w:w="70"/>
+              <w:left w:type="dxa" w:w="100"/>
+              <w:bottom w:type="dxa" w:w="70"/>
+              <w:right w:type="dxa" w:w="100"/>
+            </w:tcMar>
+          </w:tcPr>
+          <w:p>
+            <w:pPr>
+              <w:spacing w:after="0" w:before="0"/>
+            </w:pPr>
+            <w:r>
+              <w:rPr>
+                <w:rFonts w:ascii="Arial" w:cs="Arial" w:eastAsia="Arial" w:hAnsi="Arial"/>
+                <w:color w:val="15202B"/>
+                <w:sz w:val="18"/>
+                <w:szCs w:val="18"/>
+              </w:rPr>
+              <w:t xml:space="preserve">☐ Pass</w:t>
+            </w:r>
+          </w:p>
+          <w:p>
+            <w:pPr>
+              <w:spacing w:after="0" w:before="0"/>
+            </w:pPr>
+            <w:r>
+              <w:rPr>
+                <w:rFonts w:ascii="Arial" w:cs="Arial" w:eastAsia="Arial" w:hAnsi="Arial"/>
+                <w:color w:val="15202B"/>
+                <w:sz w:val="18"/>
+                <w:szCs w:val="18"/>
+              </w:rPr>
+              <w:t xml:space="preserve">☐ Fail</w:t>
+            </w:r>
+          </w:p>
+        </w:tc>
+        <w:tc>
+          <w:tcPr>
+            <w:tcW w:type="dxa" w:w="1066"/>
+            <w:tcBorders>
+              <w:top w:val="single" w:color="B9D7F2" w:sz="4"/>
+              <w:left w:val="single" w:color="B9D7F2" w:sz="4"/>
+              <w:bottom w:val="single" w:color="B9D7F2" w:sz="4"/>
+              <w:right w:val="single" w:color="B9D7F2" w:sz="4"/>
+            </w:tcBorders>
+            <w:shd w:fill="EAF4FD" w:color="auto" w:val="clear"/>
             <w:tcMar>
               <w:top w:type="dxa" w:w="70"/>
               <w:left w:type="dxa" w:w="100"/>

</xml_diff>

<commit_message>
Checklists: live map summary and No deliveries running
Co-Authored-By: Claude Opus 5.5 <noreply@anthropic.com>
Claude-Session: https://claude.ai/code/session_01FGCEzsecdEGjCSsNcfM7Ef
</commit_message>
<xml_diff>
--- a/docs/testing/Mangao-Team-Testing-Guide.docx
+++ b/docs/testing/Mangao-Team-Testing-Guide.docx
@@ -62,7 +62,7 @@
         </w:rPr>
         <w:t xml:space="preserve">1. On your Android phone, open this link in Chrome: </w:t>
       </w:r>
-      <w:hyperlink w:history="1" r:id="rId8phdyxc_ezyl5hshzou6l">
+      <w:hyperlink w:history="1" r:id="rIdlyg4nei-buvj4ry9hpmvf">
         <w:r>
           <w:rPr>
             <w:rFonts w:ascii="Arial" w:cs="Arial" w:eastAsia="Arial" w:hAnsi="Arial"/>
@@ -18576,7 +18576,7 @@
                 <w:sz w:val="19"/>
                 <w:szCs w:val="19"/>
               </w:rPr>
-              <w:t xml:space="preserve">Customer: "Delivered" with a banner; the map is gone. Owner: Live Map shows "No deliveries running"; Home Delivered tile and Sales go up; Sales &gt; Daily lists the order.</w:t>
+              <w:t xml:space="preserve">Customer: "Delivered" with a banner; the map is gone. Owner: Live Map shows "No deliveries running" (while orders are out, the top of the map says "1 delivery running" with the time it went out); Home Delivered tile and Sales go up; Sales &gt; Daily lists the order.</w:t>
             </w:r>
           </w:p>
         </w:tc>

</xml_diff>